<commit_message>
REDCap: kruistabel per eCRF-nummer, en orthopedisch schoeisel in de bronnen
De gids verantwoordt nu elk van de 53 eCRF-nummers uit het register in par. 12:
33 worden een instrument, 20 komen er bewust niet in, elk met reden. Zo is
later na te gaan of een ontbrekend formulier een keuze was of een vergetelheid.

Twee nuanceringen toegevoegd. Par. 9 zet eCRF 32 bij visites 3 tot 8 zonder
armonderscheid, wat tegen de keuze pleit om het bij Optimal Care alleen te
zetten; dat staat nu bij de te bevestigen punten. En het schoeiseltype moet als
veld bestaan voor eCRF 10 en 23 gebouwd worden, omdat het de opbouw van de zool
bepaalt.

In PARADISE_BRONNEN.md par. 5: bestaand orthopedisch schoeisel is toegelaten
zolang de nieuwe CMFO erin past, met het beslispunt wanneer ze dat niet doet.
Bronvermelding nog toe te voegen.

Co-Authored-By: Claude Opus 5 <noreply@anthropic.com>
</commit_message>
<xml_diff>
--- a/REDCap/PARADISE_REDCap_opzet.docx
+++ b/REDCap/PARADISE_REDCap_opzet.docx
@@ -4968,6 +4968,52 @@
     </w:p>
     <w:p>
       <w:pPr>
+        <w:keepNext/>
+        <w:spacing w:before="160" w:after="40"/>
+      </w:pPr>
+      <w:r>
+        <w:rPr>
+          <w:rFonts w:ascii="Segoe UI" w:hAnsi="Segoe UI" w:eastAsia="Segoe UI"/>
+          <w:b/>
+          <w:i w:val="0"/>
+          <w:color w:val="00407A"/>
+          <w:sz w:val="19"/>
+        </w:rPr>
+        <w:t>Schoeiseltype stuurt de opbouw van de zool</w:t>
+      </w:r>
+    </w:p>
+    <w:p>
+      <w:pPr>
+        <w:spacing w:before="0" w:after="80"/>
+      </w:pPr>
+      <w:r>
+        <w:rPr>
+          <w:rFonts w:ascii="Segoe UI" w:hAnsi="Segoe UI" w:eastAsia="Segoe UI"/>
+          <w:b w:val="0"/>
+          <w:i w:val="0"/>
+          <w:color w:val="1B2630"/>
+          <w:sz w:val="19"/>
+        </w:rPr>
+        <w:t>Bestaand orthopedisch schoeisel is toegelaten zolang de nieuwe CMFO erin past. Dat maakt het schoeiseltype een veld dat vóór e10 en e23 moet bestaan, want het bepaalt de opbouw: microkurk plus EVA in maatschoeisel, alleen EVA in een confectieschoen. Drie velden minstens: het type schoeisel, of het bestaand of nieuw is, en of de nieuwe zool erin past. Dat laatste is een beslispunt — past ze niet, dan volgt aanpassing, ander schoeisel of geen inclusie, en welke van de drie het werd hoort vastgelegd.</w:t>
+      </w:r>
+    </w:p>
+    <w:p>
+      <w:pPr>
+        <w:spacing w:before="0" w:after="80"/>
+      </w:pPr>
+      <w:r>
+        <w:rPr>
+          <w:rFonts w:ascii="Segoe UI" w:hAnsi="Segoe UI" w:eastAsia="Segoe UI"/>
+          <w:b w:val="0"/>
+          <w:i w:val="0"/>
+          <w:color w:val="5A6A78"/>
+          <w:sz w:val="17"/>
+        </w:rPr>
+        <w:t>Onder welke kolom bestaand orthopedisch schoeisel valt voor de opbouw is nog niet bevestigd; zie de noot in §5 van PARADISE_BRONNEN.md.</w:t>
+      </w:r>
+    </w:p>
+    <w:p>
+      <w:pPr>
         <w:spacing w:before="0" w:after="80"/>
       </w:pPr>
       <w:r>
@@ -4979,6 +5025,4402 @@
           <w:sz w:val="19"/>
         </w:rPr>
         <w:t>Het gezondheidseconomisch dagboek 45b valt driemaandelijks samen met visites 3 tot 8; ik heb het daar aan vastgeknoopt in plaats van er een apart event voor te maken. Dat scheelt zes events en verliest niets, zolang het dagboek inderdaad op de visite binnenkomt.</w:t>
+      </w:r>
+    </w:p>
+    <w:p>
+      <w:pPr>
+        <w:keepNext/>
+        <w:spacing w:before="240" w:after="60"/>
+      </w:pPr>
+      <w:r>
+        <w:rPr>
+          <w:rFonts w:ascii="Segoe UI" w:hAnsi="Segoe UI" w:eastAsia="Segoe UI"/>
+          <w:b/>
+          <w:i w:val="0"/>
+          <w:color w:val="FF7A00"/>
+          <w:sz w:val="22"/>
+        </w:rPr>
+        <w:t xml:space="preserve">10  </w:t>
+      </w:r>
+      <w:r>
+        <w:rPr>
+          <w:rFonts w:ascii="Segoe UI" w:hAnsi="Segoe UI" w:eastAsia="Segoe UI"/>
+          <w:b/>
+          <w:i w:val="0"/>
+          <w:color w:val="00407A"/>
+          <w:sz w:val="22"/>
+        </w:rPr>
+        <w:t>Elk eCRF-nummer verantwoord</w:t>
+      </w:r>
+    </w:p>
+    <w:p>
+      <w:pPr>
+        <w:spacing w:before="0" w:after="80"/>
+      </w:pPr>
+      <w:r>
+        <w:rPr>
+          <w:rFonts w:ascii="Segoe UI" w:hAnsi="Segoe UI" w:eastAsia="Segoe UI"/>
+          <w:b w:val="0"/>
+          <w:i w:val="0"/>
+          <w:color w:val="1B2630"/>
+          <w:sz w:val="19"/>
+        </w:rPr>
+        <w:t>Volledige kruistabel tegen het register in §12 van PARADISE_BRONNEN.md. Elk nummer staat er, ook de nummers die bewust niet in REDCap komen — anders weet niemand later of een ontbrekend formulier een keuze was of een vergetelheid.</w:t>
+      </w:r>
+    </w:p>
+    <w:tbl>
+      <w:tblPr>
+        <w:tblW w:type="auto" w:w="0"/>
+        <w:jc w:val="left"/>
+        <w:tblLayout w:type="fixed"/>
+        <w:tblLook w:firstColumn="1" w:firstRow="1" w:lastColumn="0" w:lastRow="0" w:noHBand="0" w:noVBand="1" w:val="04A0"/>
+        <w:tblBorders>
+          <w:top w:val="single" w:sz="4" w:space="0" w:color="D8E2EA"/>
+          <w:left w:val="single" w:sz="4" w:space="0" w:color="D8E2EA"/>
+          <w:bottom w:val="single" w:sz="4" w:space="0" w:color="D8E2EA"/>
+          <w:right w:val="single" w:sz="4" w:space="0" w:color="D8E2EA"/>
+          <w:insideH w:val="single" w:sz="4" w:space="0" w:color="D8E2EA"/>
+          <w:insideV w:val="single" w:sz="4" w:space="0" w:color="D8E2EA"/>
+        </w:tblBorders>
+      </w:tblPr>
+      <w:tblGrid>
+        <w:gridCol w:w="2466"/>
+        <w:gridCol w:w="2466"/>
+        <w:gridCol w:w="2466"/>
+        <w:gridCol w:w="2466"/>
+      </w:tblGrid>
+      <w:tr>
+        <w:tc>
+          <w:tcPr>
+            <w:tcW w:type="dxa" w:w="680"/>
+            <w:shd w:val="clear" w:color="auto" w:fill="1D8DB0"/>
+          </w:tcPr>
+          <w:p>
+            <w:pPr>
+              <w:spacing w:before="30" w:after="30" w:line="252" w:lineRule="auto"/>
+            </w:pPr>
+            <w:r/>
+            <w:r>
+              <w:rPr>
+                <w:rFonts w:ascii="Segoe UI" w:hAnsi="Segoe UI" w:eastAsia="Segoe UI"/>
+                <w:b/>
+                <w:i w:val="0"/>
+                <w:color w:val="FFFFFF"/>
+                <w:sz w:val="15"/>
+              </w:rPr>
+              <w:t>Nr</w:t>
+            </w:r>
+          </w:p>
+        </w:tc>
+        <w:tc>
+          <w:tcPr>
+            <w:tcW w:type="dxa" w:w="2608"/>
+            <w:shd w:val="clear" w:color="auto" w:fill="1D8DB0"/>
+          </w:tcPr>
+          <w:p>
+            <w:pPr>
+              <w:spacing w:before="30" w:after="30" w:line="252" w:lineRule="auto"/>
+            </w:pPr>
+            <w:r/>
+            <w:r>
+              <w:rPr>
+                <w:rFonts w:ascii="Segoe UI" w:hAnsi="Segoe UI" w:eastAsia="Segoe UI"/>
+                <w:b/>
+                <w:i w:val="0"/>
+                <w:color w:val="FFFFFF"/>
+                <w:sz w:val="15"/>
+              </w:rPr>
+              <w:t>Document</w:t>
+            </w:r>
+          </w:p>
+        </w:tc>
+        <w:tc>
+          <w:tcPr>
+            <w:tcW w:type="dxa" w:w="2948"/>
+            <w:shd w:val="clear" w:color="auto" w:fill="1D8DB0"/>
+          </w:tcPr>
+          <w:p>
+            <w:pPr>
+              <w:spacing w:before="30" w:after="30" w:line="252" w:lineRule="auto"/>
+            </w:pPr>
+            <w:r/>
+            <w:r>
+              <w:rPr>
+                <w:rFonts w:ascii="Segoe UI" w:hAnsi="Segoe UI" w:eastAsia="Segoe UI"/>
+                <w:b/>
+                <w:i w:val="0"/>
+                <w:color w:val="FFFFFF"/>
+                <w:sz w:val="15"/>
+              </w:rPr>
+              <w:t>In REDCap als</w:t>
+            </w:r>
+          </w:p>
+        </w:tc>
+        <w:tc>
+          <w:tcPr>
+            <w:tcW w:type="dxa" w:w="3628"/>
+            <w:shd w:val="clear" w:color="auto" w:fill="1D8DB0"/>
+          </w:tcPr>
+          <w:p>
+            <w:pPr>
+              <w:spacing w:before="30" w:after="30" w:line="252" w:lineRule="auto"/>
+            </w:pPr>
+            <w:r/>
+            <w:r>
+              <w:rPr>
+                <w:rFonts w:ascii="Segoe UI" w:hAnsi="Segoe UI" w:eastAsia="Segoe UI"/>
+                <w:b/>
+                <w:i w:val="0"/>
+                <w:color w:val="FFFFFF"/>
+                <w:sz w:val="15"/>
+              </w:rPr>
+              <w:t>Zo niet, waarom</w:t>
+            </w:r>
+          </w:p>
+        </w:tc>
+      </w:tr>
+      <w:tr>
+        <w:tc>
+          <w:tcPr>
+            <w:tcW w:type="dxa" w:w="680"/>
+          </w:tcPr>
+          <w:p>
+            <w:pPr>
+              <w:spacing w:before="30" w:after="30" w:line="252" w:lineRule="auto"/>
+            </w:pPr>
+            <w:r/>
+            <w:r>
+              <w:rPr>
+                <w:rFonts w:ascii="Segoe UI" w:hAnsi="Segoe UI" w:eastAsia="Segoe UI"/>
+                <w:b w:val="0"/>
+                <w:i w:val="0"/>
+                <w:color w:val="1B2630"/>
+                <w:sz w:val="15"/>
+              </w:rPr>
+              <w:t>00</w:t>
+            </w:r>
+          </w:p>
+        </w:tc>
+        <w:tc>
+          <w:tcPr>
+            <w:tcW w:type="dxa" w:w="2608"/>
+          </w:tcPr>
+          <w:p>
+            <w:pPr>
+              <w:spacing w:before="30" w:after="30" w:line="252" w:lineRule="auto"/>
+            </w:pPr>
+            <w:r/>
+            <w:r>
+              <w:rPr>
+                <w:rFonts w:ascii="Segoe UI" w:hAnsi="Segoe UI" w:eastAsia="Segoe UI"/>
+                <w:b w:val="0"/>
+                <w:i w:val="0"/>
+                <w:color w:val="1B2630"/>
+                <w:sz w:val="15"/>
+              </w:rPr>
+              <w:t>Patiëntenidentificatielijst</w:t>
+            </w:r>
+          </w:p>
+        </w:tc>
+        <w:tc>
+          <w:tcPr>
+            <w:tcW w:type="dxa" w:w="2948"/>
+          </w:tcPr>
+          <w:p>
+            <w:pPr>
+              <w:spacing w:before="30" w:after="30" w:line="252" w:lineRule="auto"/>
+            </w:pPr>
+            <w:r/>
+            <w:r>
+              <w:rPr>
+                <w:rFonts w:ascii="Segoe UI" w:hAnsi="Segoe UI" w:eastAsia="Segoe UI"/>
+                <w:b w:val="0"/>
+                <w:i w:val="0"/>
+                <w:color w:val="1B2630"/>
+                <w:sz w:val="15"/>
+              </w:rPr>
+              <w:t>—</w:t>
+            </w:r>
+          </w:p>
+        </w:tc>
+        <w:tc>
+          <w:tcPr>
+            <w:tcW w:type="dxa" w:w="3628"/>
+          </w:tcPr>
+          <w:p>
+            <w:pPr>
+              <w:spacing w:before="30" w:after="30" w:line="252" w:lineRule="auto"/>
+            </w:pPr>
+            <w:r/>
+            <w:r>
+              <w:rPr>
+                <w:rFonts w:ascii="Segoe UI" w:hAnsi="Segoe UI" w:eastAsia="Segoe UI"/>
+                <w:b w:val="0"/>
+                <w:i w:val="0"/>
+                <w:color w:val="1B2630"/>
+                <w:sz w:val="15"/>
+              </w:rPr>
+              <w:t>Sleutel tussen code en persoon. Hoort buiten de pseudonieme databank.</w:t>
+            </w:r>
+          </w:p>
+        </w:tc>
+      </w:tr>
+      <w:tr>
+        <w:tc>
+          <w:tcPr>
+            <w:tcW w:type="dxa" w:w="680"/>
+          </w:tcPr>
+          <w:p>
+            <w:pPr>
+              <w:spacing w:before="30" w:after="30" w:line="252" w:lineRule="auto"/>
+            </w:pPr>
+            <w:r/>
+            <w:r>
+              <w:rPr>
+                <w:rFonts w:ascii="Segoe UI" w:hAnsi="Segoe UI" w:eastAsia="Segoe UI"/>
+                <w:b w:val="0"/>
+                <w:i w:val="0"/>
+                <w:color w:val="1B2630"/>
+                <w:sz w:val="15"/>
+              </w:rPr>
+              <w:t>01</w:t>
+            </w:r>
+          </w:p>
+        </w:tc>
+        <w:tc>
+          <w:tcPr>
+            <w:tcW w:type="dxa" w:w="2608"/>
+          </w:tcPr>
+          <w:p>
+            <w:pPr>
+              <w:spacing w:before="30" w:after="30" w:line="252" w:lineRule="auto"/>
+            </w:pPr>
+            <w:r/>
+            <w:r>
+              <w:rPr>
+                <w:rFonts w:ascii="Segoe UI" w:hAnsi="Segoe UI" w:eastAsia="Segoe UI"/>
+                <w:b w:val="0"/>
+                <w:i w:val="0"/>
+                <w:color w:val="1B2630"/>
+                <w:sz w:val="15"/>
+              </w:rPr>
+              <w:t>Screening voor toestemming</w:t>
+            </w:r>
+          </w:p>
+        </w:tc>
+        <w:tc>
+          <w:tcPr>
+            <w:tcW w:type="dxa" w:w="2948"/>
+          </w:tcPr>
+          <w:p>
+            <w:pPr>
+              <w:spacing w:before="30" w:after="30" w:line="252" w:lineRule="auto"/>
+            </w:pPr>
+            <w:r/>
+            <w:r>
+              <w:rPr>
+                <w:rFonts w:ascii="Segoe UI" w:hAnsi="Segoe UI" w:eastAsia="Segoe UI"/>
+                <w:b w:val="0"/>
+                <w:i w:val="0"/>
+                <w:color w:val="1B2630"/>
+                <w:sz w:val="15"/>
+              </w:rPr>
+              <w:t>e01_screening</w:t>
+            </w:r>
+          </w:p>
+        </w:tc>
+        <w:tc>
+          <w:tcPr>
+            <w:tcW w:type="dxa" w:w="3628"/>
+          </w:tcPr>
+          <w:p>
+            <w:pPr>
+              <w:spacing w:before="30" w:after="30" w:line="252" w:lineRule="auto"/>
+            </w:pPr>
+            <w:r/>
+          </w:p>
+        </w:tc>
+      </w:tr>
+      <w:tr>
+        <w:tc>
+          <w:tcPr>
+            <w:tcW w:type="dxa" w:w="680"/>
+          </w:tcPr>
+          <w:p>
+            <w:pPr>
+              <w:spacing w:before="30" w:after="30" w:line="252" w:lineRule="auto"/>
+            </w:pPr>
+            <w:r/>
+            <w:r>
+              <w:rPr>
+                <w:rFonts w:ascii="Segoe UI" w:hAnsi="Segoe UI" w:eastAsia="Segoe UI"/>
+                <w:b w:val="0"/>
+                <w:i w:val="0"/>
+                <w:color w:val="1B2630"/>
+                <w:sz w:val="15"/>
+              </w:rPr>
+              <w:t>02</w:t>
+            </w:r>
+          </w:p>
+        </w:tc>
+        <w:tc>
+          <w:tcPr>
+            <w:tcW w:type="dxa" w:w="2608"/>
+          </w:tcPr>
+          <w:p>
+            <w:pPr>
+              <w:spacing w:before="30" w:after="30" w:line="252" w:lineRule="auto"/>
+            </w:pPr>
+            <w:r/>
+            <w:r>
+              <w:rPr>
+                <w:rFonts w:ascii="Segoe UI" w:hAnsi="Segoe UI" w:eastAsia="Segoe UI"/>
+                <w:b w:val="0"/>
+                <w:i w:val="0"/>
+                <w:color w:val="1B2630"/>
+                <w:sz w:val="15"/>
+              </w:rPr>
+              <w:t>Toestemmings- en kostenformulier patiënt</w:t>
+            </w:r>
+          </w:p>
+        </w:tc>
+        <w:tc>
+          <w:tcPr>
+            <w:tcW w:type="dxa" w:w="2948"/>
+          </w:tcPr>
+          <w:p>
+            <w:pPr>
+              <w:spacing w:before="30" w:after="30" w:line="252" w:lineRule="auto"/>
+            </w:pPr>
+            <w:r/>
+            <w:r>
+              <w:rPr>
+                <w:rFonts w:ascii="Segoe UI" w:hAnsi="Segoe UI" w:eastAsia="Segoe UI"/>
+                <w:b w:val="0"/>
+                <w:i w:val="0"/>
+                <w:color w:val="1B2630"/>
+                <w:sz w:val="15"/>
+              </w:rPr>
+              <w:t>e02_toestemming</w:t>
+            </w:r>
+          </w:p>
+        </w:tc>
+        <w:tc>
+          <w:tcPr>
+            <w:tcW w:type="dxa" w:w="3628"/>
+          </w:tcPr>
+          <w:p>
+            <w:pPr>
+              <w:spacing w:before="30" w:after="30" w:line="252" w:lineRule="auto"/>
+            </w:pPr>
+            <w:r/>
+          </w:p>
+        </w:tc>
+      </w:tr>
+      <w:tr>
+        <w:tc>
+          <w:tcPr>
+            <w:tcW w:type="dxa" w:w="680"/>
+          </w:tcPr>
+          <w:p>
+            <w:pPr>
+              <w:spacing w:before="30" w:after="30" w:line="252" w:lineRule="auto"/>
+            </w:pPr>
+            <w:r/>
+            <w:r>
+              <w:rPr>
+                <w:rFonts w:ascii="Segoe UI" w:hAnsi="Segoe UI" w:eastAsia="Segoe UI"/>
+                <w:b w:val="0"/>
+                <w:i w:val="0"/>
+                <w:color w:val="1B2630"/>
+                <w:sz w:val="15"/>
+              </w:rPr>
+              <w:t>03</w:t>
+            </w:r>
+          </w:p>
+        </w:tc>
+        <w:tc>
+          <w:tcPr>
+            <w:tcW w:type="dxa" w:w="2608"/>
+          </w:tcPr>
+          <w:p>
+            <w:pPr>
+              <w:spacing w:before="30" w:after="30" w:line="252" w:lineRule="auto"/>
+            </w:pPr>
+            <w:r/>
+            <w:r>
+              <w:rPr>
+                <w:rFonts w:ascii="Segoe UI" w:hAnsi="Segoe UI" w:eastAsia="Segoe UI"/>
+                <w:b w:val="0"/>
+                <w:i w:val="0"/>
+                <w:color w:val="1B2630"/>
+                <w:sz w:val="15"/>
+              </w:rPr>
+              <w:t>Toestemmingsformulier sitepersoneel</w:t>
+            </w:r>
+          </w:p>
+        </w:tc>
+        <w:tc>
+          <w:tcPr>
+            <w:tcW w:type="dxa" w:w="2948"/>
+          </w:tcPr>
+          <w:p>
+            <w:pPr>
+              <w:spacing w:before="30" w:after="30" w:line="252" w:lineRule="auto"/>
+            </w:pPr>
+            <w:r/>
+            <w:r>
+              <w:rPr>
+                <w:rFonts w:ascii="Segoe UI" w:hAnsi="Segoe UI" w:eastAsia="Segoe UI"/>
+                <w:b w:val="0"/>
+                <w:i w:val="0"/>
+                <w:color w:val="1B2630"/>
+                <w:sz w:val="15"/>
+              </w:rPr>
+              <w:t>—</w:t>
+            </w:r>
+          </w:p>
+        </w:tc>
+        <w:tc>
+          <w:tcPr>
+            <w:tcW w:type="dxa" w:w="3628"/>
+          </w:tcPr>
+          <w:p>
+            <w:pPr>
+              <w:spacing w:before="30" w:after="30" w:line="252" w:lineRule="auto"/>
+            </w:pPr>
+            <w:r/>
+            <w:r>
+              <w:rPr>
+                <w:rFonts w:ascii="Segoe UI" w:hAnsi="Segoe UI" w:eastAsia="Segoe UI"/>
+                <w:b w:val="0"/>
+                <w:i w:val="0"/>
+                <w:color w:val="1B2630"/>
+                <w:sz w:val="15"/>
+              </w:rPr>
+              <w:t>Toestemming van sitepersoneel — geen deelnemerrecord, eigen populatie.</w:t>
+            </w:r>
+          </w:p>
+        </w:tc>
+      </w:tr>
+      <w:tr>
+        <w:tc>
+          <w:tcPr>
+            <w:tcW w:type="dxa" w:w="680"/>
+          </w:tcPr>
+          <w:p>
+            <w:pPr>
+              <w:spacing w:before="30" w:after="30" w:line="252" w:lineRule="auto"/>
+            </w:pPr>
+            <w:r/>
+            <w:r>
+              <w:rPr>
+                <w:rFonts w:ascii="Segoe UI" w:hAnsi="Segoe UI" w:eastAsia="Segoe UI"/>
+                <w:b w:val="0"/>
+                <w:i w:val="0"/>
+                <w:color w:val="1B2630"/>
+                <w:sz w:val="15"/>
+              </w:rPr>
+              <w:t>04</w:t>
+            </w:r>
+          </w:p>
+        </w:tc>
+        <w:tc>
+          <w:tcPr>
+            <w:tcW w:type="dxa" w:w="2608"/>
+          </w:tcPr>
+          <w:p>
+            <w:pPr>
+              <w:spacing w:before="30" w:after="30" w:line="252" w:lineRule="auto"/>
+            </w:pPr>
+            <w:r/>
+            <w:r>
+              <w:rPr>
+                <w:rFonts w:ascii="Segoe UI" w:hAnsi="Segoe UI" w:eastAsia="Segoe UI"/>
+                <w:b w:val="0"/>
+                <w:i w:val="0"/>
+                <w:color w:val="1B2630"/>
+                <w:sz w:val="15"/>
+              </w:rPr>
+              <w:t>Toestemmingsformulier therapeut</w:t>
+            </w:r>
+          </w:p>
+        </w:tc>
+        <w:tc>
+          <w:tcPr>
+            <w:tcW w:type="dxa" w:w="2948"/>
+          </w:tcPr>
+          <w:p>
+            <w:pPr>
+              <w:spacing w:before="30" w:after="30" w:line="252" w:lineRule="auto"/>
+            </w:pPr>
+            <w:r/>
+            <w:r>
+              <w:rPr>
+                <w:rFonts w:ascii="Segoe UI" w:hAnsi="Segoe UI" w:eastAsia="Segoe UI"/>
+                <w:b w:val="0"/>
+                <w:i w:val="0"/>
+                <w:color w:val="1B2630"/>
+                <w:sz w:val="15"/>
+              </w:rPr>
+              <w:t>—</w:t>
+            </w:r>
+          </w:p>
+        </w:tc>
+        <w:tc>
+          <w:tcPr>
+            <w:tcW w:type="dxa" w:w="3628"/>
+          </w:tcPr>
+          <w:p>
+            <w:pPr>
+              <w:spacing w:before="30" w:after="30" w:line="252" w:lineRule="auto"/>
+            </w:pPr>
+            <w:r/>
+            <w:r>
+              <w:rPr>
+                <w:rFonts w:ascii="Segoe UI" w:hAnsi="Segoe UI" w:eastAsia="Segoe UI"/>
+                <w:b w:val="0"/>
+                <w:i w:val="0"/>
+                <w:color w:val="1B2630"/>
+                <w:sz w:val="15"/>
+              </w:rPr>
+              <w:t>Toestemming van de therapeut — geen deelnemerrecord.</w:t>
+            </w:r>
+          </w:p>
+        </w:tc>
+      </w:tr>
+      <w:tr>
+        <w:tc>
+          <w:tcPr>
+            <w:tcW w:type="dxa" w:w="680"/>
+          </w:tcPr>
+          <w:p>
+            <w:pPr>
+              <w:spacing w:before="30" w:after="30" w:line="252" w:lineRule="auto"/>
+            </w:pPr>
+            <w:r/>
+            <w:r>
+              <w:rPr>
+                <w:rFonts w:ascii="Segoe UI" w:hAnsi="Segoe UI" w:eastAsia="Segoe UI"/>
+                <w:b w:val="0"/>
+                <w:i w:val="0"/>
+                <w:color w:val="1B2630"/>
+                <w:sz w:val="15"/>
+              </w:rPr>
+              <w:t>05</w:t>
+            </w:r>
+          </w:p>
+        </w:tc>
+        <w:tc>
+          <w:tcPr>
+            <w:tcW w:type="dxa" w:w="2608"/>
+          </w:tcPr>
+          <w:p>
+            <w:pPr>
+              <w:spacing w:before="30" w:after="30" w:line="252" w:lineRule="auto"/>
+            </w:pPr>
+            <w:r/>
+            <w:r>
+              <w:rPr>
+                <w:rFonts w:ascii="Segoe UI" w:hAnsi="Segoe UI" w:eastAsia="Segoe UI"/>
+                <w:b w:val="0"/>
+                <w:i w:val="0"/>
+                <w:color w:val="1B2630"/>
+                <w:sz w:val="15"/>
+              </w:rPr>
+              <w:t>Toestemmingsformulier manager</w:t>
+            </w:r>
+          </w:p>
+        </w:tc>
+        <w:tc>
+          <w:tcPr>
+            <w:tcW w:type="dxa" w:w="2948"/>
+          </w:tcPr>
+          <w:p>
+            <w:pPr>
+              <w:spacing w:before="30" w:after="30" w:line="252" w:lineRule="auto"/>
+            </w:pPr>
+            <w:r/>
+            <w:r>
+              <w:rPr>
+                <w:rFonts w:ascii="Segoe UI" w:hAnsi="Segoe UI" w:eastAsia="Segoe UI"/>
+                <w:b w:val="0"/>
+                <w:i w:val="0"/>
+                <w:color w:val="1B2630"/>
+                <w:sz w:val="15"/>
+              </w:rPr>
+              <w:t>—</w:t>
+            </w:r>
+          </w:p>
+        </w:tc>
+        <w:tc>
+          <w:tcPr>
+            <w:tcW w:type="dxa" w:w="3628"/>
+          </w:tcPr>
+          <w:p>
+            <w:pPr>
+              <w:spacing w:before="30" w:after="30" w:line="252" w:lineRule="auto"/>
+            </w:pPr>
+            <w:r/>
+            <w:r>
+              <w:rPr>
+                <w:rFonts w:ascii="Segoe UI" w:hAnsi="Segoe UI" w:eastAsia="Segoe UI"/>
+                <w:b w:val="0"/>
+                <w:i w:val="0"/>
+                <w:color w:val="1B2630"/>
+                <w:sz w:val="15"/>
+              </w:rPr>
+              <w:t>Toestemming van de manager — geen deelnemerrecord.</w:t>
+            </w:r>
+          </w:p>
+        </w:tc>
+      </w:tr>
+      <w:tr>
+        <w:tc>
+          <w:tcPr>
+            <w:tcW w:type="dxa" w:w="680"/>
+          </w:tcPr>
+          <w:p>
+            <w:pPr>
+              <w:spacing w:before="30" w:after="30" w:line="252" w:lineRule="auto"/>
+            </w:pPr>
+            <w:r/>
+            <w:r>
+              <w:rPr>
+                <w:rFonts w:ascii="Segoe UI" w:hAnsi="Segoe UI" w:eastAsia="Segoe UI"/>
+                <w:b w:val="0"/>
+                <w:i w:val="0"/>
+                <w:color w:val="1B2630"/>
+                <w:sz w:val="15"/>
+              </w:rPr>
+              <w:t>06</w:t>
+            </w:r>
+          </w:p>
+        </w:tc>
+        <w:tc>
+          <w:tcPr>
+            <w:tcW w:type="dxa" w:w="2608"/>
+          </w:tcPr>
+          <w:p>
+            <w:pPr>
+              <w:spacing w:before="30" w:after="30" w:line="252" w:lineRule="auto"/>
+            </w:pPr>
+            <w:r/>
+            <w:r>
+              <w:rPr>
+                <w:rFonts w:ascii="Segoe UI" w:hAnsi="Segoe UI" w:eastAsia="Segoe UI"/>
+                <w:b w:val="0"/>
+                <w:i w:val="0"/>
+                <w:color w:val="1B2630"/>
+                <w:sz w:val="15"/>
+              </w:rPr>
+              <w:t>Bevestiging geschiktheid baseline</w:t>
+            </w:r>
+          </w:p>
+        </w:tc>
+        <w:tc>
+          <w:tcPr>
+            <w:tcW w:type="dxa" w:w="2948"/>
+          </w:tcPr>
+          <w:p>
+            <w:pPr>
+              <w:spacing w:before="30" w:after="30" w:line="252" w:lineRule="auto"/>
+            </w:pPr>
+            <w:r/>
+            <w:r>
+              <w:rPr>
+                <w:rFonts w:ascii="Segoe UI" w:hAnsi="Segoe UI" w:eastAsia="Segoe UI"/>
+                <w:b w:val="0"/>
+                <w:i w:val="0"/>
+                <w:color w:val="1B2630"/>
+                <w:sz w:val="15"/>
+              </w:rPr>
+              <w:t>e06_geschiktheid</w:t>
+            </w:r>
+          </w:p>
+        </w:tc>
+        <w:tc>
+          <w:tcPr>
+            <w:tcW w:type="dxa" w:w="3628"/>
+          </w:tcPr>
+          <w:p>
+            <w:pPr>
+              <w:spacing w:before="30" w:after="30" w:line="252" w:lineRule="auto"/>
+            </w:pPr>
+            <w:r/>
+          </w:p>
+        </w:tc>
+      </w:tr>
+      <w:tr>
+        <w:tc>
+          <w:tcPr>
+            <w:tcW w:type="dxa" w:w="680"/>
+          </w:tcPr>
+          <w:p>
+            <w:pPr>
+              <w:spacing w:before="30" w:after="30" w:line="252" w:lineRule="auto"/>
+            </w:pPr>
+            <w:r/>
+            <w:r>
+              <w:rPr>
+                <w:rFonts w:ascii="Segoe UI" w:hAnsi="Segoe UI" w:eastAsia="Segoe UI"/>
+                <w:b w:val="0"/>
+                <w:i w:val="0"/>
+                <w:color w:val="1B2630"/>
+                <w:sz w:val="15"/>
+              </w:rPr>
+              <w:t>07</w:t>
+            </w:r>
+          </w:p>
+        </w:tc>
+        <w:tc>
+          <w:tcPr>
+            <w:tcW w:type="dxa" w:w="2608"/>
+          </w:tcPr>
+          <w:p>
+            <w:pPr>
+              <w:spacing w:before="30" w:after="30" w:line="252" w:lineRule="auto"/>
+            </w:pPr>
+            <w:r/>
+            <w:r>
+              <w:rPr>
+                <w:rFonts w:ascii="Segoe UI" w:hAnsi="Segoe UI" w:eastAsia="Segoe UI"/>
+                <w:b w:val="0"/>
+                <w:i w:val="0"/>
+                <w:color w:val="1B2630"/>
+                <w:sz w:val="15"/>
+              </w:rPr>
+              <w:t>Demografie en medische voorgeschiedenis</w:t>
+            </w:r>
+          </w:p>
+        </w:tc>
+        <w:tc>
+          <w:tcPr>
+            <w:tcW w:type="dxa" w:w="2948"/>
+          </w:tcPr>
+          <w:p>
+            <w:pPr>
+              <w:spacing w:before="30" w:after="30" w:line="252" w:lineRule="auto"/>
+            </w:pPr>
+            <w:r/>
+            <w:r>
+              <w:rPr>
+                <w:rFonts w:ascii="Segoe UI" w:hAnsi="Segoe UI" w:eastAsia="Segoe UI"/>
+                <w:b w:val="0"/>
+                <w:i w:val="0"/>
+                <w:color w:val="1B2630"/>
+                <w:sz w:val="15"/>
+              </w:rPr>
+              <w:t>e07_demografie</w:t>
+            </w:r>
+          </w:p>
+        </w:tc>
+        <w:tc>
+          <w:tcPr>
+            <w:tcW w:type="dxa" w:w="3628"/>
+          </w:tcPr>
+          <w:p>
+            <w:pPr>
+              <w:spacing w:before="30" w:after="30" w:line="252" w:lineRule="auto"/>
+            </w:pPr>
+            <w:r/>
+          </w:p>
+        </w:tc>
+      </w:tr>
+      <w:tr>
+        <w:tc>
+          <w:tcPr>
+            <w:tcW w:type="dxa" w:w="680"/>
+          </w:tcPr>
+          <w:p>
+            <w:pPr>
+              <w:spacing w:before="30" w:after="30" w:line="252" w:lineRule="auto"/>
+            </w:pPr>
+            <w:r/>
+            <w:r>
+              <w:rPr>
+                <w:rFonts w:ascii="Segoe UI" w:hAnsi="Segoe UI" w:eastAsia="Segoe UI"/>
+                <w:b w:val="0"/>
+                <w:i w:val="0"/>
+                <w:color w:val="1B2630"/>
+                <w:sz w:val="15"/>
+              </w:rPr>
+              <w:t>08</w:t>
+            </w:r>
+          </w:p>
+        </w:tc>
+        <w:tc>
+          <w:tcPr>
+            <w:tcW w:type="dxa" w:w="2608"/>
+          </w:tcPr>
+          <w:p>
+            <w:pPr>
+              <w:spacing w:before="30" w:after="30" w:line="252" w:lineRule="auto"/>
+            </w:pPr>
+            <w:r/>
+            <w:r>
+              <w:rPr>
+                <w:rFonts w:ascii="Segoe UI" w:hAnsi="Segoe UI" w:eastAsia="Segoe UI"/>
+                <w:b w:val="0"/>
+                <w:i w:val="0"/>
+                <w:color w:val="1B2630"/>
+                <w:sz w:val="15"/>
+              </w:rPr>
+              <w:t>Screening voet en schoeisel</w:t>
+            </w:r>
+          </w:p>
+        </w:tc>
+        <w:tc>
+          <w:tcPr>
+            <w:tcW w:type="dxa" w:w="2948"/>
+          </w:tcPr>
+          <w:p>
+            <w:pPr>
+              <w:spacing w:before="30" w:after="30" w:line="252" w:lineRule="auto"/>
+            </w:pPr>
+            <w:r/>
+            <w:r>
+              <w:rPr>
+                <w:rFonts w:ascii="Segoe UI" w:hAnsi="Segoe UI" w:eastAsia="Segoe UI"/>
+                <w:b w:val="0"/>
+                <w:i w:val="0"/>
+                <w:color w:val="1B2630"/>
+                <w:sz w:val="15"/>
+              </w:rPr>
+              <w:t>e08_voet_schoeisel</w:t>
+            </w:r>
+          </w:p>
+        </w:tc>
+        <w:tc>
+          <w:tcPr>
+            <w:tcW w:type="dxa" w:w="3628"/>
+          </w:tcPr>
+          <w:p>
+            <w:pPr>
+              <w:spacing w:before="30" w:after="30" w:line="252" w:lineRule="auto"/>
+            </w:pPr>
+            <w:r/>
+          </w:p>
+        </w:tc>
+      </w:tr>
+      <w:tr>
+        <w:tc>
+          <w:tcPr>
+            <w:tcW w:type="dxa" w:w="680"/>
+          </w:tcPr>
+          <w:p>
+            <w:pPr>
+              <w:spacing w:before="30" w:after="30" w:line="252" w:lineRule="auto"/>
+            </w:pPr>
+            <w:r/>
+            <w:r>
+              <w:rPr>
+                <w:rFonts w:ascii="Segoe UI" w:hAnsi="Segoe UI" w:eastAsia="Segoe UI"/>
+                <w:b w:val="0"/>
+                <w:i w:val="0"/>
+                <w:color w:val="1B2630"/>
+                <w:sz w:val="15"/>
+              </w:rPr>
+              <w:t>09</w:t>
+            </w:r>
+          </w:p>
+        </w:tc>
+        <w:tc>
+          <w:tcPr>
+            <w:tcW w:type="dxa" w:w="2608"/>
+          </w:tcPr>
+          <w:p>
+            <w:pPr>
+              <w:spacing w:before="30" w:after="30" w:line="252" w:lineRule="auto"/>
+            </w:pPr>
+            <w:r/>
+            <w:r>
+              <w:rPr>
+                <w:rFonts w:ascii="Segoe UI" w:hAnsi="Segoe UI" w:eastAsia="Segoe UI"/>
+                <w:b w:val="0"/>
+                <w:i w:val="0"/>
+                <w:color w:val="1B2630"/>
+                <w:sz w:val="15"/>
+              </w:rPr>
+              <w:t>Meting plantaire druk, baseline</w:t>
+            </w:r>
+          </w:p>
+        </w:tc>
+        <w:tc>
+          <w:tcPr>
+            <w:tcW w:type="dxa" w:w="2948"/>
+          </w:tcPr>
+          <w:p>
+            <w:pPr>
+              <w:spacing w:before="30" w:after="30" w:line="252" w:lineRule="auto"/>
+            </w:pPr>
+            <w:r/>
+            <w:r>
+              <w:rPr>
+                <w:rFonts w:ascii="Segoe UI" w:hAnsi="Segoe UI" w:eastAsia="Segoe UI"/>
+                <w:b w:val="0"/>
+                <w:i w:val="0"/>
+                <w:color w:val="1B2630"/>
+                <w:sz w:val="15"/>
+              </w:rPr>
+              <w:t>e09_drukmeting_baseline</w:t>
+            </w:r>
+          </w:p>
+        </w:tc>
+        <w:tc>
+          <w:tcPr>
+            <w:tcW w:type="dxa" w:w="3628"/>
+          </w:tcPr>
+          <w:p>
+            <w:pPr>
+              <w:spacing w:before="30" w:after="30" w:line="252" w:lineRule="auto"/>
+            </w:pPr>
+            <w:r/>
+          </w:p>
+        </w:tc>
+      </w:tr>
+      <w:tr>
+        <w:tc>
+          <w:tcPr>
+            <w:tcW w:type="dxa" w:w="680"/>
+          </w:tcPr>
+          <w:p>
+            <w:pPr>
+              <w:spacing w:before="30" w:after="30" w:line="252" w:lineRule="auto"/>
+            </w:pPr>
+            <w:r/>
+            <w:r>
+              <w:rPr>
+                <w:rFonts w:ascii="Segoe UI" w:hAnsi="Segoe UI" w:eastAsia="Segoe UI"/>
+                <w:b w:val="0"/>
+                <w:i w:val="0"/>
+                <w:color w:val="1B2630"/>
+                <w:sz w:val="15"/>
+              </w:rPr>
+              <w:t>10</w:t>
+            </w:r>
+          </w:p>
+        </w:tc>
+        <w:tc>
+          <w:tcPr>
+            <w:tcW w:type="dxa" w:w="2608"/>
+          </w:tcPr>
+          <w:p>
+            <w:pPr>
+              <w:spacing w:before="30" w:after="30" w:line="252" w:lineRule="auto"/>
+            </w:pPr>
+            <w:r/>
+            <w:r>
+              <w:rPr>
+                <w:rFonts w:ascii="Segoe UI" w:hAnsi="Segoe UI" w:eastAsia="Segoe UI"/>
+                <w:b w:val="0"/>
+                <w:i w:val="0"/>
+                <w:color w:val="1B2630"/>
+                <w:sz w:val="15"/>
+              </w:rPr>
+              <w:t>Voorschrift CMFO</w:t>
+            </w:r>
+          </w:p>
+        </w:tc>
+        <w:tc>
+          <w:tcPr>
+            <w:tcW w:type="dxa" w:w="2948"/>
+          </w:tcPr>
+          <w:p>
+            <w:pPr>
+              <w:spacing w:before="30" w:after="30" w:line="252" w:lineRule="auto"/>
+            </w:pPr>
+            <w:r/>
+            <w:r>
+              <w:rPr>
+                <w:rFonts w:ascii="Segoe UI" w:hAnsi="Segoe UI" w:eastAsia="Segoe UI"/>
+                <w:b w:val="0"/>
+                <w:i w:val="0"/>
+                <w:color w:val="1B2630"/>
+                <w:sz w:val="15"/>
+              </w:rPr>
+              <w:t>e10_voorschrift_cmfo</w:t>
+            </w:r>
+          </w:p>
+        </w:tc>
+        <w:tc>
+          <w:tcPr>
+            <w:tcW w:type="dxa" w:w="3628"/>
+          </w:tcPr>
+          <w:p>
+            <w:pPr>
+              <w:spacing w:before="30" w:after="30" w:line="252" w:lineRule="auto"/>
+            </w:pPr>
+            <w:r/>
+          </w:p>
+        </w:tc>
+      </w:tr>
+      <w:tr>
+        <w:tc>
+          <w:tcPr>
+            <w:tcW w:type="dxa" w:w="680"/>
+          </w:tcPr>
+          <w:p>
+            <w:pPr>
+              <w:spacing w:before="30" w:after="30" w:line="252" w:lineRule="auto"/>
+            </w:pPr>
+            <w:r/>
+            <w:r>
+              <w:rPr>
+                <w:rFonts w:ascii="Segoe UI" w:hAnsi="Segoe UI" w:eastAsia="Segoe UI"/>
+                <w:b w:val="0"/>
+                <w:i w:val="0"/>
+                <w:color w:val="1B2630"/>
+                <w:sz w:val="15"/>
+              </w:rPr>
+              <w:t>12</w:t>
+            </w:r>
+          </w:p>
+        </w:tc>
+        <w:tc>
+          <w:tcPr>
+            <w:tcW w:type="dxa" w:w="2608"/>
+          </w:tcPr>
+          <w:p>
+            <w:pPr>
+              <w:spacing w:before="30" w:after="30" w:line="252" w:lineRule="auto"/>
+            </w:pPr>
+            <w:r/>
+            <w:r>
+              <w:rPr>
+                <w:rFonts w:ascii="Segoe UI" w:hAnsi="Segoe UI" w:eastAsia="Segoe UI"/>
+                <w:b w:val="0"/>
+                <w:i w:val="0"/>
+                <w:color w:val="1B2630"/>
+                <w:sz w:val="15"/>
+              </w:rPr>
+              <w:t>Tevredenheid ulcuspreventie (VAS)</w:t>
+            </w:r>
+          </w:p>
+        </w:tc>
+        <w:tc>
+          <w:tcPr>
+            <w:tcW w:type="dxa" w:w="2948"/>
+          </w:tcPr>
+          <w:p>
+            <w:pPr>
+              <w:spacing w:before="30" w:after="30" w:line="252" w:lineRule="auto"/>
+            </w:pPr>
+            <w:r/>
+            <w:r>
+              <w:rPr>
+                <w:rFonts w:ascii="Segoe UI" w:hAnsi="Segoe UI" w:eastAsia="Segoe UI"/>
+                <w:b w:val="0"/>
+                <w:i w:val="0"/>
+                <w:color w:val="1B2630"/>
+                <w:sz w:val="15"/>
+              </w:rPr>
+              <w:t>e12_vas_tevredenheid</w:t>
+            </w:r>
+          </w:p>
+        </w:tc>
+        <w:tc>
+          <w:tcPr>
+            <w:tcW w:type="dxa" w:w="3628"/>
+          </w:tcPr>
+          <w:p>
+            <w:pPr>
+              <w:spacing w:before="30" w:after="30" w:line="252" w:lineRule="auto"/>
+            </w:pPr>
+            <w:r/>
+          </w:p>
+        </w:tc>
+      </w:tr>
+      <w:tr>
+        <w:tc>
+          <w:tcPr>
+            <w:tcW w:type="dxa" w:w="680"/>
+          </w:tcPr>
+          <w:p>
+            <w:pPr>
+              <w:spacing w:before="30" w:after="30" w:line="252" w:lineRule="auto"/>
+            </w:pPr>
+            <w:r/>
+            <w:r>
+              <w:rPr>
+                <w:rFonts w:ascii="Segoe UI" w:hAnsi="Segoe UI" w:eastAsia="Segoe UI"/>
+                <w:b w:val="0"/>
+                <w:i w:val="0"/>
+                <w:color w:val="1B2630"/>
+                <w:sz w:val="15"/>
+              </w:rPr>
+              <w:t>13</w:t>
+            </w:r>
+          </w:p>
+        </w:tc>
+        <w:tc>
+          <w:tcPr>
+            <w:tcW w:type="dxa" w:w="2608"/>
+          </w:tcPr>
+          <w:p>
+            <w:pPr>
+              <w:spacing w:before="30" w:after="30" w:line="252" w:lineRule="auto"/>
+            </w:pPr>
+            <w:r/>
+            <w:r>
+              <w:rPr>
+                <w:rFonts w:ascii="Segoe UI" w:hAnsi="Segoe UI" w:eastAsia="Segoe UI"/>
+                <w:b w:val="0"/>
+                <w:i w:val="0"/>
+                <w:color w:val="1B2630"/>
+                <w:sz w:val="15"/>
+              </w:rPr>
+              <w:t>Gebruik en bruikbaarheid maatschoeisel</w:t>
+            </w:r>
+          </w:p>
+        </w:tc>
+        <w:tc>
+          <w:tcPr>
+            <w:tcW w:type="dxa" w:w="2948"/>
+          </w:tcPr>
+          <w:p>
+            <w:pPr>
+              <w:spacing w:before="30" w:after="30" w:line="252" w:lineRule="auto"/>
+            </w:pPr>
+            <w:r/>
+            <w:r>
+              <w:rPr>
+                <w:rFonts w:ascii="Segoe UI" w:hAnsi="Segoe UI" w:eastAsia="Segoe UI"/>
+                <w:b w:val="0"/>
+                <w:i w:val="0"/>
+                <w:color w:val="1B2630"/>
+                <w:sz w:val="15"/>
+              </w:rPr>
+              <w:t>e13_gebruik_schoeisel</w:t>
+            </w:r>
+          </w:p>
+        </w:tc>
+        <w:tc>
+          <w:tcPr>
+            <w:tcW w:type="dxa" w:w="3628"/>
+          </w:tcPr>
+          <w:p>
+            <w:pPr>
+              <w:spacing w:before="30" w:after="30" w:line="252" w:lineRule="auto"/>
+            </w:pPr>
+            <w:r/>
+          </w:p>
+        </w:tc>
+      </w:tr>
+      <w:tr>
+        <w:tc>
+          <w:tcPr>
+            <w:tcW w:type="dxa" w:w="680"/>
+          </w:tcPr>
+          <w:p>
+            <w:pPr>
+              <w:spacing w:before="30" w:after="30" w:line="252" w:lineRule="auto"/>
+            </w:pPr>
+            <w:r/>
+            <w:r>
+              <w:rPr>
+                <w:rFonts w:ascii="Segoe UI" w:hAnsi="Segoe UI" w:eastAsia="Segoe UI"/>
+                <w:b w:val="0"/>
+                <w:i w:val="0"/>
+                <w:color w:val="1B2630"/>
+                <w:sz w:val="15"/>
+              </w:rPr>
+              <w:t>14</w:t>
+            </w:r>
+          </w:p>
+        </w:tc>
+        <w:tc>
+          <w:tcPr>
+            <w:tcW w:type="dxa" w:w="2608"/>
+          </w:tcPr>
+          <w:p>
+            <w:pPr>
+              <w:spacing w:before="30" w:after="30" w:line="252" w:lineRule="auto"/>
+            </w:pPr>
+            <w:r/>
+            <w:r>
+              <w:rPr>
+                <w:rFonts w:ascii="Segoe UI" w:hAnsi="Segoe UI" w:eastAsia="Segoe UI"/>
+                <w:b w:val="0"/>
+                <w:i w:val="0"/>
+                <w:color w:val="1B2630"/>
+                <w:sz w:val="15"/>
+              </w:rPr>
+              <w:t>Kennis voetzorg (NAFF)</w:t>
+            </w:r>
+          </w:p>
+        </w:tc>
+        <w:tc>
+          <w:tcPr>
+            <w:tcW w:type="dxa" w:w="2948"/>
+          </w:tcPr>
+          <w:p>
+            <w:pPr>
+              <w:spacing w:before="30" w:after="30" w:line="252" w:lineRule="auto"/>
+            </w:pPr>
+            <w:r/>
+            <w:r>
+              <w:rPr>
+                <w:rFonts w:ascii="Segoe UI" w:hAnsi="Segoe UI" w:eastAsia="Segoe UI"/>
+                <w:b w:val="0"/>
+                <w:i w:val="0"/>
+                <w:color w:val="1B2630"/>
+                <w:sz w:val="15"/>
+              </w:rPr>
+              <w:t>e14_naff</w:t>
+            </w:r>
+          </w:p>
+        </w:tc>
+        <w:tc>
+          <w:tcPr>
+            <w:tcW w:type="dxa" w:w="3628"/>
+          </w:tcPr>
+          <w:p>
+            <w:pPr>
+              <w:spacing w:before="30" w:after="30" w:line="252" w:lineRule="auto"/>
+            </w:pPr>
+            <w:r/>
+          </w:p>
+        </w:tc>
+      </w:tr>
+      <w:tr>
+        <w:tc>
+          <w:tcPr>
+            <w:tcW w:type="dxa" w:w="680"/>
+          </w:tcPr>
+          <w:p>
+            <w:pPr>
+              <w:spacing w:before="30" w:after="30" w:line="252" w:lineRule="auto"/>
+            </w:pPr>
+            <w:r/>
+            <w:r>
+              <w:rPr>
+                <w:rFonts w:ascii="Segoe UI" w:hAnsi="Segoe UI" w:eastAsia="Segoe UI"/>
+                <w:b w:val="0"/>
+                <w:i w:val="0"/>
+                <w:color w:val="1B2630"/>
+                <w:sz w:val="15"/>
+              </w:rPr>
+              <w:t>15</w:t>
+            </w:r>
+          </w:p>
+        </w:tc>
+        <w:tc>
+          <w:tcPr>
+            <w:tcW w:type="dxa" w:w="2608"/>
+          </w:tcPr>
+          <w:p>
+            <w:pPr>
+              <w:spacing w:before="30" w:after="30" w:line="252" w:lineRule="auto"/>
+            </w:pPr>
+            <w:r/>
+            <w:r>
+              <w:rPr>
+                <w:rFonts w:ascii="Segoe UI" w:hAnsi="Segoe UI" w:eastAsia="Segoe UI"/>
+                <w:b w:val="0"/>
+                <w:i w:val="0"/>
+                <w:color w:val="1B2630"/>
+                <w:sz w:val="15"/>
+              </w:rPr>
+              <w:t>Gezondheidsvaardigheden (HLS-EU-6)</w:t>
+            </w:r>
+          </w:p>
+        </w:tc>
+        <w:tc>
+          <w:tcPr>
+            <w:tcW w:type="dxa" w:w="2948"/>
+          </w:tcPr>
+          <w:p>
+            <w:pPr>
+              <w:spacing w:before="30" w:after="30" w:line="252" w:lineRule="auto"/>
+            </w:pPr>
+            <w:r/>
+            <w:r>
+              <w:rPr>
+                <w:rFonts w:ascii="Segoe UI" w:hAnsi="Segoe UI" w:eastAsia="Segoe UI"/>
+                <w:b w:val="0"/>
+                <w:i w:val="0"/>
+                <w:color w:val="1B2630"/>
+                <w:sz w:val="15"/>
+              </w:rPr>
+              <w:t>e15_hls_eu_6</w:t>
+            </w:r>
+          </w:p>
+        </w:tc>
+        <w:tc>
+          <w:tcPr>
+            <w:tcW w:type="dxa" w:w="3628"/>
+          </w:tcPr>
+          <w:p>
+            <w:pPr>
+              <w:spacing w:before="30" w:after="30" w:line="252" w:lineRule="auto"/>
+            </w:pPr>
+            <w:r/>
+          </w:p>
+        </w:tc>
+      </w:tr>
+      <w:tr>
+        <w:tc>
+          <w:tcPr>
+            <w:tcW w:type="dxa" w:w="680"/>
+          </w:tcPr>
+          <w:p>
+            <w:pPr>
+              <w:spacing w:before="30" w:after="30" w:line="252" w:lineRule="auto"/>
+            </w:pPr>
+            <w:r/>
+            <w:r>
+              <w:rPr>
+                <w:rFonts w:ascii="Segoe UI" w:hAnsi="Segoe UI" w:eastAsia="Segoe UI"/>
+                <w:b w:val="0"/>
+                <w:i w:val="0"/>
+                <w:color w:val="1B2630"/>
+                <w:sz w:val="15"/>
+              </w:rPr>
+              <w:t>16</w:t>
+            </w:r>
+          </w:p>
+        </w:tc>
+        <w:tc>
+          <w:tcPr>
+            <w:tcW w:type="dxa" w:w="2608"/>
+          </w:tcPr>
+          <w:p>
+            <w:pPr>
+              <w:spacing w:before="30" w:after="30" w:line="252" w:lineRule="auto"/>
+            </w:pPr>
+            <w:r/>
+            <w:r>
+              <w:rPr>
+                <w:rFonts w:ascii="Segoe UI" w:hAnsi="Segoe UI" w:eastAsia="Segoe UI"/>
+                <w:b w:val="0"/>
+                <w:i w:val="0"/>
+                <w:color w:val="1B2630"/>
+                <w:sz w:val="15"/>
+              </w:rPr>
+              <w:t>Educatieboekje voetzorg</w:t>
+            </w:r>
+          </w:p>
+        </w:tc>
+        <w:tc>
+          <w:tcPr>
+            <w:tcW w:type="dxa" w:w="2948"/>
+          </w:tcPr>
+          <w:p>
+            <w:pPr>
+              <w:spacing w:before="30" w:after="30" w:line="252" w:lineRule="auto"/>
+            </w:pPr>
+            <w:r/>
+            <w:r>
+              <w:rPr>
+                <w:rFonts w:ascii="Segoe UI" w:hAnsi="Segoe UI" w:eastAsia="Segoe UI"/>
+                <w:b w:val="0"/>
+                <w:i w:val="0"/>
+                <w:color w:val="1B2630"/>
+                <w:sz w:val="15"/>
+              </w:rPr>
+              <w:t>—</w:t>
+            </w:r>
+          </w:p>
+        </w:tc>
+        <w:tc>
+          <w:tcPr>
+            <w:tcW w:type="dxa" w:w="3628"/>
+          </w:tcPr>
+          <w:p>
+            <w:pPr>
+              <w:spacing w:before="30" w:after="30" w:line="252" w:lineRule="auto"/>
+            </w:pPr>
+            <w:r/>
+            <w:r>
+              <w:rPr>
+                <w:rFonts w:ascii="Segoe UI" w:hAnsi="Segoe UI" w:eastAsia="Segoe UI"/>
+                <w:b w:val="0"/>
+                <w:i w:val="0"/>
+                <w:color w:val="1B2630"/>
+                <w:sz w:val="15"/>
+              </w:rPr>
+              <w:t>Educatieboekje. Geen datacaptatie; de uitreiking wordt gelogd in e18.</w:t>
+            </w:r>
+          </w:p>
+        </w:tc>
+      </w:tr>
+      <w:tr>
+        <w:tc>
+          <w:tcPr>
+            <w:tcW w:type="dxa" w:w="680"/>
+          </w:tcPr>
+          <w:p>
+            <w:pPr>
+              <w:spacing w:before="30" w:after="30" w:line="252" w:lineRule="auto"/>
+            </w:pPr>
+            <w:r/>
+            <w:r>
+              <w:rPr>
+                <w:rFonts w:ascii="Segoe UI" w:hAnsi="Segoe UI" w:eastAsia="Segoe UI"/>
+                <w:b w:val="0"/>
+                <w:i w:val="0"/>
+                <w:color w:val="1B2630"/>
+                <w:sz w:val="15"/>
+              </w:rPr>
+              <w:t>17</w:t>
+            </w:r>
+          </w:p>
+        </w:tc>
+        <w:tc>
+          <w:tcPr>
+            <w:tcW w:type="dxa" w:w="2608"/>
+          </w:tcPr>
+          <w:p>
+            <w:pPr>
+              <w:spacing w:before="30" w:after="30" w:line="252" w:lineRule="auto"/>
+            </w:pPr>
+            <w:r/>
+            <w:r>
+              <w:rPr>
+                <w:rFonts w:ascii="Segoe UI" w:hAnsi="Segoe UI" w:eastAsia="Segoe UI"/>
+                <w:b w:val="0"/>
+                <w:i w:val="0"/>
+                <w:color w:val="1B2630"/>
+                <w:sz w:val="15"/>
+              </w:rPr>
+              <w:t>Script mondelinge voetzorgeducatie (SEBIA)</w:t>
+            </w:r>
+          </w:p>
+        </w:tc>
+        <w:tc>
+          <w:tcPr>
+            <w:tcW w:type="dxa" w:w="2948"/>
+          </w:tcPr>
+          <w:p>
+            <w:pPr>
+              <w:spacing w:before="30" w:after="30" w:line="252" w:lineRule="auto"/>
+            </w:pPr>
+            <w:r/>
+            <w:r>
+              <w:rPr>
+                <w:rFonts w:ascii="Segoe UI" w:hAnsi="Segoe UI" w:eastAsia="Segoe UI"/>
+                <w:b w:val="0"/>
+                <w:i w:val="0"/>
+                <w:color w:val="1B2630"/>
+                <w:sz w:val="15"/>
+              </w:rPr>
+              <w:t>—</w:t>
+            </w:r>
+          </w:p>
+        </w:tc>
+        <w:tc>
+          <w:tcPr>
+            <w:tcW w:type="dxa" w:w="3628"/>
+          </w:tcPr>
+          <w:p>
+            <w:pPr>
+              <w:spacing w:before="30" w:after="30" w:line="252" w:lineRule="auto"/>
+            </w:pPr>
+            <w:r/>
+            <w:r>
+              <w:rPr>
+                <w:rFonts w:ascii="Segoe UI" w:hAnsi="Segoe UI" w:eastAsia="Segoe UI"/>
+                <w:b w:val="0"/>
+                <w:i w:val="0"/>
+                <w:color w:val="1B2630"/>
+                <w:sz w:val="15"/>
+              </w:rPr>
+              <w:t>Script voor de mondelinge educatie. Geen datacaptatie; trouw aan het script zit in 44.</w:t>
+            </w:r>
+          </w:p>
+        </w:tc>
+      </w:tr>
+      <w:tr>
+        <w:tc>
+          <w:tcPr>
+            <w:tcW w:type="dxa" w:w="680"/>
+          </w:tcPr>
+          <w:p>
+            <w:pPr>
+              <w:spacing w:before="30" w:after="30" w:line="252" w:lineRule="auto"/>
+            </w:pPr>
+            <w:r/>
+            <w:r>
+              <w:rPr>
+                <w:rFonts w:ascii="Segoe UI" w:hAnsi="Segoe UI" w:eastAsia="Segoe UI"/>
+                <w:b w:val="0"/>
+                <w:i w:val="0"/>
+                <w:color w:val="1B2630"/>
+                <w:sz w:val="15"/>
+              </w:rPr>
+              <w:t>18</w:t>
+            </w:r>
+          </w:p>
+        </w:tc>
+        <w:tc>
+          <w:tcPr>
+            <w:tcW w:type="dxa" w:w="2608"/>
+          </w:tcPr>
+          <w:p>
+            <w:pPr>
+              <w:spacing w:before="30" w:after="30" w:line="252" w:lineRule="auto"/>
+            </w:pPr>
+            <w:r/>
+            <w:r>
+              <w:rPr>
+                <w:rFonts w:ascii="Segoe UI" w:hAnsi="Segoe UI" w:eastAsia="Segoe UI"/>
+                <w:b w:val="0"/>
+                <w:i w:val="0"/>
+                <w:color w:val="1B2630"/>
+                <w:sz w:val="15"/>
+              </w:rPr>
+              <w:t>Logboek educatie en vaardigheidstraining</w:t>
+            </w:r>
+          </w:p>
+        </w:tc>
+        <w:tc>
+          <w:tcPr>
+            <w:tcW w:type="dxa" w:w="2948"/>
+          </w:tcPr>
+          <w:p>
+            <w:pPr>
+              <w:spacing w:before="30" w:after="30" w:line="252" w:lineRule="auto"/>
+            </w:pPr>
+            <w:r/>
+            <w:r>
+              <w:rPr>
+                <w:rFonts w:ascii="Segoe UI" w:hAnsi="Segoe UI" w:eastAsia="Segoe UI"/>
+                <w:b w:val="0"/>
+                <w:i w:val="0"/>
+                <w:color w:val="1B2630"/>
+                <w:sz w:val="15"/>
+              </w:rPr>
+              <w:t>e18_logboek_educatie</w:t>
+            </w:r>
+          </w:p>
+        </w:tc>
+        <w:tc>
+          <w:tcPr>
+            <w:tcW w:type="dxa" w:w="3628"/>
+          </w:tcPr>
+          <w:p>
+            <w:pPr>
+              <w:spacing w:before="30" w:after="30" w:line="252" w:lineRule="auto"/>
+            </w:pPr>
+            <w:r/>
+          </w:p>
+        </w:tc>
+      </w:tr>
+      <w:tr>
+        <w:tc>
+          <w:tcPr>
+            <w:tcW w:type="dxa" w:w="680"/>
+          </w:tcPr>
+          <w:p>
+            <w:pPr>
+              <w:spacing w:before="30" w:after="30" w:line="252" w:lineRule="auto"/>
+            </w:pPr>
+            <w:r/>
+            <w:r>
+              <w:rPr>
+                <w:rFonts w:ascii="Segoe UI" w:hAnsi="Segoe UI" w:eastAsia="Segoe UI"/>
+                <w:b w:val="0"/>
+                <w:i w:val="0"/>
+                <w:color w:val="1B2630"/>
+                <w:sz w:val="15"/>
+              </w:rPr>
+              <w:t>19</w:t>
+            </w:r>
+          </w:p>
+        </w:tc>
+        <w:tc>
+          <w:tcPr>
+            <w:tcW w:type="dxa" w:w="2608"/>
+          </w:tcPr>
+          <w:p>
+            <w:pPr>
+              <w:spacing w:before="30" w:after="30" w:line="252" w:lineRule="auto"/>
+            </w:pPr>
+            <w:r/>
+            <w:r>
+              <w:rPr>
+                <w:rFonts w:ascii="Segoe UI" w:hAnsi="Segoe UI" w:eastAsia="Segoe UI"/>
+                <w:b w:val="0"/>
+                <w:i w:val="0"/>
+                <w:color w:val="1B2630"/>
+                <w:sz w:val="15"/>
+              </w:rPr>
+              <w:t>Gebruikershandleiding en SOP MoveMonitor</w:t>
+            </w:r>
+          </w:p>
+        </w:tc>
+        <w:tc>
+          <w:tcPr>
+            <w:tcW w:type="dxa" w:w="2948"/>
+          </w:tcPr>
+          <w:p>
+            <w:pPr>
+              <w:spacing w:before="30" w:after="30" w:line="252" w:lineRule="auto"/>
+            </w:pPr>
+            <w:r/>
+            <w:r>
+              <w:rPr>
+                <w:rFonts w:ascii="Segoe UI" w:hAnsi="Segoe UI" w:eastAsia="Segoe UI"/>
+                <w:b w:val="0"/>
+                <w:i w:val="0"/>
+                <w:color w:val="1B2630"/>
+                <w:sz w:val="15"/>
+              </w:rPr>
+              <w:t>—</w:t>
+            </w:r>
+          </w:p>
+        </w:tc>
+        <w:tc>
+          <w:tcPr>
+            <w:tcW w:type="dxa" w:w="3628"/>
+          </w:tcPr>
+          <w:p>
+            <w:pPr>
+              <w:spacing w:before="30" w:after="30" w:line="252" w:lineRule="auto"/>
+            </w:pPr>
+            <w:r/>
+            <w:r>
+              <w:rPr>
+                <w:rFonts w:ascii="Segoe UI" w:hAnsi="Segoe UI" w:eastAsia="Segoe UI"/>
+                <w:b w:val="0"/>
+                <w:i w:val="0"/>
+                <w:color w:val="1B2630"/>
+                <w:sz w:val="15"/>
+              </w:rPr>
+              <w:t>Gebruikershandleiding MoveMonitor. Geen datacaptatie.</w:t>
+            </w:r>
+          </w:p>
+        </w:tc>
+      </w:tr>
+      <w:tr>
+        <w:tc>
+          <w:tcPr>
+            <w:tcW w:type="dxa" w:w="680"/>
+          </w:tcPr>
+          <w:p>
+            <w:pPr>
+              <w:spacing w:before="30" w:after="30" w:line="252" w:lineRule="auto"/>
+            </w:pPr>
+            <w:r/>
+            <w:r>
+              <w:rPr>
+                <w:rFonts w:ascii="Segoe UI" w:hAnsi="Segoe UI" w:eastAsia="Segoe UI"/>
+                <w:b w:val="0"/>
+                <w:i w:val="0"/>
+                <w:color w:val="1B2630"/>
+                <w:sz w:val="15"/>
+              </w:rPr>
+              <w:t>19b</w:t>
+            </w:r>
+          </w:p>
+        </w:tc>
+        <w:tc>
+          <w:tcPr>
+            <w:tcW w:type="dxa" w:w="2608"/>
+          </w:tcPr>
+          <w:p>
+            <w:pPr>
+              <w:spacing w:before="30" w:after="30" w:line="252" w:lineRule="auto"/>
+            </w:pPr>
+            <w:r/>
+            <w:r>
+              <w:rPr>
+                <w:rFonts w:ascii="Segoe UI" w:hAnsi="Segoe UI" w:eastAsia="Segoe UI"/>
+                <w:b w:val="0"/>
+                <w:i w:val="0"/>
+                <w:color w:val="1B2630"/>
+                <w:sz w:val="15"/>
+              </w:rPr>
+              <w:t>Gebruikershandleiding en SOP MoveMonitor</w:t>
+            </w:r>
+          </w:p>
+        </w:tc>
+        <w:tc>
+          <w:tcPr>
+            <w:tcW w:type="dxa" w:w="2948"/>
+          </w:tcPr>
+          <w:p>
+            <w:pPr>
+              <w:spacing w:before="30" w:after="30" w:line="252" w:lineRule="auto"/>
+            </w:pPr>
+            <w:r/>
+            <w:r>
+              <w:rPr>
+                <w:rFonts w:ascii="Segoe UI" w:hAnsi="Segoe UI" w:eastAsia="Segoe UI"/>
+                <w:b w:val="0"/>
+                <w:i w:val="0"/>
+                <w:color w:val="1B2630"/>
+                <w:sz w:val="15"/>
+              </w:rPr>
+              <w:t>—</w:t>
+            </w:r>
+          </w:p>
+        </w:tc>
+        <w:tc>
+          <w:tcPr>
+            <w:tcW w:type="dxa" w:w="3628"/>
+          </w:tcPr>
+          <w:p>
+            <w:pPr>
+              <w:spacing w:before="30" w:after="30" w:line="252" w:lineRule="auto"/>
+            </w:pPr>
+            <w:r/>
+            <w:r>
+              <w:rPr>
+                <w:rFonts w:ascii="Segoe UI" w:hAnsi="Segoe UI" w:eastAsia="Segoe UI"/>
+                <w:b w:val="0"/>
+                <w:i w:val="0"/>
+                <w:color w:val="1B2630"/>
+                <w:sz w:val="15"/>
+              </w:rPr>
+              <w:t>SOP MoveMonitor. Geen datacaptatie.</w:t>
+            </w:r>
+          </w:p>
+        </w:tc>
+      </w:tr>
+      <w:tr>
+        <w:tc>
+          <w:tcPr>
+            <w:tcW w:type="dxa" w:w="680"/>
+          </w:tcPr>
+          <w:p>
+            <w:pPr>
+              <w:spacing w:before="30" w:after="30" w:line="252" w:lineRule="auto"/>
+            </w:pPr>
+            <w:r/>
+            <w:r>
+              <w:rPr>
+                <w:rFonts w:ascii="Segoe UI" w:hAnsi="Segoe UI" w:eastAsia="Segoe UI"/>
+                <w:b w:val="0"/>
+                <w:i w:val="0"/>
+                <w:color w:val="1B2630"/>
+                <w:sz w:val="15"/>
+              </w:rPr>
+              <w:t>20</w:t>
+            </w:r>
+          </w:p>
+        </w:tc>
+        <w:tc>
+          <w:tcPr>
+            <w:tcW w:type="dxa" w:w="2608"/>
+          </w:tcPr>
+          <w:p>
+            <w:pPr>
+              <w:spacing w:before="30" w:after="30" w:line="252" w:lineRule="auto"/>
+            </w:pPr>
+            <w:r/>
+            <w:r>
+              <w:rPr>
+                <w:rFonts w:ascii="Segoe UI" w:hAnsi="Segoe UI" w:eastAsia="Segoe UI"/>
+                <w:b w:val="0"/>
+                <w:i w:val="0"/>
+                <w:color w:val="1B2630"/>
+                <w:sz w:val="15"/>
+              </w:rPr>
+              <w:t>UDI MoveMonitor</w:t>
+            </w:r>
+          </w:p>
+        </w:tc>
+        <w:tc>
+          <w:tcPr>
+            <w:tcW w:type="dxa" w:w="2948"/>
+          </w:tcPr>
+          <w:p>
+            <w:pPr>
+              <w:spacing w:before="30" w:after="30" w:line="252" w:lineRule="auto"/>
+            </w:pPr>
+            <w:r/>
+            <w:r>
+              <w:rPr>
+                <w:rFonts w:ascii="Segoe UI" w:hAnsi="Segoe UI" w:eastAsia="Segoe UI"/>
+                <w:b w:val="0"/>
+                <w:i w:val="0"/>
+                <w:color w:val="1B2630"/>
+                <w:sz w:val="15"/>
+              </w:rPr>
+              <w:t>e20_udi_movemonitor</w:t>
+            </w:r>
+          </w:p>
+        </w:tc>
+        <w:tc>
+          <w:tcPr>
+            <w:tcW w:type="dxa" w:w="3628"/>
+          </w:tcPr>
+          <w:p>
+            <w:pPr>
+              <w:spacing w:before="30" w:after="30" w:line="252" w:lineRule="auto"/>
+            </w:pPr>
+            <w:r/>
+          </w:p>
+        </w:tc>
+      </w:tr>
+      <w:tr>
+        <w:tc>
+          <w:tcPr>
+            <w:tcW w:type="dxa" w:w="680"/>
+          </w:tcPr>
+          <w:p>
+            <w:pPr>
+              <w:spacing w:before="30" w:after="30" w:line="252" w:lineRule="auto"/>
+            </w:pPr>
+            <w:r/>
+            <w:r>
+              <w:rPr>
+                <w:rFonts w:ascii="Segoe UI" w:hAnsi="Segoe UI" w:eastAsia="Segoe UI"/>
+                <w:b w:val="0"/>
+                <w:i w:val="0"/>
+                <w:color w:val="1B2630"/>
+                <w:sz w:val="15"/>
+              </w:rPr>
+              <w:t>21</w:t>
+            </w:r>
+          </w:p>
+        </w:tc>
+        <w:tc>
+          <w:tcPr>
+            <w:tcW w:type="dxa" w:w="2608"/>
+          </w:tcPr>
+          <w:p>
+            <w:pPr>
+              <w:spacing w:before="30" w:after="30" w:line="252" w:lineRule="auto"/>
+            </w:pPr>
+            <w:r/>
+            <w:r>
+              <w:rPr>
+                <w:rFonts w:ascii="Segoe UI" w:hAnsi="Segoe UI" w:eastAsia="Segoe UI"/>
+                <w:b w:val="0"/>
+                <w:i w:val="0"/>
+                <w:color w:val="1B2630"/>
+                <w:sz w:val="15"/>
+              </w:rPr>
+              <w:t>EQ-5D-5L</w:t>
+            </w:r>
+          </w:p>
+        </w:tc>
+        <w:tc>
+          <w:tcPr>
+            <w:tcW w:type="dxa" w:w="2948"/>
+          </w:tcPr>
+          <w:p>
+            <w:pPr>
+              <w:spacing w:before="30" w:after="30" w:line="252" w:lineRule="auto"/>
+            </w:pPr>
+            <w:r/>
+            <w:r>
+              <w:rPr>
+                <w:rFonts w:ascii="Segoe UI" w:hAnsi="Segoe UI" w:eastAsia="Segoe UI"/>
+                <w:b w:val="0"/>
+                <w:i w:val="0"/>
+                <w:color w:val="1B2630"/>
+                <w:sz w:val="15"/>
+              </w:rPr>
+              <w:t>e21_eq5d5l</w:t>
+            </w:r>
+          </w:p>
+        </w:tc>
+        <w:tc>
+          <w:tcPr>
+            <w:tcW w:type="dxa" w:w="3628"/>
+          </w:tcPr>
+          <w:p>
+            <w:pPr>
+              <w:spacing w:before="30" w:after="30" w:line="252" w:lineRule="auto"/>
+            </w:pPr>
+            <w:r/>
+          </w:p>
+        </w:tc>
+      </w:tr>
+      <w:tr>
+        <w:tc>
+          <w:tcPr>
+            <w:tcW w:type="dxa" w:w="680"/>
+          </w:tcPr>
+          <w:p>
+            <w:pPr>
+              <w:spacing w:before="30" w:after="30" w:line="252" w:lineRule="auto"/>
+            </w:pPr>
+            <w:r/>
+            <w:r>
+              <w:rPr>
+                <w:rFonts w:ascii="Segoe UI" w:hAnsi="Segoe UI" w:eastAsia="Segoe UI"/>
+                <w:b w:val="0"/>
+                <w:i w:val="0"/>
+                <w:color w:val="1B2630"/>
+                <w:sz w:val="15"/>
+              </w:rPr>
+              <w:t>23</w:t>
+            </w:r>
+          </w:p>
+        </w:tc>
+        <w:tc>
+          <w:tcPr>
+            <w:tcW w:type="dxa" w:w="2608"/>
+          </w:tcPr>
+          <w:p>
+            <w:pPr>
+              <w:spacing w:before="30" w:after="30" w:line="252" w:lineRule="auto"/>
+            </w:pPr>
+            <w:r/>
+            <w:r>
+              <w:rPr>
+                <w:rFonts w:ascii="Segoe UI" w:hAnsi="Segoe UI" w:eastAsia="Segoe UI"/>
+                <w:b w:val="0"/>
+                <w:i w:val="0"/>
+                <w:color w:val="1B2630"/>
+                <w:sz w:val="15"/>
+              </w:rPr>
+              <w:t>Aanpassing en controle voetorthese</w:t>
+            </w:r>
+          </w:p>
+        </w:tc>
+        <w:tc>
+          <w:tcPr>
+            <w:tcW w:type="dxa" w:w="2948"/>
+          </w:tcPr>
+          <w:p>
+            <w:pPr>
+              <w:spacing w:before="30" w:after="30" w:line="252" w:lineRule="auto"/>
+            </w:pPr>
+            <w:r/>
+            <w:r>
+              <w:rPr>
+                <w:rFonts w:ascii="Segoe UI" w:hAnsi="Segoe UI" w:eastAsia="Segoe UI"/>
+                <w:b w:val="0"/>
+                <w:i w:val="0"/>
+                <w:color w:val="1B2630"/>
+                <w:sz w:val="15"/>
+              </w:rPr>
+              <w:t>e23_aanpassing_cmfo</w:t>
+            </w:r>
+          </w:p>
+        </w:tc>
+        <w:tc>
+          <w:tcPr>
+            <w:tcW w:type="dxa" w:w="3628"/>
+          </w:tcPr>
+          <w:p>
+            <w:pPr>
+              <w:spacing w:before="30" w:after="30" w:line="252" w:lineRule="auto"/>
+            </w:pPr>
+            <w:r/>
+          </w:p>
+        </w:tc>
+      </w:tr>
+      <w:tr>
+        <w:tc>
+          <w:tcPr>
+            <w:tcW w:type="dxa" w:w="680"/>
+          </w:tcPr>
+          <w:p>
+            <w:pPr>
+              <w:spacing w:before="30" w:after="30" w:line="252" w:lineRule="auto"/>
+            </w:pPr>
+            <w:r/>
+            <w:r>
+              <w:rPr>
+                <w:rFonts w:ascii="Segoe UI" w:hAnsi="Segoe UI" w:eastAsia="Segoe UI"/>
+                <w:b w:val="0"/>
+                <w:i w:val="0"/>
+                <w:color w:val="1B2630"/>
+                <w:sz w:val="15"/>
+              </w:rPr>
+              <w:t>24</w:t>
+            </w:r>
+          </w:p>
+        </w:tc>
+        <w:tc>
+          <w:tcPr>
+            <w:tcW w:type="dxa" w:w="2608"/>
+          </w:tcPr>
+          <w:p>
+            <w:pPr>
+              <w:spacing w:before="30" w:after="30" w:line="252" w:lineRule="auto"/>
+            </w:pPr>
+            <w:r/>
+            <w:r>
+              <w:rPr>
+                <w:rFonts w:ascii="Segoe UI" w:hAnsi="Segoe UI" w:eastAsia="Segoe UI"/>
+                <w:b w:val="0"/>
+                <w:i w:val="0"/>
+                <w:color w:val="1B2630"/>
+                <w:sz w:val="15"/>
+              </w:rPr>
+              <w:t>Drukherverdeling en opvolgtool piekdruk</w:t>
+            </w:r>
+          </w:p>
+        </w:tc>
+        <w:tc>
+          <w:tcPr>
+            <w:tcW w:type="dxa" w:w="2948"/>
+          </w:tcPr>
+          <w:p>
+            <w:pPr>
+              <w:spacing w:before="30" w:after="30" w:line="252" w:lineRule="auto"/>
+            </w:pPr>
+            <w:r/>
+            <w:r>
+              <w:rPr>
+                <w:rFonts w:ascii="Segoe UI" w:hAnsi="Segoe UI" w:eastAsia="Segoe UI"/>
+                <w:b w:val="0"/>
+                <w:i w:val="0"/>
+                <w:color w:val="1B2630"/>
+                <w:sz w:val="15"/>
+              </w:rPr>
+              <w:t>e24_drukmeting_uc, e24_drukherverdeling_oc</w:t>
+            </w:r>
+          </w:p>
+        </w:tc>
+        <w:tc>
+          <w:tcPr>
+            <w:tcW w:type="dxa" w:w="3628"/>
+          </w:tcPr>
+          <w:p>
+            <w:pPr>
+              <w:spacing w:before="30" w:after="30" w:line="252" w:lineRule="auto"/>
+            </w:pPr>
+            <w:r/>
+          </w:p>
+        </w:tc>
+      </w:tr>
+      <w:tr>
+        <w:tc>
+          <w:tcPr>
+            <w:tcW w:type="dxa" w:w="680"/>
+          </w:tcPr>
+          <w:p>
+            <w:pPr>
+              <w:spacing w:before="30" w:after="30" w:line="252" w:lineRule="auto"/>
+            </w:pPr>
+            <w:r/>
+            <w:r>
+              <w:rPr>
+                <w:rFonts w:ascii="Segoe UI" w:hAnsi="Segoe UI" w:eastAsia="Segoe UI"/>
+                <w:b w:val="0"/>
+                <w:i w:val="0"/>
+                <w:color w:val="1B2630"/>
+                <w:sz w:val="15"/>
+              </w:rPr>
+              <w:t>24b</w:t>
+            </w:r>
+          </w:p>
+        </w:tc>
+        <w:tc>
+          <w:tcPr>
+            <w:tcW w:type="dxa" w:w="2608"/>
+          </w:tcPr>
+          <w:p>
+            <w:pPr>
+              <w:spacing w:before="30" w:after="30" w:line="252" w:lineRule="auto"/>
+            </w:pPr>
+            <w:r/>
+            <w:r>
+              <w:rPr>
+                <w:rFonts w:ascii="Segoe UI" w:hAnsi="Segoe UI" w:eastAsia="Segoe UI"/>
+                <w:b w:val="0"/>
+                <w:i w:val="0"/>
+                <w:color w:val="1B2630"/>
+                <w:sz w:val="15"/>
+              </w:rPr>
+              <w:t>Drukherverdeling en opvolgtool piekdruk</w:t>
+            </w:r>
+          </w:p>
+        </w:tc>
+        <w:tc>
+          <w:tcPr>
+            <w:tcW w:type="dxa" w:w="2948"/>
+          </w:tcPr>
+          <w:p>
+            <w:pPr>
+              <w:spacing w:before="30" w:after="30" w:line="252" w:lineRule="auto"/>
+            </w:pPr>
+            <w:r/>
+            <w:r>
+              <w:rPr>
+                <w:rFonts w:ascii="Segoe UI" w:hAnsi="Segoe UI" w:eastAsia="Segoe UI"/>
+                <w:b w:val="0"/>
+                <w:i w:val="0"/>
+                <w:color w:val="1B2630"/>
+                <w:sz w:val="15"/>
+              </w:rPr>
+              <w:t>—</w:t>
+            </w:r>
+          </w:p>
+        </w:tc>
+        <w:tc>
+          <w:tcPr>
+            <w:tcW w:type="dxa" w:w="3628"/>
+          </w:tcPr>
+          <w:p>
+            <w:pPr>
+              <w:spacing w:before="30" w:after="30" w:line="252" w:lineRule="auto"/>
+            </w:pPr>
+            <w:r/>
+            <w:r>
+              <w:rPr>
+                <w:rFonts w:ascii="Segoe UI" w:hAnsi="Segoe UI" w:eastAsia="Segoe UI"/>
+                <w:b w:val="0"/>
+                <w:i w:val="0"/>
+                <w:color w:val="1B2630"/>
+                <w:sz w:val="15"/>
+              </w:rPr>
+              <w:t>Excel-opvolgtool piekdruk. Rekenhulp, geen formulier; de uitkomst landt in e24.</w:t>
+            </w:r>
+          </w:p>
+        </w:tc>
+      </w:tr>
+      <w:tr>
+        <w:tc>
+          <w:tcPr>
+            <w:tcW w:type="dxa" w:w="680"/>
+          </w:tcPr>
+          <w:p>
+            <w:pPr>
+              <w:spacing w:before="30" w:after="30" w:line="252" w:lineRule="auto"/>
+            </w:pPr>
+            <w:r/>
+            <w:r>
+              <w:rPr>
+                <w:rFonts w:ascii="Segoe UI" w:hAnsi="Segoe UI" w:eastAsia="Segoe UI"/>
+                <w:b w:val="0"/>
+                <w:i w:val="0"/>
+                <w:color w:val="1B2630"/>
+                <w:sz w:val="15"/>
+              </w:rPr>
+              <w:t>25</w:t>
+            </w:r>
+          </w:p>
+        </w:tc>
+        <w:tc>
+          <w:tcPr>
+            <w:tcW w:type="dxa" w:w="2608"/>
+          </w:tcPr>
+          <w:p>
+            <w:pPr>
+              <w:spacing w:before="30" w:after="30" w:line="252" w:lineRule="auto"/>
+            </w:pPr>
+            <w:r/>
+            <w:r>
+              <w:rPr>
+                <w:rFonts w:ascii="Segoe UI" w:hAnsi="Segoe UI" w:eastAsia="Segoe UI"/>
+                <w:b w:val="0"/>
+                <w:i w:val="0"/>
+                <w:color w:val="1B2630"/>
+                <w:sz w:val="15"/>
+              </w:rPr>
+              <w:t>UDI en SOP Orthotimer</w:t>
+            </w:r>
+          </w:p>
+        </w:tc>
+        <w:tc>
+          <w:tcPr>
+            <w:tcW w:type="dxa" w:w="2948"/>
+          </w:tcPr>
+          <w:p>
+            <w:pPr>
+              <w:spacing w:before="30" w:after="30" w:line="252" w:lineRule="auto"/>
+            </w:pPr>
+            <w:r/>
+            <w:r>
+              <w:rPr>
+                <w:rFonts w:ascii="Segoe UI" w:hAnsi="Segoe UI" w:eastAsia="Segoe UI"/>
+                <w:b w:val="0"/>
+                <w:i w:val="0"/>
+                <w:color w:val="1B2630"/>
+                <w:sz w:val="15"/>
+              </w:rPr>
+              <w:t>e25_udi_orthotimer</w:t>
+            </w:r>
+          </w:p>
+        </w:tc>
+        <w:tc>
+          <w:tcPr>
+            <w:tcW w:type="dxa" w:w="3628"/>
+          </w:tcPr>
+          <w:p>
+            <w:pPr>
+              <w:spacing w:before="30" w:after="30" w:line="252" w:lineRule="auto"/>
+            </w:pPr>
+            <w:r/>
+          </w:p>
+        </w:tc>
+      </w:tr>
+      <w:tr>
+        <w:tc>
+          <w:tcPr>
+            <w:tcW w:type="dxa" w:w="680"/>
+          </w:tcPr>
+          <w:p>
+            <w:pPr>
+              <w:spacing w:before="30" w:after="30" w:line="252" w:lineRule="auto"/>
+            </w:pPr>
+            <w:r/>
+            <w:r>
+              <w:rPr>
+                <w:rFonts w:ascii="Segoe UI" w:hAnsi="Segoe UI" w:eastAsia="Segoe UI"/>
+                <w:b w:val="0"/>
+                <w:i w:val="0"/>
+                <w:color w:val="1B2630"/>
+                <w:sz w:val="15"/>
+              </w:rPr>
+              <w:t>25b</w:t>
+            </w:r>
+          </w:p>
+        </w:tc>
+        <w:tc>
+          <w:tcPr>
+            <w:tcW w:type="dxa" w:w="2608"/>
+          </w:tcPr>
+          <w:p>
+            <w:pPr>
+              <w:spacing w:before="30" w:after="30" w:line="252" w:lineRule="auto"/>
+            </w:pPr>
+            <w:r/>
+            <w:r>
+              <w:rPr>
+                <w:rFonts w:ascii="Segoe UI" w:hAnsi="Segoe UI" w:eastAsia="Segoe UI"/>
+                <w:b w:val="0"/>
+                <w:i w:val="0"/>
+                <w:color w:val="1B2630"/>
+                <w:sz w:val="15"/>
+              </w:rPr>
+              <w:t>UDI en SOP Orthotimer</w:t>
+            </w:r>
+          </w:p>
+        </w:tc>
+        <w:tc>
+          <w:tcPr>
+            <w:tcW w:type="dxa" w:w="2948"/>
+          </w:tcPr>
+          <w:p>
+            <w:pPr>
+              <w:spacing w:before="30" w:after="30" w:line="252" w:lineRule="auto"/>
+            </w:pPr>
+            <w:r/>
+            <w:r>
+              <w:rPr>
+                <w:rFonts w:ascii="Segoe UI" w:hAnsi="Segoe UI" w:eastAsia="Segoe UI"/>
+                <w:b w:val="0"/>
+                <w:i w:val="0"/>
+                <w:color w:val="1B2630"/>
+                <w:sz w:val="15"/>
+              </w:rPr>
+              <w:t>—</w:t>
+            </w:r>
+          </w:p>
+        </w:tc>
+        <w:tc>
+          <w:tcPr>
+            <w:tcW w:type="dxa" w:w="3628"/>
+          </w:tcPr>
+          <w:p>
+            <w:pPr>
+              <w:spacing w:before="30" w:after="30" w:line="252" w:lineRule="auto"/>
+            </w:pPr>
+            <w:r/>
+            <w:r>
+              <w:rPr>
+                <w:rFonts w:ascii="Segoe UI" w:hAnsi="Segoe UI" w:eastAsia="Segoe UI"/>
+                <w:b w:val="0"/>
+                <w:i w:val="0"/>
+                <w:color w:val="1B2630"/>
+                <w:sz w:val="15"/>
+              </w:rPr>
+              <w:t>SOP Orthotimer. Geen datacaptatie.</w:t>
+            </w:r>
+          </w:p>
+        </w:tc>
+      </w:tr>
+      <w:tr>
+        <w:tc>
+          <w:tcPr>
+            <w:tcW w:type="dxa" w:w="680"/>
+          </w:tcPr>
+          <w:p>
+            <w:pPr>
+              <w:spacing w:before="30" w:after="30" w:line="252" w:lineRule="auto"/>
+            </w:pPr>
+            <w:r/>
+            <w:r>
+              <w:rPr>
+                <w:rFonts w:ascii="Segoe UI" w:hAnsi="Segoe UI" w:eastAsia="Segoe UI"/>
+                <w:b w:val="0"/>
+                <w:i w:val="0"/>
+                <w:color w:val="1B2630"/>
+                <w:sz w:val="15"/>
+              </w:rPr>
+              <w:t>26</w:t>
+            </w:r>
+          </w:p>
+        </w:tc>
+        <w:tc>
+          <w:tcPr>
+            <w:tcW w:type="dxa" w:w="2608"/>
+          </w:tcPr>
+          <w:p>
+            <w:pPr>
+              <w:spacing w:before="30" w:after="30" w:line="252" w:lineRule="auto"/>
+            </w:pPr>
+            <w:r/>
+            <w:r>
+              <w:rPr>
+                <w:rFonts w:ascii="Segoe UI" w:hAnsi="Segoe UI" w:eastAsia="Segoe UI"/>
+                <w:b w:val="0"/>
+                <w:i w:val="0"/>
+                <w:color w:val="1B2630"/>
+                <w:sz w:val="15"/>
+              </w:rPr>
+              <w:t>Overtuigingen en gewoontes rond schoeisel</w:t>
+            </w:r>
+          </w:p>
+        </w:tc>
+        <w:tc>
+          <w:tcPr>
+            <w:tcW w:type="dxa" w:w="2948"/>
+          </w:tcPr>
+          <w:p>
+            <w:pPr>
+              <w:spacing w:before="30" w:after="30" w:line="252" w:lineRule="auto"/>
+            </w:pPr>
+            <w:r/>
+            <w:r>
+              <w:rPr>
+                <w:rFonts w:ascii="Segoe UI" w:hAnsi="Segoe UI" w:eastAsia="Segoe UI"/>
+                <w:b w:val="0"/>
+                <w:i w:val="0"/>
+                <w:color w:val="1B2630"/>
+                <w:sz w:val="15"/>
+              </w:rPr>
+              <w:t>e26_overtuigingen</w:t>
+            </w:r>
+          </w:p>
+        </w:tc>
+        <w:tc>
+          <w:tcPr>
+            <w:tcW w:type="dxa" w:w="3628"/>
+          </w:tcPr>
+          <w:p>
+            <w:pPr>
+              <w:spacing w:before="30" w:after="30" w:line="252" w:lineRule="auto"/>
+            </w:pPr>
+            <w:r/>
+          </w:p>
+        </w:tc>
+      </w:tr>
+      <w:tr>
+        <w:tc>
+          <w:tcPr>
+            <w:tcW w:type="dxa" w:w="680"/>
+          </w:tcPr>
+          <w:p>
+            <w:pPr>
+              <w:spacing w:before="30" w:after="30" w:line="252" w:lineRule="auto"/>
+            </w:pPr>
+            <w:r/>
+            <w:r>
+              <w:rPr>
+                <w:rFonts w:ascii="Segoe UI" w:hAnsi="Segoe UI" w:eastAsia="Segoe UI"/>
+                <w:b w:val="0"/>
+                <w:i w:val="0"/>
+                <w:color w:val="1B2630"/>
+                <w:sz w:val="15"/>
+              </w:rPr>
+              <w:t>27</w:t>
+            </w:r>
+          </w:p>
+        </w:tc>
+        <w:tc>
+          <w:tcPr>
+            <w:tcW w:type="dxa" w:w="2608"/>
+          </w:tcPr>
+          <w:p>
+            <w:pPr>
+              <w:spacing w:before="30" w:after="30" w:line="252" w:lineRule="auto"/>
+            </w:pPr>
+            <w:r/>
+            <w:r>
+              <w:rPr>
+                <w:rFonts w:ascii="Segoe UI" w:hAnsi="Segoe UI" w:eastAsia="Segoe UI"/>
+                <w:b w:val="0"/>
+                <w:i w:val="0"/>
+                <w:color w:val="1B2630"/>
+                <w:sz w:val="15"/>
+              </w:rPr>
+              <w:t>Teruggave MoveMonitor (UDI)</w:t>
+            </w:r>
+          </w:p>
+        </w:tc>
+        <w:tc>
+          <w:tcPr>
+            <w:tcW w:type="dxa" w:w="2948"/>
+          </w:tcPr>
+          <w:p>
+            <w:pPr>
+              <w:spacing w:before="30" w:after="30" w:line="252" w:lineRule="auto"/>
+            </w:pPr>
+            <w:r/>
+            <w:r>
+              <w:rPr>
+                <w:rFonts w:ascii="Segoe UI" w:hAnsi="Segoe UI" w:eastAsia="Segoe UI"/>
+                <w:b w:val="0"/>
+                <w:i w:val="0"/>
+                <w:color w:val="1B2630"/>
+                <w:sz w:val="15"/>
+              </w:rPr>
+              <w:t>e27_udi_movemonitor_retour</w:t>
+            </w:r>
+          </w:p>
+        </w:tc>
+        <w:tc>
+          <w:tcPr>
+            <w:tcW w:type="dxa" w:w="3628"/>
+          </w:tcPr>
+          <w:p>
+            <w:pPr>
+              <w:spacing w:before="30" w:after="30" w:line="252" w:lineRule="auto"/>
+            </w:pPr>
+            <w:r/>
+          </w:p>
+        </w:tc>
+      </w:tr>
+      <w:tr>
+        <w:tc>
+          <w:tcPr>
+            <w:tcW w:type="dxa" w:w="680"/>
+          </w:tcPr>
+          <w:p>
+            <w:pPr>
+              <w:spacing w:before="30" w:after="30" w:line="252" w:lineRule="auto"/>
+            </w:pPr>
+            <w:r/>
+            <w:r>
+              <w:rPr>
+                <w:rFonts w:ascii="Segoe UI" w:hAnsi="Segoe UI" w:eastAsia="Segoe UI"/>
+                <w:b w:val="0"/>
+                <w:i w:val="0"/>
+                <w:color w:val="1B2630"/>
+                <w:sz w:val="15"/>
+              </w:rPr>
+              <w:t>28</w:t>
+            </w:r>
+          </w:p>
+        </w:tc>
+        <w:tc>
+          <w:tcPr>
+            <w:tcW w:type="dxa" w:w="2608"/>
+          </w:tcPr>
+          <w:p>
+            <w:pPr>
+              <w:spacing w:before="30" w:after="30" w:line="252" w:lineRule="auto"/>
+            </w:pPr>
+            <w:r/>
+            <w:r>
+              <w:rPr>
+                <w:rFonts w:ascii="Segoe UI" w:hAnsi="Segoe UI" w:eastAsia="Segoe UI"/>
+                <w:b w:val="0"/>
+                <w:i w:val="0"/>
+                <w:color w:val="1B2630"/>
+                <w:sz w:val="15"/>
+              </w:rPr>
+              <w:t>Rapport activiteitenprofiel</w:t>
+            </w:r>
+          </w:p>
+        </w:tc>
+        <w:tc>
+          <w:tcPr>
+            <w:tcW w:type="dxa" w:w="2948"/>
+          </w:tcPr>
+          <w:p>
+            <w:pPr>
+              <w:spacing w:before="30" w:after="30" w:line="252" w:lineRule="auto"/>
+            </w:pPr>
+            <w:r/>
+            <w:r>
+              <w:rPr>
+                <w:rFonts w:ascii="Segoe UI" w:hAnsi="Segoe UI" w:eastAsia="Segoe UI"/>
+                <w:b w:val="0"/>
+                <w:i w:val="0"/>
+                <w:color w:val="1B2630"/>
+                <w:sz w:val="15"/>
+              </w:rPr>
+              <w:t>e28_activiteitenprofiel</w:t>
+            </w:r>
+          </w:p>
+        </w:tc>
+        <w:tc>
+          <w:tcPr>
+            <w:tcW w:type="dxa" w:w="3628"/>
+          </w:tcPr>
+          <w:p>
+            <w:pPr>
+              <w:spacing w:before="30" w:after="30" w:line="252" w:lineRule="auto"/>
+            </w:pPr>
+            <w:r/>
+          </w:p>
+        </w:tc>
+      </w:tr>
+      <w:tr>
+        <w:tc>
+          <w:tcPr>
+            <w:tcW w:type="dxa" w:w="680"/>
+          </w:tcPr>
+          <w:p>
+            <w:pPr>
+              <w:spacing w:before="30" w:after="30" w:line="252" w:lineRule="auto"/>
+            </w:pPr>
+            <w:r/>
+            <w:r>
+              <w:rPr>
+                <w:rFonts w:ascii="Segoe UI" w:hAnsi="Segoe UI" w:eastAsia="Segoe UI"/>
+                <w:b w:val="0"/>
+                <w:i w:val="0"/>
+                <w:color w:val="1B2630"/>
+                <w:sz w:val="15"/>
+              </w:rPr>
+              <w:t>29</w:t>
+            </w:r>
+          </w:p>
+        </w:tc>
+        <w:tc>
+          <w:tcPr>
+            <w:tcW w:type="dxa" w:w="2608"/>
+          </w:tcPr>
+          <w:p>
+            <w:pPr>
+              <w:spacing w:before="30" w:after="30" w:line="252" w:lineRule="auto"/>
+            </w:pPr>
+            <w:r/>
+            <w:r>
+              <w:rPr>
+                <w:rFonts w:ascii="Segoe UI" w:hAnsi="Segoe UI" w:eastAsia="Segoe UI"/>
+                <w:b w:val="0"/>
+                <w:i w:val="0"/>
+                <w:color w:val="1B2630"/>
+                <w:sz w:val="15"/>
+              </w:rPr>
+              <w:t>Teach-back</w:t>
+            </w:r>
+          </w:p>
+        </w:tc>
+        <w:tc>
+          <w:tcPr>
+            <w:tcW w:type="dxa" w:w="2948"/>
+          </w:tcPr>
+          <w:p>
+            <w:pPr>
+              <w:spacing w:before="30" w:after="30" w:line="252" w:lineRule="auto"/>
+            </w:pPr>
+            <w:r/>
+            <w:r>
+              <w:rPr>
+                <w:rFonts w:ascii="Segoe UI" w:hAnsi="Segoe UI" w:eastAsia="Segoe UI"/>
+                <w:b w:val="0"/>
+                <w:i w:val="0"/>
+                <w:color w:val="1B2630"/>
+                <w:sz w:val="15"/>
+              </w:rPr>
+              <w:t>e29_teach_back</w:t>
+            </w:r>
+          </w:p>
+        </w:tc>
+        <w:tc>
+          <w:tcPr>
+            <w:tcW w:type="dxa" w:w="3628"/>
+          </w:tcPr>
+          <w:p>
+            <w:pPr>
+              <w:spacing w:before="30" w:after="30" w:line="252" w:lineRule="auto"/>
+            </w:pPr>
+            <w:r/>
+          </w:p>
+        </w:tc>
+      </w:tr>
+      <w:tr>
+        <w:tc>
+          <w:tcPr>
+            <w:tcW w:type="dxa" w:w="680"/>
+          </w:tcPr>
+          <w:p>
+            <w:pPr>
+              <w:spacing w:before="30" w:after="30" w:line="252" w:lineRule="auto"/>
+            </w:pPr>
+            <w:r/>
+            <w:r>
+              <w:rPr>
+                <w:rFonts w:ascii="Segoe UI" w:hAnsi="Segoe UI" w:eastAsia="Segoe UI"/>
+                <w:b w:val="0"/>
+                <w:i w:val="0"/>
+                <w:color w:val="1B2630"/>
+                <w:sz w:val="15"/>
+              </w:rPr>
+              <w:t>30</w:t>
+            </w:r>
+          </w:p>
+        </w:tc>
+        <w:tc>
+          <w:tcPr>
+            <w:tcW w:type="dxa" w:w="2608"/>
+          </w:tcPr>
+          <w:p>
+            <w:pPr>
+              <w:spacing w:before="30" w:after="30" w:line="252" w:lineRule="auto"/>
+            </w:pPr>
+            <w:r/>
+            <w:r>
+              <w:rPr>
+                <w:rFonts w:ascii="Segoe UI" w:hAnsi="Segoe UI" w:eastAsia="Segoe UI"/>
+                <w:b w:val="0"/>
+                <w:i w:val="0"/>
+                <w:color w:val="1B2630"/>
+                <w:sz w:val="15"/>
+              </w:rPr>
+              <w:t>Informatiefolder Orthotimer voor patiënt</w:t>
+            </w:r>
+          </w:p>
+        </w:tc>
+        <w:tc>
+          <w:tcPr>
+            <w:tcW w:type="dxa" w:w="2948"/>
+          </w:tcPr>
+          <w:p>
+            <w:pPr>
+              <w:spacing w:before="30" w:after="30" w:line="252" w:lineRule="auto"/>
+            </w:pPr>
+            <w:r/>
+            <w:r>
+              <w:rPr>
+                <w:rFonts w:ascii="Segoe UI" w:hAnsi="Segoe UI" w:eastAsia="Segoe UI"/>
+                <w:b w:val="0"/>
+                <w:i w:val="0"/>
+                <w:color w:val="1B2630"/>
+                <w:sz w:val="15"/>
+              </w:rPr>
+              <w:t>—</w:t>
+            </w:r>
+          </w:p>
+        </w:tc>
+        <w:tc>
+          <w:tcPr>
+            <w:tcW w:type="dxa" w:w="3628"/>
+          </w:tcPr>
+          <w:p>
+            <w:pPr>
+              <w:spacing w:before="30" w:after="30" w:line="252" w:lineRule="auto"/>
+            </w:pPr>
+            <w:r/>
+            <w:r>
+              <w:rPr>
+                <w:rFonts w:ascii="Segoe UI" w:hAnsi="Segoe UI" w:eastAsia="Segoe UI"/>
+                <w:b w:val="0"/>
+                <w:i w:val="0"/>
+                <w:color w:val="1B2630"/>
+                <w:sz w:val="15"/>
+              </w:rPr>
+              <w:t>Informatiefolder voor de patiënt. Geen datacaptatie.</w:t>
+            </w:r>
+          </w:p>
+        </w:tc>
+      </w:tr>
+      <w:tr>
+        <w:tc>
+          <w:tcPr>
+            <w:tcW w:type="dxa" w:w="680"/>
+          </w:tcPr>
+          <w:p>
+            <w:pPr>
+              <w:spacing w:before="30" w:after="30" w:line="252" w:lineRule="auto"/>
+            </w:pPr>
+            <w:r/>
+            <w:r>
+              <w:rPr>
+                <w:rFonts w:ascii="Segoe UI" w:hAnsi="Segoe UI" w:eastAsia="Segoe UI"/>
+                <w:b w:val="0"/>
+                <w:i w:val="0"/>
+                <w:color w:val="1B2630"/>
+                <w:sz w:val="15"/>
+              </w:rPr>
+              <w:t>31</w:t>
+            </w:r>
+          </w:p>
+        </w:tc>
+        <w:tc>
+          <w:tcPr>
+            <w:tcW w:type="dxa" w:w="2608"/>
+          </w:tcPr>
+          <w:p>
+            <w:pPr>
+              <w:spacing w:before="30" w:after="30" w:line="252" w:lineRule="auto"/>
+            </w:pPr>
+            <w:r/>
+            <w:r>
+              <w:rPr>
+                <w:rFonts w:ascii="Segoe UI" w:hAnsi="Segoe UI" w:eastAsia="Segoe UI"/>
+                <w:b w:val="0"/>
+                <w:i w:val="0"/>
+                <w:color w:val="1B2630"/>
+                <w:sz w:val="15"/>
+              </w:rPr>
+              <w:t>Bevraging therapietrouw schoeisel</w:t>
+            </w:r>
+          </w:p>
+        </w:tc>
+        <w:tc>
+          <w:tcPr>
+            <w:tcW w:type="dxa" w:w="2948"/>
+          </w:tcPr>
+          <w:p>
+            <w:pPr>
+              <w:spacing w:before="30" w:after="30" w:line="252" w:lineRule="auto"/>
+            </w:pPr>
+            <w:r/>
+            <w:r>
+              <w:rPr>
+                <w:rFonts w:ascii="Segoe UI" w:hAnsi="Segoe UI" w:eastAsia="Segoe UI"/>
+                <w:b w:val="0"/>
+                <w:i w:val="0"/>
+                <w:color w:val="1B2630"/>
+                <w:sz w:val="15"/>
+              </w:rPr>
+              <w:t>e31_therapietrouw</w:t>
+            </w:r>
+          </w:p>
+        </w:tc>
+        <w:tc>
+          <w:tcPr>
+            <w:tcW w:type="dxa" w:w="3628"/>
+          </w:tcPr>
+          <w:p>
+            <w:pPr>
+              <w:spacing w:before="30" w:after="30" w:line="252" w:lineRule="auto"/>
+            </w:pPr>
+            <w:r/>
+          </w:p>
+        </w:tc>
+      </w:tr>
+      <w:tr>
+        <w:tc>
+          <w:tcPr>
+            <w:tcW w:type="dxa" w:w="680"/>
+          </w:tcPr>
+          <w:p>
+            <w:pPr>
+              <w:spacing w:before="30" w:after="30" w:line="252" w:lineRule="auto"/>
+            </w:pPr>
+            <w:r/>
+            <w:r>
+              <w:rPr>
+                <w:rFonts w:ascii="Segoe UI" w:hAnsi="Segoe UI" w:eastAsia="Segoe UI"/>
+                <w:b w:val="0"/>
+                <w:i w:val="0"/>
+                <w:color w:val="1B2630"/>
+                <w:sz w:val="15"/>
+              </w:rPr>
+              <w:t>32</w:t>
+            </w:r>
+          </w:p>
+        </w:tc>
+        <w:tc>
+          <w:tcPr>
+            <w:tcW w:type="dxa" w:w="2608"/>
+          </w:tcPr>
+          <w:p>
+            <w:pPr>
+              <w:spacing w:before="30" w:after="30" w:line="252" w:lineRule="auto"/>
+            </w:pPr>
+            <w:r/>
+            <w:r>
+              <w:rPr>
+                <w:rFonts w:ascii="Segoe UI" w:hAnsi="Segoe UI" w:eastAsia="Segoe UI"/>
+                <w:b w:val="0"/>
+                <w:i w:val="0"/>
+                <w:color w:val="1B2630"/>
+                <w:sz w:val="15"/>
+              </w:rPr>
+              <w:t>Feedback over therapietrouw</w:t>
+            </w:r>
+          </w:p>
+        </w:tc>
+        <w:tc>
+          <w:tcPr>
+            <w:tcW w:type="dxa" w:w="2948"/>
+          </w:tcPr>
+          <w:p>
+            <w:pPr>
+              <w:spacing w:before="30" w:after="30" w:line="252" w:lineRule="auto"/>
+            </w:pPr>
+            <w:r/>
+            <w:r>
+              <w:rPr>
+                <w:rFonts w:ascii="Segoe UI" w:hAnsi="Segoe UI" w:eastAsia="Segoe UI"/>
+                <w:b w:val="0"/>
+                <w:i w:val="0"/>
+                <w:color w:val="1B2630"/>
+                <w:sz w:val="15"/>
+              </w:rPr>
+              <w:t>e32_feedback_therapietrouw</w:t>
+            </w:r>
+          </w:p>
+        </w:tc>
+        <w:tc>
+          <w:tcPr>
+            <w:tcW w:type="dxa" w:w="3628"/>
+          </w:tcPr>
+          <w:p>
+            <w:pPr>
+              <w:spacing w:before="30" w:after="30" w:line="252" w:lineRule="auto"/>
+            </w:pPr>
+            <w:r/>
+          </w:p>
+        </w:tc>
+      </w:tr>
+      <w:tr>
+        <w:tc>
+          <w:tcPr>
+            <w:tcW w:type="dxa" w:w="680"/>
+          </w:tcPr>
+          <w:p>
+            <w:pPr>
+              <w:spacing w:before="30" w:after="30" w:line="252" w:lineRule="auto"/>
+            </w:pPr>
+            <w:r/>
+            <w:r>
+              <w:rPr>
+                <w:rFonts w:ascii="Segoe UI" w:hAnsi="Segoe UI" w:eastAsia="Segoe UI"/>
+                <w:b w:val="0"/>
+                <w:i w:val="0"/>
+                <w:color w:val="1B2630"/>
+                <w:sz w:val="15"/>
+              </w:rPr>
+              <w:t>33</w:t>
+            </w:r>
+          </w:p>
+        </w:tc>
+        <w:tc>
+          <w:tcPr>
+            <w:tcW w:type="dxa" w:w="2608"/>
+          </w:tcPr>
+          <w:p>
+            <w:pPr>
+              <w:spacing w:before="30" w:after="30" w:line="252" w:lineRule="auto"/>
+            </w:pPr>
+            <w:r/>
+            <w:r>
+              <w:rPr>
+                <w:rFonts w:ascii="Segoe UI" w:hAnsi="Segoe UI" w:eastAsia="Segoe UI"/>
+                <w:b w:val="0"/>
+                <w:i w:val="0"/>
+                <w:color w:val="1B2630"/>
+                <w:sz w:val="15"/>
+              </w:rPr>
+              <w:t>Vervanging voetorthese of sensor</w:t>
+            </w:r>
+          </w:p>
+        </w:tc>
+        <w:tc>
+          <w:tcPr>
+            <w:tcW w:type="dxa" w:w="2948"/>
+          </w:tcPr>
+          <w:p>
+            <w:pPr>
+              <w:spacing w:before="30" w:after="30" w:line="252" w:lineRule="auto"/>
+            </w:pPr>
+            <w:r/>
+            <w:r>
+              <w:rPr>
+                <w:rFonts w:ascii="Segoe UI" w:hAnsi="Segoe UI" w:eastAsia="Segoe UI"/>
+                <w:b w:val="0"/>
+                <w:i w:val="0"/>
+                <w:color w:val="1B2630"/>
+                <w:sz w:val="15"/>
+              </w:rPr>
+              <w:t>e33_vervanging</w:t>
+            </w:r>
+          </w:p>
+        </w:tc>
+        <w:tc>
+          <w:tcPr>
+            <w:tcW w:type="dxa" w:w="3628"/>
+          </w:tcPr>
+          <w:p>
+            <w:pPr>
+              <w:spacing w:before="30" w:after="30" w:line="252" w:lineRule="auto"/>
+            </w:pPr>
+            <w:r/>
+          </w:p>
+        </w:tc>
+      </w:tr>
+      <w:tr>
+        <w:tc>
+          <w:tcPr>
+            <w:tcW w:type="dxa" w:w="680"/>
+          </w:tcPr>
+          <w:p>
+            <w:pPr>
+              <w:spacing w:before="30" w:after="30" w:line="252" w:lineRule="auto"/>
+            </w:pPr>
+            <w:r/>
+            <w:r>
+              <w:rPr>
+                <w:rFonts w:ascii="Segoe UI" w:hAnsi="Segoe UI" w:eastAsia="Segoe UI"/>
+                <w:b w:val="0"/>
+                <w:i w:val="0"/>
+                <w:color w:val="1B2630"/>
+                <w:sz w:val="15"/>
+              </w:rPr>
+              <w:t>34</w:t>
+            </w:r>
+          </w:p>
+        </w:tc>
+        <w:tc>
+          <w:tcPr>
+            <w:tcW w:type="dxa" w:w="2608"/>
+          </w:tcPr>
+          <w:p>
+            <w:pPr>
+              <w:spacing w:before="30" w:after="30" w:line="252" w:lineRule="auto"/>
+            </w:pPr>
+            <w:r/>
+            <w:r>
+              <w:rPr>
+                <w:rFonts w:ascii="Segoe UI" w:hAnsi="Segoe UI" w:eastAsia="Segoe UI"/>
+                <w:b w:val="0"/>
+                <w:i w:val="0"/>
+                <w:color w:val="1B2630"/>
+                <w:sz w:val="15"/>
+              </w:rPr>
+              <w:t>Handleiding en vragenlijst iMCQ</w:t>
+            </w:r>
+          </w:p>
+        </w:tc>
+        <w:tc>
+          <w:tcPr>
+            <w:tcW w:type="dxa" w:w="2948"/>
+          </w:tcPr>
+          <w:p>
+            <w:pPr>
+              <w:spacing w:before="30" w:after="30" w:line="252" w:lineRule="auto"/>
+            </w:pPr>
+            <w:r/>
+            <w:r>
+              <w:rPr>
+                <w:rFonts w:ascii="Segoe UI" w:hAnsi="Segoe UI" w:eastAsia="Segoe UI"/>
+                <w:b w:val="0"/>
+                <w:i w:val="0"/>
+                <w:color w:val="1B2630"/>
+                <w:sz w:val="15"/>
+              </w:rPr>
+              <w:t>—</w:t>
+            </w:r>
+          </w:p>
+        </w:tc>
+        <w:tc>
+          <w:tcPr>
+            <w:tcW w:type="dxa" w:w="3628"/>
+          </w:tcPr>
+          <w:p>
+            <w:pPr>
+              <w:spacing w:before="30" w:after="30" w:line="252" w:lineRule="auto"/>
+            </w:pPr>
+            <w:r/>
+            <w:r>
+              <w:rPr>
+                <w:rFonts w:ascii="Segoe UI" w:hAnsi="Segoe UI" w:eastAsia="Segoe UI"/>
+                <w:b w:val="0"/>
+                <w:i w:val="0"/>
+                <w:color w:val="1B2630"/>
+                <w:sz w:val="15"/>
+              </w:rPr>
+              <w:t>Handleiding bij de iMCQ. De vragenlijst zelf is 34b.</w:t>
+            </w:r>
+          </w:p>
+        </w:tc>
+      </w:tr>
+      <w:tr>
+        <w:tc>
+          <w:tcPr>
+            <w:tcW w:type="dxa" w:w="680"/>
+          </w:tcPr>
+          <w:p>
+            <w:pPr>
+              <w:spacing w:before="30" w:after="30" w:line="252" w:lineRule="auto"/>
+            </w:pPr>
+            <w:r/>
+            <w:r>
+              <w:rPr>
+                <w:rFonts w:ascii="Segoe UI" w:hAnsi="Segoe UI" w:eastAsia="Segoe UI"/>
+                <w:b w:val="0"/>
+                <w:i w:val="0"/>
+                <w:color w:val="1B2630"/>
+                <w:sz w:val="15"/>
+              </w:rPr>
+              <w:t>34b</w:t>
+            </w:r>
+          </w:p>
+        </w:tc>
+        <w:tc>
+          <w:tcPr>
+            <w:tcW w:type="dxa" w:w="2608"/>
+          </w:tcPr>
+          <w:p>
+            <w:pPr>
+              <w:spacing w:before="30" w:after="30" w:line="252" w:lineRule="auto"/>
+            </w:pPr>
+            <w:r/>
+            <w:r>
+              <w:rPr>
+                <w:rFonts w:ascii="Segoe UI" w:hAnsi="Segoe UI" w:eastAsia="Segoe UI"/>
+                <w:b w:val="0"/>
+                <w:i w:val="0"/>
+                <w:color w:val="1B2630"/>
+                <w:sz w:val="15"/>
+              </w:rPr>
+              <w:t>Handleiding en vragenlijst iMCQ</w:t>
+            </w:r>
+          </w:p>
+        </w:tc>
+        <w:tc>
+          <w:tcPr>
+            <w:tcW w:type="dxa" w:w="2948"/>
+          </w:tcPr>
+          <w:p>
+            <w:pPr>
+              <w:spacing w:before="30" w:after="30" w:line="252" w:lineRule="auto"/>
+            </w:pPr>
+            <w:r/>
+            <w:r>
+              <w:rPr>
+                <w:rFonts w:ascii="Segoe UI" w:hAnsi="Segoe UI" w:eastAsia="Segoe UI"/>
+                <w:b w:val="0"/>
+                <w:i w:val="0"/>
+                <w:color w:val="1B2630"/>
+                <w:sz w:val="15"/>
+              </w:rPr>
+              <w:t>e34_imcq</w:t>
+            </w:r>
+          </w:p>
+        </w:tc>
+        <w:tc>
+          <w:tcPr>
+            <w:tcW w:type="dxa" w:w="3628"/>
+          </w:tcPr>
+          <w:p>
+            <w:pPr>
+              <w:spacing w:before="30" w:after="30" w:line="252" w:lineRule="auto"/>
+            </w:pPr>
+            <w:r/>
+          </w:p>
+        </w:tc>
+      </w:tr>
+      <w:tr>
+        <w:tc>
+          <w:tcPr>
+            <w:tcW w:type="dxa" w:w="680"/>
+          </w:tcPr>
+          <w:p>
+            <w:pPr>
+              <w:spacing w:before="30" w:after="30" w:line="252" w:lineRule="auto"/>
+            </w:pPr>
+            <w:r/>
+            <w:r>
+              <w:rPr>
+                <w:rFonts w:ascii="Segoe UI" w:hAnsi="Segoe UI" w:eastAsia="Segoe UI"/>
+                <w:b w:val="0"/>
+                <w:i w:val="0"/>
+                <w:color w:val="1B2630"/>
+                <w:sz w:val="15"/>
+              </w:rPr>
+              <w:t>35</w:t>
+            </w:r>
+          </w:p>
+        </w:tc>
+        <w:tc>
+          <w:tcPr>
+            <w:tcW w:type="dxa" w:w="2608"/>
+          </w:tcPr>
+          <w:p>
+            <w:pPr>
+              <w:spacing w:before="30" w:after="30" w:line="252" w:lineRule="auto"/>
+            </w:pPr>
+            <w:r/>
+            <w:r>
+              <w:rPr>
+                <w:rFonts w:ascii="Segoe UI" w:hAnsi="Segoe UI" w:eastAsia="Segoe UI"/>
+                <w:b w:val="0"/>
+                <w:i w:val="0"/>
+                <w:color w:val="1B2630"/>
+                <w:sz w:val="15"/>
+              </w:rPr>
+              <w:t>Handleiding en vragenlijst iPCQ</w:t>
+            </w:r>
+          </w:p>
+        </w:tc>
+        <w:tc>
+          <w:tcPr>
+            <w:tcW w:type="dxa" w:w="2948"/>
+          </w:tcPr>
+          <w:p>
+            <w:pPr>
+              <w:spacing w:before="30" w:after="30" w:line="252" w:lineRule="auto"/>
+            </w:pPr>
+            <w:r/>
+            <w:r>
+              <w:rPr>
+                <w:rFonts w:ascii="Segoe UI" w:hAnsi="Segoe UI" w:eastAsia="Segoe UI"/>
+                <w:b w:val="0"/>
+                <w:i w:val="0"/>
+                <w:color w:val="1B2630"/>
+                <w:sz w:val="15"/>
+              </w:rPr>
+              <w:t>—</w:t>
+            </w:r>
+          </w:p>
+        </w:tc>
+        <w:tc>
+          <w:tcPr>
+            <w:tcW w:type="dxa" w:w="3628"/>
+          </w:tcPr>
+          <w:p>
+            <w:pPr>
+              <w:spacing w:before="30" w:after="30" w:line="252" w:lineRule="auto"/>
+            </w:pPr>
+            <w:r/>
+            <w:r>
+              <w:rPr>
+                <w:rFonts w:ascii="Segoe UI" w:hAnsi="Segoe UI" w:eastAsia="Segoe UI"/>
+                <w:b w:val="0"/>
+                <w:i w:val="0"/>
+                <w:color w:val="1B2630"/>
+                <w:sz w:val="15"/>
+              </w:rPr>
+              <w:t>Handleiding bij de iPCQ. De vragenlijst zelf is 35b.</w:t>
+            </w:r>
+          </w:p>
+        </w:tc>
+      </w:tr>
+      <w:tr>
+        <w:tc>
+          <w:tcPr>
+            <w:tcW w:type="dxa" w:w="680"/>
+          </w:tcPr>
+          <w:p>
+            <w:pPr>
+              <w:spacing w:before="30" w:after="30" w:line="252" w:lineRule="auto"/>
+            </w:pPr>
+            <w:r/>
+            <w:r>
+              <w:rPr>
+                <w:rFonts w:ascii="Segoe UI" w:hAnsi="Segoe UI" w:eastAsia="Segoe UI"/>
+                <w:b w:val="0"/>
+                <w:i w:val="0"/>
+                <w:color w:val="1B2630"/>
+                <w:sz w:val="15"/>
+              </w:rPr>
+              <w:t>35b</w:t>
+            </w:r>
+          </w:p>
+        </w:tc>
+        <w:tc>
+          <w:tcPr>
+            <w:tcW w:type="dxa" w:w="2608"/>
+          </w:tcPr>
+          <w:p>
+            <w:pPr>
+              <w:spacing w:before="30" w:after="30" w:line="252" w:lineRule="auto"/>
+            </w:pPr>
+            <w:r/>
+            <w:r>
+              <w:rPr>
+                <w:rFonts w:ascii="Segoe UI" w:hAnsi="Segoe UI" w:eastAsia="Segoe UI"/>
+                <w:b w:val="0"/>
+                <w:i w:val="0"/>
+                <w:color w:val="1B2630"/>
+                <w:sz w:val="15"/>
+              </w:rPr>
+              <w:t>Handleiding en vragenlijst iPCQ</w:t>
+            </w:r>
+          </w:p>
+        </w:tc>
+        <w:tc>
+          <w:tcPr>
+            <w:tcW w:type="dxa" w:w="2948"/>
+          </w:tcPr>
+          <w:p>
+            <w:pPr>
+              <w:spacing w:before="30" w:after="30" w:line="252" w:lineRule="auto"/>
+            </w:pPr>
+            <w:r/>
+            <w:r>
+              <w:rPr>
+                <w:rFonts w:ascii="Segoe UI" w:hAnsi="Segoe UI" w:eastAsia="Segoe UI"/>
+                <w:b w:val="0"/>
+                <w:i w:val="0"/>
+                <w:color w:val="1B2630"/>
+                <w:sz w:val="15"/>
+              </w:rPr>
+              <w:t>e35_ipcq</w:t>
+            </w:r>
+          </w:p>
+        </w:tc>
+        <w:tc>
+          <w:tcPr>
+            <w:tcW w:type="dxa" w:w="3628"/>
+          </w:tcPr>
+          <w:p>
+            <w:pPr>
+              <w:spacing w:before="30" w:after="30" w:line="252" w:lineRule="auto"/>
+            </w:pPr>
+            <w:r/>
+          </w:p>
+        </w:tc>
+      </w:tr>
+      <w:tr>
+        <w:tc>
+          <w:tcPr>
+            <w:tcW w:type="dxa" w:w="680"/>
+          </w:tcPr>
+          <w:p>
+            <w:pPr>
+              <w:spacing w:before="30" w:after="30" w:line="252" w:lineRule="auto"/>
+            </w:pPr>
+            <w:r/>
+            <w:r>
+              <w:rPr>
+                <w:rFonts w:ascii="Segoe UI" w:hAnsi="Segoe UI" w:eastAsia="Segoe UI"/>
+                <w:b w:val="0"/>
+                <w:i w:val="0"/>
+                <w:color w:val="1B2630"/>
+                <w:sz w:val="15"/>
+              </w:rPr>
+              <w:t>36</w:t>
+            </w:r>
+          </w:p>
+        </w:tc>
+        <w:tc>
+          <w:tcPr>
+            <w:tcW w:type="dxa" w:w="2608"/>
+          </w:tcPr>
+          <w:p>
+            <w:pPr>
+              <w:spacing w:before="30" w:after="30" w:line="252" w:lineRule="auto"/>
+            </w:pPr>
+            <w:r/>
+            <w:r>
+              <w:rPr>
+                <w:rFonts w:ascii="Segoe UI" w:hAnsi="Segoe UI" w:eastAsia="Segoe UI"/>
+                <w:b w:val="0"/>
+                <w:i w:val="0"/>
+                <w:color w:val="1B2630"/>
+                <w:sz w:val="15"/>
+              </w:rPr>
+              <w:t>Classificatie ulcus (PEDIS)</w:t>
+            </w:r>
+          </w:p>
+        </w:tc>
+        <w:tc>
+          <w:tcPr>
+            <w:tcW w:type="dxa" w:w="2948"/>
+          </w:tcPr>
+          <w:p>
+            <w:pPr>
+              <w:spacing w:before="30" w:after="30" w:line="252" w:lineRule="auto"/>
+            </w:pPr>
+            <w:r/>
+            <w:r>
+              <w:rPr>
+                <w:rFonts w:ascii="Segoe UI" w:hAnsi="Segoe UI" w:eastAsia="Segoe UI"/>
+                <w:b w:val="0"/>
+                <w:i w:val="0"/>
+                <w:color w:val="1B2630"/>
+                <w:sz w:val="15"/>
+              </w:rPr>
+              <w:t>e36_pedis</w:t>
+            </w:r>
+          </w:p>
+        </w:tc>
+        <w:tc>
+          <w:tcPr>
+            <w:tcW w:type="dxa" w:w="3628"/>
+          </w:tcPr>
+          <w:p>
+            <w:pPr>
+              <w:spacing w:before="30" w:after="30" w:line="252" w:lineRule="auto"/>
+            </w:pPr>
+            <w:r/>
+          </w:p>
+        </w:tc>
+      </w:tr>
+      <w:tr>
+        <w:tc>
+          <w:tcPr>
+            <w:tcW w:type="dxa" w:w="680"/>
+          </w:tcPr>
+          <w:p>
+            <w:pPr>
+              <w:spacing w:before="30" w:after="30" w:line="252" w:lineRule="auto"/>
+            </w:pPr>
+            <w:r/>
+            <w:r>
+              <w:rPr>
+                <w:rFonts w:ascii="Segoe UI" w:hAnsi="Segoe UI" w:eastAsia="Segoe UI"/>
+                <w:b w:val="0"/>
+                <w:i w:val="0"/>
+                <w:color w:val="1B2630"/>
+                <w:sz w:val="15"/>
+              </w:rPr>
+              <w:t>38</w:t>
+            </w:r>
+          </w:p>
+        </w:tc>
+        <w:tc>
+          <w:tcPr>
+            <w:tcW w:type="dxa" w:w="2608"/>
+          </w:tcPr>
+          <w:p>
+            <w:pPr>
+              <w:spacing w:before="30" w:after="30" w:line="252" w:lineRule="auto"/>
+            </w:pPr>
+            <w:r/>
+            <w:r>
+              <w:rPr>
+                <w:rFonts w:ascii="Segoe UI" w:hAnsi="Segoe UI" w:eastAsia="Segoe UI"/>
+                <w:b w:val="0"/>
+                <w:i w:val="0"/>
+                <w:color w:val="1B2630"/>
+                <w:sz w:val="15"/>
+              </w:rPr>
+              <w:t>Classificatie ulcus (WIfI)</w:t>
+            </w:r>
+          </w:p>
+        </w:tc>
+        <w:tc>
+          <w:tcPr>
+            <w:tcW w:type="dxa" w:w="2948"/>
+          </w:tcPr>
+          <w:p>
+            <w:pPr>
+              <w:spacing w:before="30" w:after="30" w:line="252" w:lineRule="auto"/>
+            </w:pPr>
+            <w:r/>
+            <w:r>
+              <w:rPr>
+                <w:rFonts w:ascii="Segoe UI" w:hAnsi="Segoe UI" w:eastAsia="Segoe UI"/>
+                <w:b w:val="0"/>
+                <w:i w:val="0"/>
+                <w:color w:val="1B2630"/>
+                <w:sz w:val="15"/>
+              </w:rPr>
+              <w:t>e38_wifi</w:t>
+            </w:r>
+          </w:p>
+        </w:tc>
+        <w:tc>
+          <w:tcPr>
+            <w:tcW w:type="dxa" w:w="3628"/>
+          </w:tcPr>
+          <w:p>
+            <w:pPr>
+              <w:spacing w:before="30" w:after="30" w:line="252" w:lineRule="auto"/>
+            </w:pPr>
+            <w:r/>
+          </w:p>
+        </w:tc>
+      </w:tr>
+      <w:tr>
+        <w:tc>
+          <w:tcPr>
+            <w:tcW w:type="dxa" w:w="680"/>
+          </w:tcPr>
+          <w:p>
+            <w:pPr>
+              <w:spacing w:before="30" w:after="30" w:line="252" w:lineRule="auto"/>
+            </w:pPr>
+            <w:r/>
+            <w:r>
+              <w:rPr>
+                <w:rFonts w:ascii="Segoe UI" w:hAnsi="Segoe UI" w:eastAsia="Segoe UI"/>
+                <w:b w:val="0"/>
+                <w:i w:val="0"/>
+                <w:color w:val="1B2630"/>
+                <w:sz w:val="15"/>
+              </w:rPr>
+              <w:t>39</w:t>
+            </w:r>
+          </w:p>
+        </w:tc>
+        <w:tc>
+          <w:tcPr>
+            <w:tcW w:type="dxa" w:w="2608"/>
+          </w:tcPr>
+          <w:p>
+            <w:pPr>
+              <w:spacing w:before="30" w:after="30" w:line="252" w:lineRule="auto"/>
+            </w:pPr>
+            <w:r/>
+            <w:r>
+              <w:rPr>
+                <w:rFonts w:ascii="Segoe UI" w:hAnsi="Segoe UI" w:eastAsia="Segoe UI"/>
+                <w:b w:val="0"/>
+                <w:i w:val="0"/>
+                <w:color w:val="1B2630"/>
+                <w:sz w:val="15"/>
+              </w:rPr>
+              <w:t>Protocol procesevaluatie</w:t>
+            </w:r>
+          </w:p>
+        </w:tc>
+        <w:tc>
+          <w:tcPr>
+            <w:tcW w:type="dxa" w:w="2948"/>
+          </w:tcPr>
+          <w:p>
+            <w:pPr>
+              <w:spacing w:before="30" w:after="30" w:line="252" w:lineRule="auto"/>
+            </w:pPr>
+            <w:r/>
+            <w:r>
+              <w:rPr>
+                <w:rFonts w:ascii="Segoe UI" w:hAnsi="Segoe UI" w:eastAsia="Segoe UI"/>
+                <w:b w:val="0"/>
+                <w:i w:val="0"/>
+                <w:color w:val="1B2630"/>
+                <w:sz w:val="15"/>
+              </w:rPr>
+              <w:t>—</w:t>
+            </w:r>
+          </w:p>
+        </w:tc>
+        <w:tc>
+          <w:tcPr>
+            <w:tcW w:type="dxa" w:w="3628"/>
+          </w:tcPr>
+          <w:p>
+            <w:pPr>
+              <w:spacing w:before="30" w:after="30" w:line="252" w:lineRule="auto"/>
+            </w:pPr>
+            <w:r/>
+            <w:r>
+              <w:rPr>
+                <w:rFonts w:ascii="Segoe UI" w:hAnsi="Segoe UI" w:eastAsia="Segoe UI"/>
+                <w:b w:val="0"/>
+                <w:i w:val="0"/>
+                <w:color w:val="1B2630"/>
+                <w:sz w:val="15"/>
+              </w:rPr>
+              <w:t>Procesevaluatie. Ander project, andere levenscyclus.</w:t>
+            </w:r>
+          </w:p>
+        </w:tc>
+      </w:tr>
+      <w:tr>
+        <w:tc>
+          <w:tcPr>
+            <w:tcW w:type="dxa" w:w="680"/>
+          </w:tcPr>
+          <w:p>
+            <w:pPr>
+              <w:spacing w:before="30" w:after="30" w:line="252" w:lineRule="auto"/>
+            </w:pPr>
+            <w:r/>
+            <w:r>
+              <w:rPr>
+                <w:rFonts w:ascii="Segoe UI" w:hAnsi="Segoe UI" w:eastAsia="Segoe UI"/>
+                <w:b w:val="0"/>
+                <w:i w:val="0"/>
+                <w:color w:val="1B2630"/>
+                <w:sz w:val="15"/>
+              </w:rPr>
+              <w:t>40</w:t>
+            </w:r>
+          </w:p>
+        </w:tc>
+        <w:tc>
+          <w:tcPr>
+            <w:tcW w:type="dxa" w:w="2608"/>
+          </w:tcPr>
+          <w:p>
+            <w:pPr>
+              <w:spacing w:before="30" w:after="30" w:line="252" w:lineRule="auto"/>
+            </w:pPr>
+            <w:r/>
+            <w:r>
+              <w:rPr>
+                <w:rFonts w:ascii="Segoe UI" w:hAnsi="Segoe UI" w:eastAsia="Segoe UI"/>
+                <w:b w:val="0"/>
+                <w:i w:val="0"/>
+                <w:color w:val="1B2630"/>
+                <w:sz w:val="15"/>
+              </w:rPr>
+              <w:t>Gestructureerd dagboek therapeut</w:t>
+            </w:r>
+          </w:p>
+        </w:tc>
+        <w:tc>
+          <w:tcPr>
+            <w:tcW w:type="dxa" w:w="2948"/>
+          </w:tcPr>
+          <w:p>
+            <w:pPr>
+              <w:spacing w:before="30" w:after="30" w:line="252" w:lineRule="auto"/>
+            </w:pPr>
+            <w:r/>
+            <w:r>
+              <w:rPr>
+                <w:rFonts w:ascii="Segoe UI" w:hAnsi="Segoe UI" w:eastAsia="Segoe UI"/>
+                <w:b w:val="0"/>
+                <w:i w:val="0"/>
+                <w:color w:val="1B2630"/>
+                <w:sz w:val="15"/>
+              </w:rPr>
+              <w:t>—</w:t>
+            </w:r>
+          </w:p>
+        </w:tc>
+        <w:tc>
+          <w:tcPr>
+            <w:tcW w:type="dxa" w:w="3628"/>
+          </w:tcPr>
+          <w:p>
+            <w:pPr>
+              <w:spacing w:before="30" w:after="30" w:line="252" w:lineRule="auto"/>
+            </w:pPr>
+            <w:r/>
+            <w:r>
+              <w:rPr>
+                <w:rFonts w:ascii="Segoe UI" w:hAnsi="Segoe UI" w:eastAsia="Segoe UI"/>
+                <w:b w:val="0"/>
+                <w:i w:val="0"/>
+                <w:color w:val="1B2630"/>
+                <w:sz w:val="15"/>
+              </w:rPr>
+              <w:t>Procesevaluatie.</w:t>
+            </w:r>
+          </w:p>
+        </w:tc>
+      </w:tr>
+      <w:tr>
+        <w:tc>
+          <w:tcPr>
+            <w:tcW w:type="dxa" w:w="680"/>
+          </w:tcPr>
+          <w:p>
+            <w:pPr>
+              <w:spacing w:before="30" w:after="30" w:line="252" w:lineRule="auto"/>
+            </w:pPr>
+            <w:r/>
+            <w:r>
+              <w:rPr>
+                <w:rFonts w:ascii="Segoe UI" w:hAnsi="Segoe UI" w:eastAsia="Segoe UI"/>
+                <w:b w:val="0"/>
+                <w:i w:val="0"/>
+                <w:color w:val="1B2630"/>
+                <w:sz w:val="15"/>
+              </w:rPr>
+              <w:t>41</w:t>
+            </w:r>
+          </w:p>
+        </w:tc>
+        <w:tc>
+          <w:tcPr>
+            <w:tcW w:type="dxa" w:w="2608"/>
+          </w:tcPr>
+          <w:p>
+            <w:pPr>
+              <w:spacing w:before="30" w:after="30" w:line="252" w:lineRule="auto"/>
+            </w:pPr>
+            <w:r/>
+            <w:r>
+              <w:rPr>
+                <w:rFonts w:ascii="Segoe UI" w:hAnsi="Segoe UI" w:eastAsia="Segoe UI"/>
+                <w:b w:val="0"/>
+                <w:i w:val="0"/>
+                <w:color w:val="1B2630"/>
+                <w:sz w:val="15"/>
+              </w:rPr>
+              <w:t>Interviewgidsen patiënt, therapeut, manageme</w:t>
+            </w:r>
+          </w:p>
+        </w:tc>
+        <w:tc>
+          <w:tcPr>
+            <w:tcW w:type="dxa" w:w="2948"/>
+          </w:tcPr>
+          <w:p>
+            <w:pPr>
+              <w:spacing w:before="30" w:after="30" w:line="252" w:lineRule="auto"/>
+            </w:pPr>
+            <w:r/>
+            <w:r>
+              <w:rPr>
+                <w:rFonts w:ascii="Segoe UI" w:hAnsi="Segoe UI" w:eastAsia="Segoe UI"/>
+                <w:b w:val="0"/>
+                <w:i w:val="0"/>
+                <w:color w:val="1B2630"/>
+                <w:sz w:val="15"/>
+              </w:rPr>
+              <w:t>—</w:t>
+            </w:r>
+          </w:p>
+        </w:tc>
+        <w:tc>
+          <w:tcPr>
+            <w:tcW w:type="dxa" w:w="3628"/>
+          </w:tcPr>
+          <w:p>
+            <w:pPr>
+              <w:spacing w:before="30" w:after="30" w:line="252" w:lineRule="auto"/>
+            </w:pPr>
+            <w:r/>
+            <w:r>
+              <w:rPr>
+                <w:rFonts w:ascii="Segoe UI" w:hAnsi="Segoe UI" w:eastAsia="Segoe UI"/>
+                <w:b w:val="0"/>
+                <w:i w:val="0"/>
+                <w:color w:val="1B2630"/>
+                <w:sz w:val="15"/>
+              </w:rPr>
+              <w:t>Procesevaluatie.</w:t>
+            </w:r>
+          </w:p>
+        </w:tc>
+      </w:tr>
+      <w:tr>
+        <w:tc>
+          <w:tcPr>
+            <w:tcW w:type="dxa" w:w="680"/>
+          </w:tcPr>
+          <w:p>
+            <w:pPr>
+              <w:spacing w:before="30" w:after="30" w:line="252" w:lineRule="auto"/>
+            </w:pPr>
+            <w:r/>
+            <w:r>
+              <w:rPr>
+                <w:rFonts w:ascii="Segoe UI" w:hAnsi="Segoe UI" w:eastAsia="Segoe UI"/>
+                <w:b w:val="0"/>
+                <w:i w:val="0"/>
+                <w:color w:val="1B2630"/>
+                <w:sz w:val="15"/>
+              </w:rPr>
+              <w:t>42</w:t>
+            </w:r>
+          </w:p>
+        </w:tc>
+        <w:tc>
+          <w:tcPr>
+            <w:tcW w:type="dxa" w:w="2608"/>
+          </w:tcPr>
+          <w:p>
+            <w:pPr>
+              <w:spacing w:before="30" w:after="30" w:line="252" w:lineRule="auto"/>
+            </w:pPr>
+            <w:r/>
+            <w:r>
+              <w:rPr>
+                <w:rFonts w:ascii="Segoe UI" w:hAnsi="Segoe UI" w:eastAsia="Segoe UI"/>
+                <w:b w:val="0"/>
+                <w:i w:val="0"/>
+                <w:color w:val="1B2630"/>
+                <w:sz w:val="15"/>
+              </w:rPr>
+              <w:t>Interviewgidsen patiënt, therapeut, manageme</w:t>
+            </w:r>
+          </w:p>
+        </w:tc>
+        <w:tc>
+          <w:tcPr>
+            <w:tcW w:type="dxa" w:w="2948"/>
+          </w:tcPr>
+          <w:p>
+            <w:pPr>
+              <w:spacing w:before="30" w:after="30" w:line="252" w:lineRule="auto"/>
+            </w:pPr>
+            <w:r/>
+            <w:r>
+              <w:rPr>
+                <w:rFonts w:ascii="Segoe UI" w:hAnsi="Segoe UI" w:eastAsia="Segoe UI"/>
+                <w:b w:val="0"/>
+                <w:i w:val="0"/>
+                <w:color w:val="1B2630"/>
+                <w:sz w:val="15"/>
+              </w:rPr>
+              <w:t>—</w:t>
+            </w:r>
+          </w:p>
+        </w:tc>
+        <w:tc>
+          <w:tcPr>
+            <w:tcW w:type="dxa" w:w="3628"/>
+          </w:tcPr>
+          <w:p>
+            <w:pPr>
+              <w:spacing w:before="30" w:after="30" w:line="252" w:lineRule="auto"/>
+            </w:pPr>
+            <w:r/>
+            <w:r>
+              <w:rPr>
+                <w:rFonts w:ascii="Segoe UI" w:hAnsi="Segoe UI" w:eastAsia="Segoe UI"/>
+                <w:b w:val="0"/>
+                <w:i w:val="0"/>
+                <w:color w:val="1B2630"/>
+                <w:sz w:val="15"/>
+              </w:rPr>
+              <w:t>Procesevaluatie.</w:t>
+            </w:r>
+          </w:p>
+        </w:tc>
+      </w:tr>
+      <w:tr>
+        <w:tc>
+          <w:tcPr>
+            <w:tcW w:type="dxa" w:w="680"/>
+          </w:tcPr>
+          <w:p>
+            <w:pPr>
+              <w:spacing w:before="30" w:after="30" w:line="252" w:lineRule="auto"/>
+            </w:pPr>
+            <w:r/>
+            <w:r>
+              <w:rPr>
+                <w:rFonts w:ascii="Segoe UI" w:hAnsi="Segoe UI" w:eastAsia="Segoe UI"/>
+                <w:b w:val="0"/>
+                <w:i w:val="0"/>
+                <w:color w:val="1B2630"/>
+                <w:sz w:val="15"/>
+              </w:rPr>
+              <w:t>43</w:t>
+            </w:r>
+          </w:p>
+        </w:tc>
+        <w:tc>
+          <w:tcPr>
+            <w:tcW w:type="dxa" w:w="2608"/>
+          </w:tcPr>
+          <w:p>
+            <w:pPr>
+              <w:spacing w:before="30" w:after="30" w:line="252" w:lineRule="auto"/>
+            </w:pPr>
+            <w:r/>
+            <w:r>
+              <w:rPr>
+                <w:rFonts w:ascii="Segoe UI" w:hAnsi="Segoe UI" w:eastAsia="Segoe UI"/>
+                <w:b w:val="0"/>
+                <w:i w:val="0"/>
+                <w:color w:val="1B2630"/>
+                <w:sz w:val="15"/>
+              </w:rPr>
+              <w:t>Interviewgidsen patiënt, therapeut, manageme</w:t>
+            </w:r>
+          </w:p>
+        </w:tc>
+        <w:tc>
+          <w:tcPr>
+            <w:tcW w:type="dxa" w:w="2948"/>
+          </w:tcPr>
+          <w:p>
+            <w:pPr>
+              <w:spacing w:before="30" w:after="30" w:line="252" w:lineRule="auto"/>
+            </w:pPr>
+            <w:r/>
+            <w:r>
+              <w:rPr>
+                <w:rFonts w:ascii="Segoe UI" w:hAnsi="Segoe UI" w:eastAsia="Segoe UI"/>
+                <w:b w:val="0"/>
+                <w:i w:val="0"/>
+                <w:color w:val="1B2630"/>
+                <w:sz w:val="15"/>
+              </w:rPr>
+              <w:t>—</w:t>
+            </w:r>
+          </w:p>
+        </w:tc>
+        <w:tc>
+          <w:tcPr>
+            <w:tcW w:type="dxa" w:w="3628"/>
+          </w:tcPr>
+          <w:p>
+            <w:pPr>
+              <w:spacing w:before="30" w:after="30" w:line="252" w:lineRule="auto"/>
+            </w:pPr>
+            <w:r/>
+            <w:r>
+              <w:rPr>
+                <w:rFonts w:ascii="Segoe UI" w:hAnsi="Segoe UI" w:eastAsia="Segoe UI"/>
+                <w:b w:val="0"/>
+                <w:i w:val="0"/>
+                <w:color w:val="1B2630"/>
+                <w:sz w:val="15"/>
+              </w:rPr>
+              <w:t>Procesevaluatie.</w:t>
+            </w:r>
+          </w:p>
+        </w:tc>
+      </w:tr>
+      <w:tr>
+        <w:tc>
+          <w:tcPr>
+            <w:tcW w:type="dxa" w:w="680"/>
+          </w:tcPr>
+          <w:p>
+            <w:pPr>
+              <w:spacing w:before="30" w:after="30" w:line="252" w:lineRule="auto"/>
+            </w:pPr>
+            <w:r/>
+            <w:r>
+              <w:rPr>
+                <w:rFonts w:ascii="Segoe UI" w:hAnsi="Segoe UI" w:eastAsia="Segoe UI"/>
+                <w:b w:val="0"/>
+                <w:i w:val="0"/>
+                <w:color w:val="1B2630"/>
+                <w:sz w:val="15"/>
+              </w:rPr>
+              <w:t>44</w:t>
+            </w:r>
+          </w:p>
+        </w:tc>
+        <w:tc>
+          <w:tcPr>
+            <w:tcW w:type="dxa" w:w="2608"/>
+          </w:tcPr>
+          <w:p>
+            <w:pPr>
+              <w:spacing w:before="30" w:after="30" w:line="252" w:lineRule="auto"/>
+            </w:pPr>
+            <w:r/>
+            <w:r>
+              <w:rPr>
+                <w:rFonts w:ascii="Segoe UI" w:hAnsi="Segoe UI" w:eastAsia="Segoe UI"/>
+                <w:b w:val="0"/>
+                <w:i w:val="0"/>
+                <w:color w:val="1B2630"/>
+                <w:sz w:val="15"/>
+              </w:rPr>
+              <w:t>Fidelity checklist SEBIA</w:t>
+            </w:r>
+          </w:p>
+        </w:tc>
+        <w:tc>
+          <w:tcPr>
+            <w:tcW w:type="dxa" w:w="2948"/>
+          </w:tcPr>
+          <w:p>
+            <w:pPr>
+              <w:spacing w:before="30" w:after="30" w:line="252" w:lineRule="auto"/>
+            </w:pPr>
+            <w:r/>
+            <w:r>
+              <w:rPr>
+                <w:rFonts w:ascii="Segoe UI" w:hAnsi="Segoe UI" w:eastAsia="Segoe UI"/>
+                <w:b w:val="0"/>
+                <w:i w:val="0"/>
+                <w:color w:val="1B2630"/>
+                <w:sz w:val="15"/>
+              </w:rPr>
+              <w:t>—</w:t>
+            </w:r>
+          </w:p>
+        </w:tc>
+        <w:tc>
+          <w:tcPr>
+            <w:tcW w:type="dxa" w:w="3628"/>
+          </w:tcPr>
+          <w:p>
+            <w:pPr>
+              <w:spacing w:before="30" w:after="30" w:line="252" w:lineRule="auto"/>
+            </w:pPr>
+            <w:r/>
+            <w:r>
+              <w:rPr>
+                <w:rFonts w:ascii="Segoe UI" w:hAnsi="Segoe UI" w:eastAsia="Segoe UI"/>
+                <w:b w:val="0"/>
+                <w:i w:val="0"/>
+                <w:color w:val="1B2630"/>
+                <w:sz w:val="15"/>
+              </w:rPr>
+              <w:t>Procesevaluatie.</w:t>
+            </w:r>
+          </w:p>
+        </w:tc>
+      </w:tr>
+      <w:tr>
+        <w:tc>
+          <w:tcPr>
+            <w:tcW w:type="dxa" w:w="680"/>
+          </w:tcPr>
+          <w:p>
+            <w:pPr>
+              <w:spacing w:before="30" w:after="30" w:line="252" w:lineRule="auto"/>
+            </w:pPr>
+            <w:r/>
+            <w:r>
+              <w:rPr>
+                <w:rFonts w:ascii="Segoe UI" w:hAnsi="Segoe UI" w:eastAsia="Segoe UI"/>
+                <w:b w:val="0"/>
+                <w:i w:val="0"/>
+                <w:color w:val="1B2630"/>
+                <w:sz w:val="15"/>
+              </w:rPr>
+              <w:t>45</w:t>
+            </w:r>
+          </w:p>
+        </w:tc>
+        <w:tc>
+          <w:tcPr>
+            <w:tcW w:type="dxa" w:w="2608"/>
+          </w:tcPr>
+          <w:p>
+            <w:pPr>
+              <w:spacing w:before="30" w:after="30" w:line="252" w:lineRule="auto"/>
+            </w:pPr>
+            <w:r/>
+            <w:r>
+              <w:rPr>
+                <w:rFonts w:ascii="Segoe UI" w:hAnsi="Segoe UI" w:eastAsia="Segoe UI"/>
+                <w:b w:val="0"/>
+                <w:i w:val="0"/>
+                <w:color w:val="1B2630"/>
+                <w:sz w:val="15"/>
+              </w:rPr>
+              <w:t>Gezondheidseconomisch dagboek</w:t>
+            </w:r>
+          </w:p>
+        </w:tc>
+        <w:tc>
+          <w:tcPr>
+            <w:tcW w:type="dxa" w:w="2948"/>
+          </w:tcPr>
+          <w:p>
+            <w:pPr>
+              <w:spacing w:before="30" w:after="30" w:line="252" w:lineRule="auto"/>
+            </w:pPr>
+            <w:r/>
+            <w:r>
+              <w:rPr>
+                <w:rFonts w:ascii="Segoe UI" w:hAnsi="Segoe UI" w:eastAsia="Segoe UI"/>
+                <w:b w:val="0"/>
+                <w:i w:val="0"/>
+                <w:color w:val="1B2630"/>
+                <w:sz w:val="15"/>
+              </w:rPr>
+              <w:t>e45_dagboek_baseline</w:t>
+            </w:r>
+          </w:p>
+        </w:tc>
+        <w:tc>
+          <w:tcPr>
+            <w:tcW w:type="dxa" w:w="3628"/>
+          </w:tcPr>
+          <w:p>
+            <w:pPr>
+              <w:spacing w:before="30" w:after="30" w:line="252" w:lineRule="auto"/>
+            </w:pPr>
+            <w:r/>
+          </w:p>
+        </w:tc>
+      </w:tr>
+      <w:tr>
+        <w:tc>
+          <w:tcPr>
+            <w:tcW w:type="dxa" w:w="680"/>
+          </w:tcPr>
+          <w:p>
+            <w:pPr>
+              <w:spacing w:before="30" w:after="30" w:line="252" w:lineRule="auto"/>
+            </w:pPr>
+            <w:r/>
+            <w:r>
+              <w:rPr>
+                <w:rFonts w:ascii="Segoe UI" w:hAnsi="Segoe UI" w:eastAsia="Segoe UI"/>
+                <w:b w:val="0"/>
+                <w:i w:val="0"/>
+                <w:color w:val="1B2630"/>
+                <w:sz w:val="15"/>
+              </w:rPr>
+              <w:t>45a</w:t>
+            </w:r>
+          </w:p>
+        </w:tc>
+        <w:tc>
+          <w:tcPr>
+            <w:tcW w:type="dxa" w:w="2608"/>
+          </w:tcPr>
+          <w:p>
+            <w:pPr>
+              <w:spacing w:before="30" w:after="30" w:line="252" w:lineRule="auto"/>
+            </w:pPr>
+            <w:r/>
+            <w:r>
+              <w:rPr>
+                <w:rFonts w:ascii="Segoe UI" w:hAnsi="Segoe UI" w:eastAsia="Segoe UI"/>
+                <w:b w:val="0"/>
+                <w:i w:val="0"/>
+                <w:color w:val="1B2630"/>
+                <w:sz w:val="15"/>
+              </w:rPr>
+              <w:t>Gezondheidseconomisch dagboek</w:t>
+            </w:r>
+          </w:p>
+        </w:tc>
+        <w:tc>
+          <w:tcPr>
+            <w:tcW w:type="dxa" w:w="2948"/>
+          </w:tcPr>
+          <w:p>
+            <w:pPr>
+              <w:spacing w:before="30" w:after="30" w:line="252" w:lineRule="auto"/>
+            </w:pPr>
+            <w:r/>
+            <w:r>
+              <w:rPr>
+                <w:rFonts w:ascii="Segoe UI" w:hAnsi="Segoe UI" w:eastAsia="Segoe UI"/>
+                <w:b w:val="0"/>
+                <w:i w:val="0"/>
+                <w:color w:val="1B2630"/>
+                <w:sz w:val="15"/>
+              </w:rPr>
+              <w:t>e45a_dagboek_2wk</w:t>
+            </w:r>
+          </w:p>
+        </w:tc>
+        <w:tc>
+          <w:tcPr>
+            <w:tcW w:type="dxa" w:w="3628"/>
+          </w:tcPr>
+          <w:p>
+            <w:pPr>
+              <w:spacing w:before="30" w:after="30" w:line="252" w:lineRule="auto"/>
+            </w:pPr>
+            <w:r/>
+          </w:p>
+        </w:tc>
+      </w:tr>
+      <w:tr>
+        <w:tc>
+          <w:tcPr>
+            <w:tcW w:type="dxa" w:w="680"/>
+          </w:tcPr>
+          <w:p>
+            <w:pPr>
+              <w:spacing w:before="30" w:after="30" w:line="252" w:lineRule="auto"/>
+            </w:pPr>
+            <w:r/>
+            <w:r>
+              <w:rPr>
+                <w:rFonts w:ascii="Segoe UI" w:hAnsi="Segoe UI" w:eastAsia="Segoe UI"/>
+                <w:b w:val="0"/>
+                <w:i w:val="0"/>
+                <w:color w:val="1B2630"/>
+                <w:sz w:val="15"/>
+              </w:rPr>
+              <w:t>45b</w:t>
+            </w:r>
+          </w:p>
+        </w:tc>
+        <w:tc>
+          <w:tcPr>
+            <w:tcW w:type="dxa" w:w="2608"/>
+          </w:tcPr>
+          <w:p>
+            <w:pPr>
+              <w:spacing w:before="30" w:after="30" w:line="252" w:lineRule="auto"/>
+            </w:pPr>
+            <w:r/>
+            <w:r>
+              <w:rPr>
+                <w:rFonts w:ascii="Segoe UI" w:hAnsi="Segoe UI" w:eastAsia="Segoe UI"/>
+                <w:b w:val="0"/>
+                <w:i w:val="0"/>
+                <w:color w:val="1B2630"/>
+                <w:sz w:val="15"/>
+              </w:rPr>
+              <w:t>Gezondheidseconomisch dagboek</w:t>
+            </w:r>
+          </w:p>
+        </w:tc>
+        <w:tc>
+          <w:tcPr>
+            <w:tcW w:type="dxa" w:w="2948"/>
+          </w:tcPr>
+          <w:p>
+            <w:pPr>
+              <w:spacing w:before="30" w:after="30" w:line="252" w:lineRule="auto"/>
+            </w:pPr>
+            <w:r/>
+            <w:r>
+              <w:rPr>
+                <w:rFonts w:ascii="Segoe UI" w:hAnsi="Segoe UI" w:eastAsia="Segoe UI"/>
+                <w:b w:val="0"/>
+                <w:i w:val="0"/>
+                <w:color w:val="1B2630"/>
+                <w:sz w:val="15"/>
+              </w:rPr>
+              <w:t>e45b_dagboek_3mnd</w:t>
+            </w:r>
+          </w:p>
+        </w:tc>
+        <w:tc>
+          <w:tcPr>
+            <w:tcW w:type="dxa" w:w="3628"/>
+          </w:tcPr>
+          <w:p>
+            <w:pPr>
+              <w:spacing w:before="30" w:after="30" w:line="252" w:lineRule="auto"/>
+            </w:pPr>
+            <w:r/>
+          </w:p>
+        </w:tc>
+      </w:tr>
+      <w:tr>
+        <w:tc>
+          <w:tcPr>
+            <w:tcW w:type="dxa" w:w="680"/>
+          </w:tcPr>
+          <w:p>
+            <w:pPr>
+              <w:spacing w:before="30" w:after="30" w:line="252" w:lineRule="auto"/>
+            </w:pPr>
+            <w:r/>
+            <w:r>
+              <w:rPr>
+                <w:rFonts w:ascii="Segoe UI" w:hAnsi="Segoe UI" w:eastAsia="Segoe UI"/>
+                <w:b w:val="0"/>
+                <w:i w:val="0"/>
+                <w:color w:val="1B2630"/>
+                <w:sz w:val="15"/>
+              </w:rPr>
+              <w:t>46</w:t>
+            </w:r>
+          </w:p>
+        </w:tc>
+        <w:tc>
+          <w:tcPr>
+            <w:tcW w:type="dxa" w:w="2608"/>
+          </w:tcPr>
+          <w:p>
+            <w:pPr>
+              <w:spacing w:before="30" w:after="30" w:line="252" w:lineRule="auto"/>
+            </w:pPr>
+            <w:r/>
+            <w:r>
+              <w:rPr>
+                <w:rFonts w:ascii="Segoe UI" w:hAnsi="Segoe UI" w:eastAsia="Segoe UI"/>
+                <w:b w:val="0"/>
+                <w:i w:val="0"/>
+                <w:color w:val="1B2630"/>
+                <w:sz w:val="15"/>
+              </w:rPr>
+              <w:t>AE/SAE Report Form</w:t>
+            </w:r>
+          </w:p>
+        </w:tc>
+        <w:tc>
+          <w:tcPr>
+            <w:tcW w:type="dxa" w:w="2948"/>
+          </w:tcPr>
+          <w:p>
+            <w:pPr>
+              <w:spacing w:before="30" w:after="30" w:line="252" w:lineRule="auto"/>
+            </w:pPr>
+            <w:r/>
+            <w:r>
+              <w:rPr>
+                <w:rFonts w:ascii="Segoe UI" w:hAnsi="Segoe UI" w:eastAsia="Segoe UI"/>
+                <w:b w:val="0"/>
+                <w:i w:val="0"/>
+                <w:color w:val="1B2630"/>
+                <w:sz w:val="15"/>
+              </w:rPr>
+              <w:t>e46_ae_sae</w:t>
+            </w:r>
+          </w:p>
+        </w:tc>
+        <w:tc>
+          <w:tcPr>
+            <w:tcW w:type="dxa" w:w="3628"/>
+          </w:tcPr>
+          <w:p>
+            <w:pPr>
+              <w:spacing w:before="30" w:after="30" w:line="252" w:lineRule="auto"/>
+            </w:pPr>
+            <w:r/>
+          </w:p>
+        </w:tc>
+      </w:tr>
+      <w:tr>
+        <w:tc>
+          <w:tcPr>
+            <w:tcW w:type="dxa" w:w="680"/>
+          </w:tcPr>
+          <w:p>
+            <w:pPr>
+              <w:spacing w:before="30" w:after="30" w:line="252" w:lineRule="auto"/>
+            </w:pPr>
+            <w:r/>
+            <w:r>
+              <w:rPr>
+                <w:rFonts w:ascii="Segoe UI" w:hAnsi="Segoe UI" w:eastAsia="Segoe UI"/>
+                <w:b w:val="0"/>
+                <w:i w:val="0"/>
+                <w:color w:val="1B2630"/>
+                <w:sz w:val="15"/>
+              </w:rPr>
+              <w:t>47</w:t>
+            </w:r>
+          </w:p>
+        </w:tc>
+        <w:tc>
+          <w:tcPr>
+            <w:tcW w:type="dxa" w:w="2608"/>
+          </w:tcPr>
+          <w:p>
+            <w:pPr>
+              <w:spacing w:before="30" w:after="30" w:line="252" w:lineRule="auto"/>
+            </w:pPr>
+            <w:r/>
+            <w:r>
+              <w:rPr>
+                <w:rFonts w:ascii="Segoe UI" w:hAnsi="Segoe UI" w:eastAsia="Segoe UI"/>
+                <w:b w:val="0"/>
+                <w:i w:val="0"/>
+                <w:color w:val="1B2630"/>
+                <w:sz w:val="15"/>
+              </w:rPr>
+              <w:t>Ulcus-vervolgformulier</w:t>
+            </w:r>
+          </w:p>
+        </w:tc>
+        <w:tc>
+          <w:tcPr>
+            <w:tcW w:type="dxa" w:w="2948"/>
+          </w:tcPr>
+          <w:p>
+            <w:pPr>
+              <w:spacing w:before="30" w:after="30" w:line="252" w:lineRule="auto"/>
+            </w:pPr>
+            <w:r/>
+            <w:r>
+              <w:rPr>
+                <w:rFonts w:ascii="Segoe UI" w:hAnsi="Segoe UI" w:eastAsia="Segoe UI"/>
+                <w:b w:val="0"/>
+                <w:i w:val="0"/>
+                <w:color w:val="1B2630"/>
+                <w:sz w:val="15"/>
+              </w:rPr>
+              <w:t>e47_ulcus_vervolg</w:t>
+            </w:r>
+          </w:p>
+        </w:tc>
+        <w:tc>
+          <w:tcPr>
+            <w:tcW w:type="dxa" w:w="3628"/>
+          </w:tcPr>
+          <w:p>
+            <w:pPr>
+              <w:spacing w:before="30" w:after="30" w:line="252" w:lineRule="auto"/>
+            </w:pPr>
+            <w:r/>
+          </w:p>
+        </w:tc>
+      </w:tr>
+      <w:tr>
+        <w:tc>
+          <w:tcPr>
+            <w:tcW w:type="dxa" w:w="680"/>
+          </w:tcPr>
+          <w:p>
+            <w:pPr>
+              <w:spacing w:before="30" w:after="30" w:line="252" w:lineRule="auto"/>
+            </w:pPr>
+            <w:r/>
+            <w:r>
+              <w:rPr>
+                <w:rFonts w:ascii="Segoe UI" w:hAnsi="Segoe UI" w:eastAsia="Segoe UI"/>
+                <w:b w:val="0"/>
+                <w:i w:val="0"/>
+                <w:color w:val="1B2630"/>
+                <w:sz w:val="15"/>
+              </w:rPr>
+              <w:t>48</w:t>
+            </w:r>
+          </w:p>
+        </w:tc>
+        <w:tc>
+          <w:tcPr>
+            <w:tcW w:type="dxa" w:w="2608"/>
+          </w:tcPr>
+          <w:p>
+            <w:pPr>
+              <w:spacing w:before="30" w:after="30" w:line="252" w:lineRule="auto"/>
+            </w:pPr>
+            <w:r/>
+            <w:r>
+              <w:rPr>
+                <w:rFonts w:ascii="Segoe UI" w:hAnsi="Segoe UI" w:eastAsia="Segoe UI"/>
+                <w:b w:val="0"/>
+                <w:i w:val="0"/>
+                <w:color w:val="1B2630"/>
+                <w:sz w:val="15"/>
+              </w:rPr>
+              <w:t>Voetzorgfolder voor de patiënt</w:t>
+            </w:r>
+          </w:p>
+        </w:tc>
+        <w:tc>
+          <w:tcPr>
+            <w:tcW w:type="dxa" w:w="2948"/>
+          </w:tcPr>
+          <w:p>
+            <w:pPr>
+              <w:spacing w:before="30" w:after="30" w:line="252" w:lineRule="auto"/>
+            </w:pPr>
+            <w:r/>
+            <w:r>
+              <w:rPr>
+                <w:rFonts w:ascii="Segoe UI" w:hAnsi="Segoe UI" w:eastAsia="Segoe UI"/>
+                <w:b w:val="0"/>
+                <w:i w:val="0"/>
+                <w:color w:val="1B2630"/>
+                <w:sz w:val="15"/>
+              </w:rPr>
+              <w:t>—</w:t>
+            </w:r>
+          </w:p>
+        </w:tc>
+        <w:tc>
+          <w:tcPr>
+            <w:tcW w:type="dxa" w:w="3628"/>
+          </w:tcPr>
+          <w:p>
+            <w:pPr>
+              <w:spacing w:before="30" w:after="30" w:line="252" w:lineRule="auto"/>
+            </w:pPr>
+            <w:r/>
+            <w:r>
+              <w:rPr>
+                <w:rFonts w:ascii="Segoe UI" w:hAnsi="Segoe UI" w:eastAsia="Segoe UI"/>
+                <w:b w:val="0"/>
+                <w:i w:val="0"/>
+                <w:color w:val="1B2630"/>
+                <w:sz w:val="15"/>
+              </w:rPr>
+              <w:t>Voetzorgfolder voor de patiënt. Geen datacaptatie.</w:t>
+            </w:r>
+          </w:p>
+        </w:tc>
+      </w:tr>
+    </w:tbl>
+    <w:p>
+      <w:pPr>
+        <w:spacing w:before="0" w:after="80"/>
+      </w:pPr>
+      <w:r>
+        <w:rPr>
+          <w:rFonts w:ascii="Segoe UI" w:hAnsi="Segoe UI" w:eastAsia="Segoe UI"/>
+          <w:b w:val="0"/>
+          <w:i w:val="0"/>
+          <w:color w:val="5A6A78"/>
+          <w:sz w:val="17"/>
+        </w:rPr>
+        <w:t>De nummers 11, 22 en 37 bestaan niet in de set; §12 vermeldt dat uitdrukkelijk. In REDCap staan daarnaast twee instrumenten zonder eCRF-nummer: randomisatie en einde_studie. Die leggen vast wat het protocol wel vraagt maar geen formulier voor heeft.</w:t>
       </w:r>
     </w:p>
     <w:p>

</xml_diff>

<commit_message>
REDCap: skelet-data dictionary, importeerbaar vandaag
data_dictionary_skelet.csv maakt de 36 instrumenten aan met per formulier een
datumveld, een invoerdersveld en een zichtbare markering dat de inhoud nog
volgt. 109 velden, record_id als eerste veld van het eerste instrument,
variabelenamen binnen de grens van 26 tekens.

Daarmee kan het skelet in REDCap staan voor de openstaande punten beslecht
zijn: instrumenten aanmaken en de mapping importeren hangt niet af van de
inhoud van de formulieren.

De gids beschrijft nu ook waarom een apart oefenproject niet nodig is: een
nieuw project staat in Development, waar alles mag tot Move to Production.
Opbouw uitgebreid van elf naar twaalf stappen.

Co-Authored-By: Claude Opus 5 <noreply@anthropic.com>
</commit_message>
<xml_diff>
--- a/REDCap/PARADISE_REDCap_opzet.docx
+++ b/REDCap/PARADISE_REDCap_opzet.docx
@@ -44,7 +44,7 @@
           <w:color w:val="5A6A78"/>
           <w:sz w:val="17"/>
         </w:rPr>
-        <w:t>Longitudinaal skelet: armen, events, instrumenten en de mapping daartussen. Gebouwd uit §9 van PARADISE_BRONNEN.md, het bezoekschema, en het eCRF-register in §12. Bij deze gids horen drie bestanden in dezelfde map: instrumenten.csv, events.csv en instrument_event_mapping.csv.</w:t>
+        <w:t>Longitudinaal skelet: armen, events, instrumenten en de mapping daartussen. Gebouwd uit §9 van PARADISE_BRONNEN.md, het bezoekschema, en het eCRF-register in §12. Bij deze gids horen vier bestanden in dezelfde map: instrumenten.csv, events.csv, instrument_event_mapping.csv en data_dictionary_skelet.csv.</w:t>
       </w:r>
     </w:p>
     <w:p>
@@ -3243,7 +3243,22 @@
           <w:color w:val="00407A"/>
           <w:sz w:val="22"/>
         </w:rPr>
-        <w:t>Volgorde van opbouw</w:t>
+        <w:t>Volgorde van opbouw, en waar je veilig fouten maakt</w:t>
+      </w:r>
+    </w:p>
+    <w:p>
+      <w:pPr>
+        <w:spacing w:before="0" w:after="80"/>
+      </w:pPr>
+      <w:r>
+        <w:rPr>
+          <w:rFonts w:ascii="Segoe UI" w:hAnsi="Segoe UI" w:eastAsia="Segoe UI"/>
+          <w:b w:val="0"/>
+          <w:i w:val="0"/>
+          <w:color w:val="1B2630"/>
+          <w:sz w:val="19"/>
+        </w:rPr>
+        <w:t>Een nieuw REDCap-project staat in **Development**-status, en dat is je testomgeving. Daar mag alles: velden toevoegen, verwijderen, van type veranderen, testrecords invoeren en weer wissen. Pas bij *Move to Production* gaan structurele wijzigingen via Draft Mode en goedkeuring. Je hebt dus geen apart oefenproject nodig — het echte project is de zandbak, tot jij beslist dat het dat niet meer is.</w:t>
       </w:r>
     </w:p>
     <w:tbl>
@@ -3373,7 +3388,7 @@
                 <w:color w:val="1B2630"/>
                 <w:sz w:val="15"/>
               </w:rPr>
-              <w:t>Project aanmaken als longitudinaal, met armen ingeschakeld.</w:t>
+              <w:t>Project aanmaken als longitudinaal, met armen ingeschakeld. Blijft in Development.</w:t>
             </w:r>
           </w:p>
         </w:tc>
@@ -3698,7 +3713,7 @@
                 <w:color w:val="1B2630"/>
                 <w:sz w:val="15"/>
               </w:rPr>
-              <w:t>De instrumenten aanmaken en hun velden invoeren, of importeren via de data dictionary.</w:t>
+              <w:t>data_dictionary_skelet.csv importeren. Dat maakt alle 36 instrumenten aan, elk met een datumveld, een invoerdersveld en een zichtbare markering dat de inhoud nog volgt.</w:t>
             </w:r>
           </w:p>
         </w:tc>
@@ -3719,7 +3734,7 @@
                 <w:color w:val="1B2630"/>
                 <w:sz w:val="15"/>
               </w:rPr>
-              <w:t>Designer, of Data Dictionary upload</w:t>
+              <w:t>Data Dictionary upload</w:t>
             </w:r>
           </w:p>
         </w:tc>
@@ -3763,7 +3778,7 @@
                 <w:color w:val="1B2630"/>
                 <w:sz w:val="15"/>
               </w:rPr>
-              <w:t>instrument_event_mapping.csv importeren.</w:t>
+              <w:t>instrument_event_mapping.csv importeren. Vanaf hier staat het skelet en kun je door de events klikken.</w:t>
             </w:r>
           </w:p>
         </w:tc>
@@ -3958,7 +3973,7 @@
                 <w:color w:val="1B2630"/>
                 <w:sz w:val="15"/>
               </w:rPr>
-              <w:t>Acceptatietest draaien met een testdeelnemer per arm, daarna alle testdata wissen.</w:t>
+              <w:t>De inhoudelijke velden per instrument bouwen, de markering telkens verwijderen.</w:t>
             </w:r>
           </w:p>
         </w:tc>
@@ -3979,7 +3994,7 @@
                 <w:color w:val="1B2630"/>
                 <w:sz w:val="15"/>
               </w:rPr>
-              <w:t>Record Status Dashboard</w:t>
+              <w:t>Designer, of Data Dictionary upload</w:t>
             </w:r>
           </w:p>
         </w:tc>
@@ -4023,7 +4038,7 @@
                 <w:color w:val="1B2630"/>
                 <w:sz w:val="15"/>
               </w:rPr>
-              <w:t>Project naar productie zetten en de versie vastleggen.</w:t>
+              <w:t>Acceptatietest met een testdeelnemer per arm; branching en mapping nalopen.</w:t>
             </w:r>
           </w:p>
         </w:tc>
@@ -4044,7 +4059,72 @@
                 <w:color w:val="1B2630"/>
                 <w:sz w:val="15"/>
               </w:rPr>
-              <w:t>Project Setup</w:t>
+              <w:t>Record Status Dashboard</w:t>
+            </w:r>
+          </w:p>
+        </w:tc>
+      </w:tr>
+      <w:tr>
+        <w:tc>
+          <w:tcPr>
+            <w:tcW w:type="dxa" w:w="680"/>
+          </w:tcPr>
+          <w:p>
+            <w:pPr>
+              <w:spacing w:before="30" w:after="30" w:line="252" w:lineRule="auto"/>
+            </w:pPr>
+            <w:r/>
+            <w:r>
+              <w:rPr>
+                <w:rFonts w:ascii="Segoe UI" w:hAnsi="Segoe UI" w:eastAsia="Segoe UI"/>
+                <w:b w:val="0"/>
+                <w:i w:val="0"/>
+                <w:color w:val="1B2630"/>
+                <w:sz w:val="15"/>
+              </w:rPr>
+              <w:t>12</w:t>
+            </w:r>
+          </w:p>
+        </w:tc>
+        <w:tc>
+          <w:tcPr>
+            <w:tcW w:type="dxa" w:w="5783"/>
+          </w:tcPr>
+          <w:p>
+            <w:pPr>
+              <w:spacing w:before="30" w:after="30" w:line="252" w:lineRule="auto"/>
+            </w:pPr>
+            <w:r/>
+            <w:r>
+              <w:rPr>
+                <w:rFonts w:ascii="Segoe UI" w:hAnsi="Segoe UI" w:eastAsia="Segoe UI"/>
+                <w:b w:val="0"/>
+                <w:i w:val="0"/>
+                <w:color w:val="1B2630"/>
+                <w:sz w:val="15"/>
+              </w:rPr>
+              <w:t>Alle testdata wissen, project naar productie, versie vastleggen.</w:t>
+            </w:r>
+          </w:p>
+        </w:tc>
+        <w:tc>
+          <w:tcPr>
+            <w:tcW w:type="dxa" w:w="3402"/>
+          </w:tcPr>
+          <w:p>
+            <w:pPr>
+              <w:spacing w:before="30" w:after="30" w:line="252" w:lineRule="auto"/>
+            </w:pPr>
+            <w:r/>
+            <w:r>
+              <w:rPr>
+                <w:rFonts w:ascii="Segoe UI" w:hAnsi="Segoe UI" w:eastAsia="Segoe UI"/>
+                <w:b w:val="0"/>
+                <w:i w:val="0"/>
+                <w:color w:val="1B2630"/>
+                <w:sz w:val="15"/>
+              </w:rPr>
+              <w:t>Other Functionality, dan Project Setup</w:t>
             </w:r>
           </w:p>
         </w:tc>
@@ -4062,7 +4142,22 @@
           <w:color w:val="5A6A78"/>
           <w:sz w:val="17"/>
         </w:rPr>
-        <w:t>Stap 6 is het grote werk en volgt pas als de drie punten hieronder beslecht zijn. Stap 1 tot 5 en 8 tot 9 kun je vandaag doen.</w:t>
+        <w:t>Stap 1 tot 9 kun je vandaag doen; ze hangen niet aan de openstaande punten. Stap 10 is het grote werk en volgt pas als de drie punten hieronder beslecht zijn.</w:t>
+      </w:r>
+    </w:p>
+    <w:p>
+      <w:pPr>
+        <w:spacing w:before="0" w:after="80"/>
+      </w:pPr>
+      <w:r>
+        <w:rPr>
+          <w:rFonts w:ascii="Segoe UI" w:hAnsi="Segoe UI" w:eastAsia="Segoe UI"/>
+          <w:b w:val="0"/>
+          <w:i w:val="0"/>
+          <w:color w:val="5A6A78"/>
+          <w:sz w:val="17"/>
+        </w:rPr>
+        <w:t>Wis de testrecords vóór je naar productie gaat. REDCap biedt dat aan bij het overzetten, maar een testrecord dat blijft staan, telt later mee in je PRISMA- en CONSORT-aantallen.</w:t>
       </w:r>
     </w:p>
     <w:p>

</xml_diff>

<commit_message>
REDCap: volledige validatie, twaalf punten in de CTU-template
Machinaal gecontroleerd tegen de importregels: variabelenamen, veldtypes,
keuzelijsten, validaties, alle 113 branching-expressies, de verwijzingen in
labels, en de samenhang tussen dictionary, instrumentenlijst, events en mapping.
Geen fout in de samenvoeging zelf; alle bevindingen zitten in de aangeleverde
template.

Vier nieuwe punten bovenop de eerdere acht. Twee labels tonen [ae_total], een
variabele die nergens bestaat terwijl concomitant_therapy wel zo'n teller heeft.
Het MedDRA-veld hangt aan BioPortal, dat licentie en integratie vereist.
contx_total rekent met [last-instance] en vereist dus dat concomitant_therapy
als herhalend instrument is ingesteld. En eligibility staat alleen op visite 0
terwijl het de velden voor screenfalen draagt.

Co-Authored-By: Claude Opus 5 <noreply@anthropic.com>
</commit_message>
<xml_diff>
--- a/REDCap/PARADISE_REDCap_opzet.docx
+++ b/REDCap/PARADISE_REDCap_opzet.docx
@@ -9911,7 +9911,7 @@
                 <w:color w:val="1B2630"/>
                 <w:sz w:val="15"/>
               </w:rPr>
-              <w:t>visit, en de AE-formulieren</w:t>
+              <w:t>visit, de AE-formulieren, device_deficiency</w:t>
             </w:r>
           </w:p>
         </w:tc>
@@ -9932,7 +9932,267 @@
                 <w:color w:val="1B2630"/>
                 <w:sz w:val="15"/>
               </w:rPr>
-              <w:t>De labels bevatten [adverse_event_arm_1] en [concomitant_medica_arm_1]. Geen van beide namen komt voor in dit project. Verwijs naar ae_sae_arm_1 en naar concomitant_therapy binnen hetzelfde event, of haal de link uit het label.</w:t>
+              <w:t>De labels bevatten [adverse_event_arm_1] en [concomitant_medica_arm_1]. Geen van beide namen komt voor in dit project — het zijn resten van het project waar de template uit komt. Twee ervan verwijzen bovendien naar [form-link:adverse_events], en een formulier met die naam bestaat hier evenmin.</w:t>
+            </w:r>
+          </w:p>
+        </w:tc>
+      </w:tr>
+      <w:tr>
+        <w:tc>
+          <w:tcPr>
+            <w:tcW w:type="dxa" w:w="2494"/>
+          </w:tcPr>
+          <w:p>
+            <w:pPr>
+              <w:spacing w:before="30" w:after="30" w:line="252" w:lineRule="auto"/>
+            </w:pPr>
+            <w:r/>
+            <w:r>
+              <w:rPr>
+                <w:rFonts w:ascii="Segoe UI" w:hAnsi="Segoe UI" w:eastAsia="Segoe UI"/>
+                <w:b w:val="0"/>
+                <w:i w:val="0"/>
+                <w:color w:val="1B2630"/>
+                <w:sz w:val="15"/>
+              </w:rPr>
+              <w:t>Twee labels tonen [ae_total], een variabele die nergens bestaat</w:t>
+            </w:r>
+          </w:p>
+        </w:tc>
+        <w:tc>
+          <w:tcPr>
+            <w:tcW w:type="dxa" w:w="2381"/>
+          </w:tcPr>
+          <w:p>
+            <w:pPr>
+              <w:spacing w:before="30" w:after="30" w:line="252" w:lineRule="auto"/>
+            </w:pPr>
+            <w:r/>
+            <w:r>
+              <w:rPr>
+                <w:rFonts w:ascii="Segoe UI" w:hAnsi="Segoe UI" w:eastAsia="Segoe UI"/>
+                <w:b w:val="0"/>
+                <w:i w:val="0"/>
+                <w:color w:val="1B2630"/>
+                <w:sz w:val="15"/>
+              </w:rPr>
+              <w:t>ae_compl in visit, txt_link_ae in device_deficiency</w:t>
+            </w:r>
+          </w:p>
+        </w:tc>
+        <w:tc>
+          <w:tcPr>
+            <w:tcW w:type="dxa" w:w="4989"/>
+          </w:tcPr>
+          <w:p>
+            <w:pPr>
+              <w:spacing w:before="30" w:after="30" w:line="252" w:lineRule="auto"/>
+            </w:pPr>
+            <w:r/>
+            <w:r>
+              <w:rPr>
+                <w:rFonts w:ascii="Segoe UI" w:hAnsi="Segoe UI" w:eastAsia="Segoe UI"/>
+                <w:b w:val="0"/>
+                <w:i w:val="0"/>
+                <w:color w:val="1B2630"/>
+                <w:sz w:val="15"/>
+              </w:rPr>
+              <w:t>Het formulier concomitant_therapy heeft wel zo’n teller, contx_total. De AE-formulieren hebben er geen. Ofwel een gelijkaardig calc-veld ae_total toevoegen aan het AE-formulier dat je behoudt, ofwel die zin uit beide labels halen. Nu toont REDCap er niets.</w:t>
+            </w:r>
+          </w:p>
+        </w:tc>
+      </w:tr>
+      <w:tr>
+        <w:tc>
+          <w:tcPr>
+            <w:tcW w:type="dxa" w:w="2494"/>
+          </w:tcPr>
+          <w:p>
+            <w:pPr>
+              <w:spacing w:before="30" w:after="30" w:line="252" w:lineRule="auto"/>
+            </w:pPr>
+            <w:r/>
+            <w:r>
+              <w:rPr>
+                <w:rFonts w:ascii="Segoe UI" w:hAnsi="Segoe UI" w:eastAsia="Segoe UI"/>
+                <w:b w:val="0"/>
+                <w:i w:val="0"/>
+                <w:color w:val="1B2630"/>
+                <w:sz w:val="15"/>
+              </w:rPr>
+              <w:t>MedDRA-veld hangt aan een externe dienst</w:t>
+            </w:r>
+          </w:p>
+        </w:tc>
+        <w:tc>
+          <w:tcPr>
+            <w:tcW w:type="dxa" w:w="2381"/>
+          </w:tcPr>
+          <w:p>
+            <w:pPr>
+              <w:spacing w:before="30" w:after="30" w:line="252" w:lineRule="auto"/>
+            </w:pPr>
+            <w:r/>
+            <w:r>
+              <w:rPr>
+                <w:rFonts w:ascii="Segoe UI" w:hAnsi="Segoe UI" w:eastAsia="Segoe UI"/>
+                <w:b w:val="0"/>
+                <w:i w:val="0"/>
+                <w:color w:val="1B2630"/>
+                <w:sz w:val="15"/>
+              </w:rPr>
+              <w:t>ae_medra in beide AE-formulieren</w:t>
+            </w:r>
+          </w:p>
+        </w:tc>
+        <w:tc>
+          <w:tcPr>
+            <w:tcW w:type="dxa" w:w="4989"/>
+          </w:tcPr>
+          <w:p>
+            <w:pPr>
+              <w:spacing w:before="30" w:after="30" w:line="252" w:lineRule="auto"/>
+            </w:pPr>
+            <w:r/>
+            <w:r>
+              <w:rPr>
+                <w:rFonts w:ascii="Segoe UI" w:hAnsi="Segoe UI" w:eastAsia="Segoe UI"/>
+                <w:b w:val="0"/>
+                <w:i w:val="0"/>
+                <w:color w:val="1B2630"/>
+                <w:sz w:val="15"/>
+              </w:rPr>
+              <w:t>Het is een tekstveld met BIOPORTAL:MEDDRA als keuzebron — de ontologie-autoaanvulling van REDCap. Dat werkt alleen als je instantie BioPortal-integratie aan heeft én toegang tot MedDRA, dat gelicentieerd is. Test het; anders valt het stil terug op een gewoon tekstvak zonder dat iemand het merkt.</w:t>
+            </w:r>
+          </w:p>
+        </w:tc>
+      </w:tr>
+      <w:tr>
+        <w:tc>
+          <w:tcPr>
+            <w:tcW w:type="dxa" w:w="2494"/>
+          </w:tcPr>
+          <w:p>
+            <w:pPr>
+              <w:spacing w:before="30" w:after="30" w:line="252" w:lineRule="auto"/>
+            </w:pPr>
+            <w:r/>
+            <w:r>
+              <w:rPr>
+                <w:rFonts w:ascii="Segoe UI" w:hAnsi="Segoe UI" w:eastAsia="Segoe UI"/>
+                <w:b w:val="0"/>
+                <w:i w:val="0"/>
+                <w:color w:val="1B2630"/>
+                <w:sz w:val="15"/>
+              </w:rPr>
+              <w:t>contx_total rekent met [last-instance]</w:t>
+            </w:r>
+          </w:p>
+        </w:tc>
+        <w:tc>
+          <w:tcPr>
+            <w:tcW w:type="dxa" w:w="2381"/>
+          </w:tcPr>
+          <w:p>
+            <w:pPr>
+              <w:spacing w:before="30" w:after="30" w:line="252" w:lineRule="auto"/>
+            </w:pPr>
+            <w:r/>
+            <w:r>
+              <w:rPr>
+                <w:rFonts w:ascii="Segoe UI" w:hAnsi="Segoe UI" w:eastAsia="Segoe UI"/>
+                <w:b w:val="0"/>
+                <w:i w:val="0"/>
+                <w:color w:val="1B2630"/>
+                <w:sz w:val="15"/>
+              </w:rPr>
+              <w:t>concomitant_therapy</w:t>
+            </w:r>
+          </w:p>
+        </w:tc>
+        <w:tc>
+          <w:tcPr>
+            <w:tcW w:type="dxa" w:w="4989"/>
+          </w:tcPr>
+          <w:p>
+            <w:pPr>
+              <w:spacing w:before="30" w:after="30" w:line="252" w:lineRule="auto"/>
+            </w:pPr>
+            <w:r/>
+            <w:r>
+              <w:rPr>
+                <w:rFonts w:ascii="Segoe UI" w:hAnsi="Segoe UI" w:eastAsia="Segoe UI"/>
+                <w:b w:val="0"/>
+                <w:i w:val="0"/>
+                <w:color w:val="1B2630"/>
+                <w:sz w:val="15"/>
+              </w:rPr>
+              <w:t>Die berekening werkt alleen als concomitant_therapy als herhalend instrument is ingesteld op de bezoek-events. Dat is dus geen optie maar een vereiste, en ze staat niet in de twaalf stappen omdat ze pas bij de import zichtbaar werd.</w:t>
+            </w:r>
+          </w:p>
+        </w:tc>
+      </w:tr>
+      <w:tr>
+        <w:tc>
+          <w:tcPr>
+            <w:tcW w:type="dxa" w:w="2494"/>
+          </w:tcPr>
+          <w:p>
+            <w:pPr>
+              <w:spacing w:before="30" w:after="30" w:line="252" w:lineRule="auto"/>
+            </w:pPr>
+            <w:r/>
+            <w:r>
+              <w:rPr>
+                <w:rFonts w:ascii="Segoe UI" w:hAnsi="Segoe UI" w:eastAsia="Segoe UI"/>
+                <w:b w:val="0"/>
+                <w:i w:val="0"/>
+                <w:color w:val="1B2630"/>
+                <w:sz w:val="15"/>
+              </w:rPr>
+              <w:t>eligibility staat alleen op visite 0</w:t>
+            </w:r>
+          </w:p>
+        </w:tc>
+        <w:tc>
+          <w:tcPr>
+            <w:tcW w:type="dxa" w:w="2381"/>
+          </w:tcPr>
+          <w:p>
+            <w:pPr>
+              <w:spacing w:before="30" w:after="30" w:line="252" w:lineRule="auto"/>
+            </w:pPr>
+            <w:r/>
+            <w:r>
+              <w:rPr>
+                <w:rFonts w:ascii="Segoe UI" w:hAnsi="Segoe UI" w:eastAsia="Segoe UI"/>
+                <w:b w:val="0"/>
+                <w:i w:val="0"/>
+                <w:color w:val="1B2630"/>
+                <w:sz w:val="15"/>
+              </w:rPr>
+              <w:t>mapping</w:t>
+            </w:r>
+          </w:p>
+        </w:tc>
+        <w:tc>
+          <w:tcPr>
+            <w:tcW w:type="dxa" w:w="4989"/>
+          </w:tcPr>
+          <w:p>
+            <w:pPr>
+              <w:spacing w:before="30" w:after="30" w:line="252" w:lineRule="auto"/>
+            </w:pPr>
+            <w:r/>
+            <w:r>
+              <w:rPr>
+                <w:rFonts w:ascii="Segoe UI" w:hAnsi="Segoe UI" w:eastAsia="Segoe UI"/>
+                <w:b w:val="0"/>
+                <w:i w:val="0"/>
+                <w:color w:val="1B2630"/>
+                <w:sz w:val="15"/>
+              </w:rPr>
+              <w:t>Het formulier bevat de velden voor screenfalen (elcr_scrfailure, elcr_scrfailreason), maar screening gebeurt op het screening-event, vóór de toestemming. Overweeg eligibility ook op screening te zetten, anders leg je een screenfalen vast op een bezoek dat de deelnemer nooit gehad heeft.</w:t>
             </w:r>
           </w:p>
         </w:tc>

</xml_diff>

<commit_message>
REDCap-gids: events-import verwerkt, en vet wordt nu ook vet
Stap 4 en 5 herschreven: de dertig events worden geimporteerd in plaats van met
de hand ingevoerd, en de naamgevingsregel staat er nu bij zoals ze uit de
REDCap-export blijkt, afgekapt op achttien tekens.

Zeventien plaatsen droegen letterlijke sterretjes rond tekst die vet had moeten
zijn; Word rendert geen markdown. De opmaakhelper zet ze nu om in echte
vetgezette runs, wat ook de scoping review-bijlagen ten goede komt mocht daar
later markdown in terechtkomen.

Controle: dictionary, events, mapping en instrumentenlijst lopen alle vier
schoon door, en elk bestand dat de gids noemt bestaat ook echt.

Co-Authored-By: Claude Opus 5 <noreply@anthropic.com>
</commit_message>
<xml_diff>
--- a/REDCap/PARADISE_REDCap_opzet.docx
+++ b/REDCap/PARADISE_REDCap_opzet.docx
@@ -1538,7 +1538,7 @@
           <w:color w:val="1B2630"/>
           <w:sz w:val="19"/>
         </w:rPr>
-        <w:t>Veertien events per arm. De offsets zijn dagen ten opzichte van visite 1, de baseline; die is dus het anker. Vul ze in bij “Define My Events” als je de schedulingmodule gebruikt; doe je dat niet, dan zijn ze documentatie en mag je ze weglaten.</w:t>
+        <w:t>Vijftien events per arm, dertig in totaal. De offsets zijn dagen ten opzichte van visite 1, de baseline; die is dus het anker. Je voert ze niet met de hand in — events_import.csv bevat ze allemaal. De offsets hieronder zijn documentatie, tenzij je de schedulingmodule aanzet.</w:t>
       </w:r>
     </w:p>
     <w:tbl>
@@ -3202,7 +3202,27 @@
           <w:color w:val="1B2630"/>
           <w:sz w:val="19"/>
         </w:rPr>
-        <w:t>REDCap leidt de unieke eventnaam af uit het label. De labels hierboven zijn kort gehouden zodat die afleiding voorspelbaar is: “Visite 1” wordt visite_1_arm_1. **Controleer na het aanmaken of de gegenereerde namen overeenkomen met de kolom unique_event_name in events.csv**, en pas anders het mappingbestand aan vóór je het importeert. Wijkt één naam af, dan komt dat instrument stil op het verkeerde event terecht.</w:t>
+        <w:t xml:space="preserve">REDCap leidt de unieke eventnaam af uit het label. De labels hierboven zijn kort gehouden zodat die afleiding voorspelbaar is: “Visite 1” wordt visite_1_arm_1. </w:t>
+      </w:r>
+      <w:r>
+        <w:rPr>
+          <w:rFonts w:ascii="Segoe UI" w:hAnsi="Segoe UI" w:eastAsia="Segoe UI"/>
+          <w:b/>
+          <w:i w:val="0"/>
+          <w:color w:val="1B2630"/>
+          <w:sz w:val="19"/>
+        </w:rPr>
+        <w:t>Controleer na het aanmaken of de gegenereerde namen overeenkomen met de kolom unique_event_name in events.csv</w:t>
+      </w:r>
+      <w:r>
+        <w:rPr>
+          <w:rFonts w:ascii="Segoe UI" w:hAnsi="Segoe UI" w:eastAsia="Segoe UI"/>
+          <w:b w:val="0"/>
+          <w:i w:val="0"/>
+          <w:color w:val="1B2630"/>
+          <w:sz w:val="19"/>
+        </w:rPr>
+        <w:t>, en pas anders het mappingbestand aan vóór je het importeert. Wijkt één naam af, dan komt dat instrument stil op het verkeerde event terecht.</w:t>
       </w:r>
     </w:p>
     <w:p>
@@ -3258,7 +3278,27 @@
           <w:color w:val="1B2630"/>
           <w:sz w:val="19"/>
         </w:rPr>
-        <w:t>Een nieuw REDCap-project staat in **Development**-status, en dat is je testomgeving. Daar mag alles: velden toevoegen, verwijderen, van type veranderen, testrecords invoeren en weer wissen. Pas bij *Move to Production* gaan structurele wijzigingen via Draft Mode en goedkeuring. Je hebt dus geen apart oefenproject nodig — het echte project is de zandbak, tot jij beslist dat het dat niet meer is.</w:t>
+        <w:t xml:space="preserve">Een nieuw REDCap-project staat in </w:t>
+      </w:r>
+      <w:r>
+        <w:rPr>
+          <w:rFonts w:ascii="Segoe UI" w:hAnsi="Segoe UI" w:eastAsia="Segoe UI"/>
+          <w:b/>
+          <w:i w:val="0"/>
+          <w:color w:val="1B2630"/>
+          <w:sz w:val="19"/>
+        </w:rPr>
+        <w:t>Development</w:t>
+      </w:r>
+      <w:r>
+        <w:rPr>
+          <w:rFonts w:ascii="Segoe UI" w:hAnsi="Segoe UI" w:eastAsia="Segoe UI"/>
+          <w:b w:val="0"/>
+          <w:i w:val="0"/>
+          <w:color w:val="1B2630"/>
+          <w:sz w:val="19"/>
+        </w:rPr>
+        <w:t>-status, en dat is je testomgeving. Daar mag alles: velden toevoegen, verwijderen, van type veranderen, testrecords invoeren en weer wissen. Pas bij Move to Production gaan structurele wijzigingen via Draft Mode en goedkeuring. Je hebt dus geen apart oefenproject nodig — het echte project is de zandbak, tot jij beslist dat het dat niet meer is.</w:t>
       </w:r>
     </w:p>
     <w:p>
@@ -3320,7 +3360,47 @@
           <w:color w:val="1B2630"/>
           <w:sz w:val="19"/>
         </w:rPr>
-        <w:t>Op de pagina Project Setup, onder Main project settings, zet je **Use longitudinal data collection with defined events** op Enable. Zet daar ook **Repeatable instruments and events** op Enable. Beide zijn nodig voordat je verder kunt.</w:t>
+        <w:t xml:space="preserve">Op de pagina Project Setup, onder Main project settings, zet je </w:t>
+      </w:r>
+      <w:r>
+        <w:rPr>
+          <w:rFonts w:ascii="Segoe UI" w:hAnsi="Segoe UI" w:eastAsia="Segoe UI"/>
+          <w:b/>
+          <w:i w:val="0"/>
+          <w:color w:val="1B2630"/>
+          <w:sz w:val="19"/>
+        </w:rPr>
+        <w:t>Use longitudinal data collection with defined events</w:t>
+      </w:r>
+      <w:r>
+        <w:rPr>
+          <w:rFonts w:ascii="Segoe UI" w:hAnsi="Segoe UI" w:eastAsia="Segoe UI"/>
+          <w:b w:val="0"/>
+          <w:i w:val="0"/>
+          <w:color w:val="1B2630"/>
+          <w:sz w:val="19"/>
+        </w:rPr>
+        <w:t xml:space="preserve"> op Enable. Zet daar ook </w:t>
+      </w:r>
+      <w:r>
+        <w:rPr>
+          <w:rFonts w:ascii="Segoe UI" w:hAnsi="Segoe UI" w:eastAsia="Segoe UI"/>
+          <w:b/>
+          <w:i w:val="0"/>
+          <w:color w:val="1B2630"/>
+          <w:sz w:val="19"/>
+        </w:rPr>
+        <w:t>Repeatable instruments and events</w:t>
+      </w:r>
+      <w:r>
+        <w:rPr>
+          <w:rFonts w:ascii="Segoe UI" w:hAnsi="Segoe UI" w:eastAsia="Segoe UI"/>
+          <w:b w:val="0"/>
+          <w:i w:val="0"/>
+          <w:color w:val="1B2630"/>
+          <w:sz w:val="19"/>
+        </w:rPr>
+        <w:t xml:space="preserve"> op Enable. Beide zijn nodig voordat je verder kunt.</w:t>
       </w:r>
     </w:p>
     <w:p>
@@ -3351,7 +3431,47 @@
           <w:color w:val="1B2630"/>
           <w:sz w:val="19"/>
         </w:rPr>
-        <w:t>Klik Define My Events. Arm 1 bestaat al; hernoem die naar **Usual Care**. Voeg met Add New Arm een tweede toe: **Optimal Care**. De bezoekmomenten zijn in beide armen identiek; alleen de instrumenten verschillen.</w:t>
+        <w:t xml:space="preserve">Klik Define My Events. Arm 1 bestaat al; hernoem die naar </w:t>
+      </w:r>
+      <w:r>
+        <w:rPr>
+          <w:rFonts w:ascii="Segoe UI" w:hAnsi="Segoe UI" w:eastAsia="Segoe UI"/>
+          <w:b/>
+          <w:i w:val="0"/>
+          <w:color w:val="1B2630"/>
+          <w:sz w:val="19"/>
+        </w:rPr>
+        <w:t>Usual Care</w:t>
+      </w:r>
+      <w:r>
+        <w:rPr>
+          <w:rFonts w:ascii="Segoe UI" w:hAnsi="Segoe UI" w:eastAsia="Segoe UI"/>
+          <w:b w:val="0"/>
+          <w:i w:val="0"/>
+          <w:color w:val="1B2630"/>
+          <w:sz w:val="19"/>
+        </w:rPr>
+        <w:t xml:space="preserve">. Voeg met Add New Arm een tweede toe: </w:t>
+      </w:r>
+      <w:r>
+        <w:rPr>
+          <w:rFonts w:ascii="Segoe UI" w:hAnsi="Segoe UI" w:eastAsia="Segoe UI"/>
+          <w:b/>
+          <w:i w:val="0"/>
+          <w:color w:val="1B2630"/>
+          <w:sz w:val="19"/>
+        </w:rPr>
+        <w:t>Optimal Care</w:t>
+      </w:r>
+      <w:r>
+        <w:rPr>
+          <w:rFonts w:ascii="Segoe UI" w:hAnsi="Segoe UI" w:eastAsia="Segoe UI"/>
+          <w:b w:val="0"/>
+          <w:i w:val="0"/>
+          <w:color w:val="1B2630"/>
+          <w:sz w:val="19"/>
+        </w:rPr>
+        <w:t>. De bezoekmomenten zijn in beide armen identiek; alleen de instrumenten verschillen.</w:t>
       </w:r>
     </w:p>
     <w:p>
@@ -3367,7 +3487,7 @@
           <w:color w:val="00407A"/>
           <w:sz w:val="19"/>
         </w:rPr>
-        <w:t>Stap 4 — De vijftien events, per arm</w:t>
+        <w:t>Stap 4 — De dertig events importeren</w:t>
       </w:r>
     </w:p>
     <w:p>
@@ -3382,7 +3502,42 @@
           <w:color w:val="1B2630"/>
           <w:sz w:val="19"/>
         </w:rPr>
-        <w:t>Voer per arm de vijftien events uit de tabel in sectie 5 in, met hun dagoffset en marge. Gebruik de labels exact zoals ze daar staan — Screening, Visite 0, Visite 1 tot Visite 8, Dagboek, Ulcus, AE SAE, Deviatie, Einde — want daar leidt REDCap de unieke naam uit af.</w:t>
+        <w:t xml:space="preserve">Op Define My Events staat een uploadmogelijkheid — dezelfde plek waar je een sjabloon kunt downloaden. Kies </w:t>
+      </w:r>
+      <w:r>
+        <w:rPr>
+          <w:rFonts w:ascii="Segoe UI" w:hAnsi="Segoe UI" w:eastAsia="Segoe UI"/>
+          <w:b/>
+          <w:i w:val="0"/>
+          <w:color w:val="1B2630"/>
+          <w:sz w:val="19"/>
+        </w:rPr>
+        <w:t>events_import.csv</w:t>
+      </w:r>
+      <w:r>
+        <w:rPr>
+          <w:rFonts w:ascii="Segoe UI" w:hAnsi="Segoe UI" w:eastAsia="Segoe UI"/>
+          <w:b w:val="0"/>
+          <w:i w:val="0"/>
+          <w:color w:val="1B2630"/>
+          <w:sz w:val="19"/>
+        </w:rPr>
+        <w:t>. Dat bestand staat in het formaat dat REDCap zelf exporteert, met de vier kolommen event_name, arm_num, unique_event_name en custom_event_label, en bevat de vijftien events voor beide armen.</w:t>
+      </w:r>
+    </w:p>
+    <w:p>
+      <w:pPr>
+        <w:spacing w:before="0" w:after="80"/>
+      </w:pPr>
+      <w:r>
+        <w:rPr>
+          <w:rFonts w:ascii="Segoe UI" w:hAnsi="Segoe UI" w:eastAsia="Segoe UI"/>
+          <w:b w:val="0"/>
+          <w:i w:val="0"/>
+          <w:color w:val="5A6A78"/>
+          <w:sz w:val="17"/>
+        </w:rPr>
+        <w:t>De dagoffsets staan er niet in. Die kolommen verschijnen alleen als de schedulingmodule aan staat; heb je die nodig, download dan eerst een vers sjabloon uit je eigen project en vul de offsets uit sectie 5 aan. Zonder schedulingmodule zijn ze documentatie.</w:t>
       </w:r>
     </w:p>
     <w:p>
@@ -3398,7 +3553,7 @@
           <w:color w:val="00407A"/>
           <w:sz w:val="19"/>
         </w:rPr>
-        <w:t>Stap 5 — De gegenereerde namen vergelijken</w:t>
+        <w:t>Stap 5 — De namen nakijken</w:t>
       </w:r>
     </w:p>
     <w:p>
@@ -3413,7 +3568,42 @@
           <w:color w:val="1B2630"/>
           <w:sz w:val="19"/>
         </w:rPr>
-        <w:t>REDCap toont naast elk event de unieke naam. Leg die naast de kolom unique_event_name in events.csv. Komt er één niet overeen, pas dan het mappingbestand aan vóór je het importeert. Dit is de enige stap die je later niet meer kunt terugzien: een instrument belandt dan stil op het verkeerde event.</w:t>
+        <w:t xml:space="preserve">REDCap leidt de unieke eventnaam af uit het label: kleine letters, elk niet-alfanumeriek teken wordt een underscore, en de naam wordt </w:t>
+      </w:r>
+      <w:r>
+        <w:rPr>
+          <w:rFonts w:ascii="Segoe UI" w:hAnsi="Segoe UI" w:eastAsia="Segoe UI"/>
+          <w:b/>
+          <w:i w:val="0"/>
+          <w:color w:val="1B2630"/>
+          <w:sz w:val="19"/>
+        </w:rPr>
+        <w:t>afgekapt op achttien tekens</w:t>
+      </w:r>
+      <w:r>
+        <w:rPr>
+          <w:rFonts w:ascii="Segoe UI" w:hAnsi="Segoe UI" w:eastAsia="Segoe UI"/>
+          <w:b w:val="0"/>
+          <w:i w:val="0"/>
+          <w:color w:val="1B2630"/>
+          <w:sz w:val="19"/>
+        </w:rPr>
+        <w:t xml:space="preserve"> voordat _arm_1 of _arm_2 erachter komt. Die regel is afgeleid uit je eigen REDCap-export en klopt op alle zeven voorbeelden daarin — “Concomitant medication” wordt concomitant_medica_arm_1.</w:t>
+      </w:r>
+    </w:p>
+    <w:p>
+      <w:pPr>
+        <w:spacing w:before="0" w:after="80"/>
+      </w:pPr>
+      <w:r>
+        <w:rPr>
+          <w:rFonts w:ascii="Segoe UI" w:hAnsi="Segoe UI" w:eastAsia="Segoe UI"/>
+          <w:b w:val="0"/>
+          <w:i w:val="0"/>
+          <w:color w:val="1B2630"/>
+          <w:sz w:val="19"/>
+        </w:rPr>
+        <w:t>Alle vijftien labels blijven ruim onder die achttien tekens, dus er wordt niets afgekapt en er ontstaan geen dubbele namen. Vergelijk na de import toch even wat REDCap toont met de kolom unique_event_name: wijkt er één af, pas dan het mappingbestand aan vóór stap 8. Een instrument dat op het verkeerde event belandt, valt later niet meer op.</w:t>
       </w:r>
     </w:p>
     <w:p>
@@ -3444,7 +3634,107 @@
           <w:color w:val="1B2630"/>
           <w:sz w:val="19"/>
         </w:rPr>
-        <w:t>Op Project Setup, bij Repeatable instruments and events, klik Modify. Zet de events **Dagboek**, **Ulcus**, **AE SAE** en **Deviatie** op herhalend. Zet daarnaast het instrument **concomitant_therapy** als herhalend instrument op elk van de acht bezoek-events. Dat laatste is geen keuze: het veld contx_total rekent met [last-instance] en doet zonder die instelling niets.</w:t>
+        <w:t xml:space="preserve">Op Project Setup, bij Repeatable instruments and events, klik Modify. Zet de events </w:t>
+      </w:r>
+      <w:r>
+        <w:rPr>
+          <w:rFonts w:ascii="Segoe UI" w:hAnsi="Segoe UI" w:eastAsia="Segoe UI"/>
+          <w:b/>
+          <w:i w:val="0"/>
+          <w:color w:val="1B2630"/>
+          <w:sz w:val="19"/>
+        </w:rPr>
+        <w:t>Dagboek</w:t>
+      </w:r>
+      <w:r>
+        <w:rPr>
+          <w:rFonts w:ascii="Segoe UI" w:hAnsi="Segoe UI" w:eastAsia="Segoe UI"/>
+          <w:b w:val="0"/>
+          <w:i w:val="0"/>
+          <w:color w:val="1B2630"/>
+          <w:sz w:val="19"/>
+        </w:rPr>
+        <w:t xml:space="preserve">, </w:t>
+      </w:r>
+      <w:r>
+        <w:rPr>
+          <w:rFonts w:ascii="Segoe UI" w:hAnsi="Segoe UI" w:eastAsia="Segoe UI"/>
+          <w:b/>
+          <w:i w:val="0"/>
+          <w:color w:val="1B2630"/>
+          <w:sz w:val="19"/>
+        </w:rPr>
+        <w:t>Ulcus</w:t>
+      </w:r>
+      <w:r>
+        <w:rPr>
+          <w:rFonts w:ascii="Segoe UI" w:hAnsi="Segoe UI" w:eastAsia="Segoe UI"/>
+          <w:b w:val="0"/>
+          <w:i w:val="0"/>
+          <w:color w:val="1B2630"/>
+          <w:sz w:val="19"/>
+        </w:rPr>
+        <w:t xml:space="preserve">, </w:t>
+      </w:r>
+      <w:r>
+        <w:rPr>
+          <w:rFonts w:ascii="Segoe UI" w:hAnsi="Segoe UI" w:eastAsia="Segoe UI"/>
+          <w:b/>
+          <w:i w:val="0"/>
+          <w:color w:val="1B2630"/>
+          <w:sz w:val="19"/>
+        </w:rPr>
+        <w:t>AE SAE</w:t>
+      </w:r>
+      <w:r>
+        <w:rPr>
+          <w:rFonts w:ascii="Segoe UI" w:hAnsi="Segoe UI" w:eastAsia="Segoe UI"/>
+          <w:b w:val="0"/>
+          <w:i w:val="0"/>
+          <w:color w:val="1B2630"/>
+          <w:sz w:val="19"/>
+        </w:rPr>
+        <w:t xml:space="preserve"> en </w:t>
+      </w:r>
+      <w:r>
+        <w:rPr>
+          <w:rFonts w:ascii="Segoe UI" w:hAnsi="Segoe UI" w:eastAsia="Segoe UI"/>
+          <w:b/>
+          <w:i w:val="0"/>
+          <w:color w:val="1B2630"/>
+          <w:sz w:val="19"/>
+        </w:rPr>
+        <w:t>Deviatie</w:t>
+      </w:r>
+      <w:r>
+        <w:rPr>
+          <w:rFonts w:ascii="Segoe UI" w:hAnsi="Segoe UI" w:eastAsia="Segoe UI"/>
+          <w:b w:val="0"/>
+          <w:i w:val="0"/>
+          <w:color w:val="1B2630"/>
+          <w:sz w:val="19"/>
+        </w:rPr>
+        <w:t xml:space="preserve"> op herhalend. Zet daarnaast het instrument </w:t>
+      </w:r>
+      <w:r>
+        <w:rPr>
+          <w:rFonts w:ascii="Segoe UI" w:hAnsi="Segoe UI" w:eastAsia="Segoe UI"/>
+          <w:b/>
+          <w:i w:val="0"/>
+          <w:color w:val="1B2630"/>
+          <w:sz w:val="19"/>
+        </w:rPr>
+        <w:t>concomitant_therapy</w:t>
+      </w:r>
+      <w:r>
+        <w:rPr>
+          <w:rFonts w:ascii="Segoe UI" w:hAnsi="Segoe UI" w:eastAsia="Segoe UI"/>
+          <w:b w:val="0"/>
+          <w:i w:val="0"/>
+          <w:color w:val="1B2630"/>
+          <w:sz w:val="19"/>
+        </w:rPr>
+        <w:t xml:space="preserve"> als herhalend instrument op elk van de acht bezoek-events. Dat laatste is geen keuze: het veld contx_total rekent met [last-instance] en doet zonder die instelling niets.</w:t>
       </w:r>
     </w:p>
     <w:p>
@@ -3475,7 +3765,27 @@
           <w:color w:val="1B2630"/>
           <w:sz w:val="19"/>
         </w:rPr>
-        <w:t>Online Designer, tabblad Data Dictionary, dan Upload. Kies **data_dictionary_PARADISE.csv**. REDCap toont eerst een overzicht van wat er gaat veranderen; lees dat en bevestig. Let op: een dictionary-upload vervangt álle instrumenten, dus doe dit vóór je met de hand iets aanpast.</w:t>
+        <w:t xml:space="preserve">Online Designer, tabblad Data Dictionary, dan Upload. Kies </w:t>
+      </w:r>
+      <w:r>
+        <w:rPr>
+          <w:rFonts w:ascii="Segoe UI" w:hAnsi="Segoe UI" w:eastAsia="Segoe UI"/>
+          <w:b/>
+          <w:i w:val="0"/>
+          <w:color w:val="1B2630"/>
+          <w:sz w:val="19"/>
+        </w:rPr>
+        <w:t>data_dictionary_PARADISE.csv</w:t>
+      </w:r>
+      <w:r>
+        <w:rPr>
+          <w:rFonts w:ascii="Segoe UI" w:hAnsi="Segoe UI" w:eastAsia="Segoe UI"/>
+          <w:b w:val="0"/>
+          <w:i w:val="0"/>
+          <w:color w:val="1B2630"/>
+          <w:sz w:val="19"/>
+        </w:rPr>
+        <w:t>. REDCap toont eerst een overzicht van wat er gaat veranderen; lees dat en bevestig. Let op: een dictionary-upload vervangt álle instrumenten, dus doe dit vóór je met de hand iets aanpast.</w:t>
       </w:r>
     </w:p>
     <w:p>
@@ -3506,7 +3816,27 @@
           <w:color w:val="1B2630"/>
           <w:sz w:val="19"/>
         </w:rPr>
-        <w:t>Designate Instruments for My Events, dan de knop om een mapping te uploaden. Kies **instrument_event_mapping.csv**. Vanaf hier staat het skelet: je kunt door de events klikken en per arm zien wat waar hoort.</w:t>
+        <w:t xml:space="preserve">Designate Instruments for My Events, dan de knop om een mapping te uploaden. Kies </w:t>
+      </w:r>
+      <w:r>
+        <w:rPr>
+          <w:rFonts w:ascii="Segoe UI" w:hAnsi="Segoe UI" w:eastAsia="Segoe UI"/>
+          <w:b/>
+          <w:i w:val="0"/>
+          <w:color w:val="1B2630"/>
+          <w:sz w:val="19"/>
+        </w:rPr>
+        <w:t>instrument_event_mapping.csv</w:t>
+      </w:r>
+      <w:r>
+        <w:rPr>
+          <w:rFonts w:ascii="Segoe UI" w:hAnsi="Segoe UI" w:eastAsia="Segoe UI"/>
+          <w:b w:val="0"/>
+          <w:i w:val="0"/>
+          <w:color w:val="1B2630"/>
+          <w:sz w:val="19"/>
+        </w:rPr>
+        <w:t>. Vanaf hier staat het skelet: je kunt door de events klikken en per arm zien wat waar hoort.</w:t>
       </w:r>
     </w:p>
     <w:p>
@@ -3717,7 +4047,27 @@
           <w:color w:val="1B2630"/>
           <w:sz w:val="19"/>
         </w:rPr>
-        <w:t>Van de drie blokkades die ik eerder opsomde zijn er twee vervallen. Op 22 september bleek dat eCRF 09, 24 en 01 in `(e)CRF/Per nummer/` **al bijgewerkt waren**: 09 beschrijft de in-shoe meting zónder de CMFO, 24 vraagt nog twee condities, en 01 telt negen exclusiecriteria met PEDIS graad 3 en immunosuppressie erbij. Het bronnenbestand liep achter op de formulieren, niet omgekeerd.</w:t>
+        <w:t xml:space="preserve">Van de drie blokkades die ik eerder opsomde zijn er twee vervallen. Op 22 september bleek dat eCRF 09, 24 en 01 in `(e)CRF/Per nummer/` </w:t>
+      </w:r>
+      <w:r>
+        <w:rPr>
+          <w:rFonts w:ascii="Segoe UI" w:hAnsi="Segoe UI" w:eastAsia="Segoe UI"/>
+          <w:b/>
+          <w:i w:val="0"/>
+          <w:color w:val="1B2630"/>
+          <w:sz w:val="19"/>
+        </w:rPr>
+        <w:t>al bijgewerkt waren</w:t>
+      </w:r>
+      <w:r>
+        <w:rPr>
+          <w:rFonts w:ascii="Segoe UI" w:hAnsi="Segoe UI" w:eastAsia="Segoe UI"/>
+          <w:b w:val="0"/>
+          <w:i w:val="0"/>
+          <w:color w:val="1B2630"/>
+          <w:sz w:val="19"/>
+        </w:rPr>
+        <w:t>: 09 beschrijft de in-shoe meting zónder de CMFO, 24 vraagt nog twee condities, en 01 telt negen exclusiecriteria met PEDIS graad 3 en immunosuppressie erbij. Het bronnenbestand liep achter op de formulieren, niet omgekeerd.</w:t>
       </w:r>
     </w:p>
     <w:tbl>
@@ -3977,7 +4327,27 @@
           <w:color w:val="1B2630"/>
           <w:sz w:val="19"/>
         </w:rPr>
-        <w:t>Het protocol zegt “aparte CRF’s per arm” maar benoemt niet welke. Ik heb de scheiding gelegd waar de interventie verschilt. De regel die eruit volgt en die op 22 september bevestigd werd: **in Usual Care wordt niets teruggekoppeld**. Er wordt gemeten, maar de uitkomst gaat niet naar de zorgverlener en niet naar de patiënt.</w:t>
+        <w:t xml:space="preserve">Het protocol zegt “aparte CRF’s per arm” maar benoemt niet welke. Ik heb de scheiding gelegd waar de interventie verschilt. De regel die eruit volgt en die op 22 september bevestigd werd: </w:t>
+      </w:r>
+      <w:r>
+        <w:rPr>
+          <w:rFonts w:ascii="Segoe UI" w:hAnsi="Segoe UI" w:eastAsia="Segoe UI"/>
+          <w:b/>
+          <w:i w:val="0"/>
+          <w:color w:val="1B2630"/>
+          <w:sz w:val="19"/>
+        </w:rPr>
+        <w:t>in Usual Care wordt niets teruggekoppeld</w:t>
+      </w:r>
+      <w:r>
+        <w:rPr>
+          <w:rFonts w:ascii="Segoe UI" w:hAnsi="Segoe UI" w:eastAsia="Segoe UI"/>
+          <w:b w:val="0"/>
+          <w:i w:val="0"/>
+          <w:color w:val="1B2630"/>
+          <w:sz w:val="19"/>
+        </w:rPr>
+        <w:t>. Er wordt gemeten, maar de uitkomst gaat niet naar de zorgverlener en niet naar de patiënt.</w:t>
       </w:r>
     </w:p>
     <w:tbl>

</xml_diff>

<commit_message>
REDCap-gids: volgorde hersteld, herhalend instrument kan pas na de mapping
Een fout in mijn opbouw, gevonden in het scherm zelf. Ik zette
concomitant_therapy als herhalend instrument in stap 6, voor de import van de
dictionary en de mapping. Dat kan niet: die kolom toont alleen instrumenten die
al aan dat event zijn toegewezen, en die toewijzing gebeurt pas bij de mapping.

Stap 6 doet nu alleen de vier herhalende events, die alleen de events zelf nodig
hebben. Het herhalende instrument is een eigen stap 9 geworden, na de dictionary
en de mapping. De opbouw telt daarmee veertien stappen.

Co-Authored-By: Claude Opus 5 <noreply@anthropic.com>
</commit_message>
<xml_diff>
--- a/REDCap/PARADISE_REDCap_opzet.docx
+++ b/REDCap/PARADISE_REDCap_opzet.docx
@@ -3619,7 +3619,7 @@
           <w:color w:val="00407A"/>
           <w:sz w:val="19"/>
         </w:rPr>
-        <w:t>Stap 6 — Wat herhaalt, herhalend zetten</w:t>
+        <w:t>Stap 6 — De vier herhalende events</w:t>
       </w:r>
     </w:p>
     <w:p>
@@ -3634,7 +3634,7 @@
           <w:color w:val="1B2630"/>
           <w:sz w:val="19"/>
         </w:rPr>
-        <w:t xml:space="preserve">Op Project Setup, bij Repeatable instruments and events, klik Modify. Zet de events </w:t>
+        <w:t xml:space="preserve">Op Project Setup, bij Repeatable instruments and events, klik Modify. Zet </w:t>
       </w:r>
       <w:r>
         <w:rPr>
@@ -3714,7 +3714,7 @@
           <w:color w:val="1B2630"/>
           <w:sz w:val="19"/>
         </w:rPr>
-        <w:t xml:space="preserve"> op herhalend. Zet daarnaast het instrument </w:t>
+        <w:t xml:space="preserve"> op </w:t>
       </w:r>
       <w:r>
         <w:rPr>
@@ -3724,7 +3724,7 @@
           <w:color w:val="1B2630"/>
           <w:sz w:val="19"/>
         </w:rPr>
-        <w:t>concomitant_therapy</w:t>
+        <w:t>Repeat Entire Event</w:t>
       </w:r>
       <w:r>
         <w:rPr>
@@ -3734,7 +3734,22 @@
           <w:color w:val="1B2630"/>
           <w:sz w:val="19"/>
         </w:rPr>
-        <w:t xml:space="preserve"> als herhalend instrument op elk van de acht bezoek-events. Dat laatste is geen keuze: het veld contx_total rekent met [last-instance] en doet zonder die instelling niets.</w:t>
+        <w:t>, in beide armen. Dat kan nu al: daarvoor hoeven de instrumenten nog niet te bestaan.</w:t>
+      </w:r>
+    </w:p>
+    <w:p>
+      <w:pPr>
+        <w:spacing w:before="0" w:after="80"/>
+      </w:pPr>
+      <w:r>
+        <w:rPr>
+          <w:rFonts w:ascii="Segoe UI" w:hAnsi="Segoe UI" w:eastAsia="Segoe UI"/>
+          <w:b w:val="0"/>
+          <w:i w:val="0"/>
+          <w:color w:val="5A6A78"/>
+          <w:sz w:val="17"/>
+        </w:rPr>
+        <w:t>Laat de bezoek-events op “not repeating” staan. Daar komt in stap 9 iets anders: niet het hele event herhaalt, maar één instrument erbinnen.</w:t>
       </w:r>
     </w:p>
     <w:p>
@@ -3852,7 +3867,93 @@
           <w:color w:val="00407A"/>
           <w:sz w:val="19"/>
         </w:rPr>
-        <w:t>Stap 9 — Toegangsgroepen</w:t>
+        <w:t>Stap 9 — Nu pas: concomitant_therapy herhalend maken</w:t>
+      </w:r>
+    </w:p>
+    <w:p>
+      <w:pPr>
+        <w:spacing w:before="0" w:after="80"/>
+      </w:pPr>
+      <w:r>
+        <w:rPr>
+          <w:rFonts w:ascii="Segoe UI" w:hAnsi="Segoe UI" w:eastAsia="Segoe UI"/>
+          <w:b w:val="0"/>
+          <w:i w:val="0"/>
+          <w:color w:val="1B2630"/>
+          <w:sz w:val="19"/>
+        </w:rPr>
+        <w:t xml:space="preserve">Terug naar Repeatable instruments and events. Zet de acht bezoek-events — Visite 1 tot Visite 8 — op </w:t>
+      </w:r>
+      <w:r>
+        <w:rPr>
+          <w:rFonts w:ascii="Segoe UI" w:hAnsi="Segoe UI" w:eastAsia="Segoe UI"/>
+          <w:b/>
+          <w:i w:val="0"/>
+          <w:color w:val="1B2630"/>
+          <w:sz w:val="19"/>
+        </w:rPr>
+        <w:t>Repeat Instruments</w:t>
+      </w:r>
+      <w:r>
+        <w:rPr>
+          <w:rFonts w:ascii="Segoe UI" w:hAnsi="Segoe UI" w:eastAsia="Segoe UI"/>
+          <w:b w:val="0"/>
+          <w:i w:val="0"/>
+          <w:color w:val="1B2630"/>
+          <w:sz w:val="19"/>
+        </w:rPr>
+        <w:t xml:space="preserve">, en vink daar </w:t>
+      </w:r>
+      <w:r>
+        <w:rPr>
+          <w:rFonts w:ascii="Segoe UI" w:hAnsi="Segoe UI" w:eastAsia="Segoe UI"/>
+          <w:b/>
+          <w:i w:val="0"/>
+          <w:color w:val="1B2630"/>
+          <w:sz w:val="19"/>
+        </w:rPr>
+        <w:t>concomitant_therapy</w:t>
+      </w:r>
+      <w:r>
+        <w:rPr>
+          <w:rFonts w:ascii="Segoe UI" w:hAnsi="Segoe UI" w:eastAsia="Segoe UI"/>
+          <w:b w:val="0"/>
+          <w:i w:val="0"/>
+          <w:color w:val="1B2630"/>
+          <w:sz w:val="19"/>
+        </w:rPr>
+        <w:t xml:space="preserve"> aan. In beide armen.</w:t>
+      </w:r>
+    </w:p>
+    <w:p>
+      <w:pPr>
+        <w:spacing w:before="0" w:after="80"/>
+      </w:pPr>
+      <w:r>
+        <w:rPr>
+          <w:rFonts w:ascii="Segoe UI" w:hAnsi="Segoe UI" w:eastAsia="Segoe UI"/>
+          <w:b w:val="0"/>
+          <w:i w:val="0"/>
+          <w:color w:val="5A6A78"/>
+          <w:sz w:val="17"/>
+        </w:rPr>
+        <w:t>Dit kon in stap 6 nog niet. Die kolom toont alleen instrumenten die al aan dat event zijn toegewezen, en dat gebeurt pas bij de mapping in stap 8. Het is ook geen keuze: het veld contx_total rekent met [last-instance] en levert zonder deze instelling niets op.</w:t>
+      </w:r>
+    </w:p>
+    <w:p>
+      <w:pPr>
+        <w:keepNext/>
+        <w:spacing w:before="160" w:after="40"/>
+      </w:pPr>
+      <w:r>
+        <w:rPr>
+          <w:rFonts w:ascii="Segoe UI" w:hAnsi="Segoe UI" w:eastAsia="Segoe UI"/>
+          <w:b/>
+          <w:i w:val="0"/>
+          <w:color w:val="00407A"/>
+          <w:sz w:val="19"/>
+        </w:rPr>
+        <w:t>Stap 10 — Toegangsgroepen</w:t>
       </w:r>
     </w:p>
     <w:p>
@@ -3883,7 +3984,7 @@
           <w:color w:val="00407A"/>
           <w:sz w:val="19"/>
         </w:rPr>
-        <w:t>Stap 10 — Gebruikersrechten</w:t>
+        <w:t>Stap 11 — Gebruikersrechten</w:t>
       </w:r>
     </w:p>
     <w:p>
@@ -3914,7 +4015,7 @@
           <w:color w:val="00407A"/>
           <w:sz w:val="19"/>
         </w:rPr>
-        <w:t>Stap 11 — De velden per instrument bouwen</w:t>
+        <w:t>Stap 12 — De velden per instrument bouwen</w:t>
       </w:r>
     </w:p>
     <w:p>
@@ -3945,7 +4046,7 @@
           <w:color w:val="00407A"/>
           <w:sz w:val="19"/>
         </w:rPr>
-        <w:t>Stap 12 — Acceptatietest</w:t>
+        <w:t>Stap 13 — Acceptatietest</w:t>
       </w:r>
     </w:p>
     <w:p>
@@ -3976,7 +4077,7 @@
           <w:color w:val="00407A"/>
           <w:sz w:val="19"/>
         </w:rPr>
-        <w:t>Stap 13 — Naar productie</w:t>
+        <w:t>Stap 14 — Naar productie</w:t>
       </w:r>
     </w:p>
     <w:p>
@@ -4006,7 +4107,7 @@
           <w:color w:val="5A6A78"/>
           <w:sz w:val="17"/>
         </w:rPr>
-        <w:t>Stap 1 tot 10 kun je in één dag doen; ze hangen niet af van wat er nog openstaat. Stap 11 wacht alleen nog op de vraag welke eCRF-set officieel is.</w:t>
+        <w:t>Stap 1 tot 11 kun je in één dag doen; ze hangen niet af van wat er nog openstaat. Stap 12 wacht alleen nog op de vraag welke eCRF-set officieel is.</w:t>
       </w:r>
     </w:p>
     <w:p>
@@ -10364,7 +10465,7 @@
                 <w:color w:val="1B2630"/>
                 <w:sz w:val="15"/>
               </w:rPr>
-              <w:t>Het veld contx_total rekent met [last-instance]. Dat werkt alleen als het formulier als herhalend instrument is ingesteld op de bezoek-events. Geen optie dus, maar een vereiste; ze staat daarom in stap 5 van de opbouw.</w:t>
+              <w:t>Het veld contx_total rekent met [last-instance]. Dat werkt alleen als het formulier als herhalend instrument is ingesteld op de bezoek-events. Geen optie dus, maar een vereiste; ze staat daarom als stap 9 in de opbouw.</w:t>
             </w:r>
           </w:p>
         </w:tc>

</xml_diff>

<commit_message>
REDCap stap 12 af: de laatste zes formulieren gebouwd
e18 (logboek educatie, acht visiteblokken), e34 (iMCQ), e35 (iPCQ) en de
drie gezondheidseconomische dagboeken e45, e45a en e45b. Van 45a en 45b staat
maar een blok in de dictionary: REDCap herhaalt dat over de events waaraan het
formulier hangt, zoals het papier het blok per ronde herhaalt.

Daarnaast:
- e18 weg uit de Usual Care-arm; SEBIA wordt alleen in Optimal Care
  gestructureerd geleverd (BRONNEN par. 4). Mapping 206 -> 205 rijen.
- veldlabels uniek gemaakt binnen elk formulier, ook in e13 en e23
- twaalf CTU-velden zonder label een label gegeven
- e18_v5_belangrijker en e18_v7_belangrijker verwijderd; die vraag staat
  op papier alleen in visite 4 en 6

1411 velden, 40 formulieren, geen skelet meer. Vier controleslagen plus een
dekkingscontrole tegen de papieren formulieren geven nul fouten.

Co-Authored-By: Claude Opus 5 <noreply@anthropic.com>
</commit_message>
<xml_diff>
--- a/REDCap/PARADISE_REDCap_opzet.docx
+++ b/REDCap/PARADISE_REDCap_opzet.docx
@@ -4015,7 +4015,7 @@
           <w:color w:val="00407A"/>
           <w:sz w:val="19"/>
         </w:rPr>
-        <w:t>Stap 12 — De velden per instrument bouwen</w:t>
+        <w:t>Stap 12 — Niets meer: de velden staan er al</w:t>
       </w:r>
     </w:p>
     <w:p>
@@ -4030,7 +4030,7 @@
           <w:color w:val="1B2630"/>
           <w:sz w:val="19"/>
         </w:rPr>
-        <w:t>De eenendertig klinische instrumenten dragen nu alleen een datumveld, een invoerdersveld en een markering. Bouw ze uit vanuit het bijhorende eCRF, en verwijder telkens de markering zodra een formulier af is. Dit is het grote werk en hoeft niet in één keer.</w:t>
+        <w:t>De veertig formulieren zijn volledig gebouwd, samen 1411 velden. De data dictionary die je bij stap 7 importeert bevat dus al de inhoud van elk eCRF; er blijft geen enkel formulier over waar je met de hand velden in moet zetten. Wat je hier nog doet is kijken of de formulieren eruitzien zoals je ze verwacht, en waar nodig de volgorde of een sectiekop bijschaven in de Online Designer.</w:t>
       </w:r>
     </w:p>
     <w:p>
@@ -4107,7 +4107,7 @@
           <w:color w:val="5A6A78"/>
           <w:sz w:val="17"/>
         </w:rPr>
-        <w:t>Stap 1 tot 11 kun je in één dag doen; ze hangen niet af van wat er nog openstaat. Stap 12 wacht alleen nog op de vraag welke eCRF-set officieel is.</w:t>
+        <w:t>Stap 1 tot 12 kun je nu in één dag doorlopen; er wacht niets meer op een beslissing. Na de acceptatietest van stap 13 kan het project naar productie.</w:t>
       </w:r>
     </w:p>
     <w:p>
@@ -10576,7 +10576,7 @@
           <w:color w:val="5A6A78"/>
           <w:sz w:val="17"/>
         </w:rPr>
-        <w:t>De drie CSV-bestanden in deze map zijn onderling gecontroleerd: elk instrument komt op minstens één event voor, de mapping verwijst nergens naar een instrument dat niet bestaat, en de armkolom klopt met de instrumentenlijst. 40 instrumenten, 30 events, 208 mappingregels, 271 velden in de dictionary, geen variabelenaam boven 26 tekens, en geen dode verwijzing.</w:t>
+        <w:t>De drie CSV-bestanden in deze map zijn onderling gecontroleerd: elk instrument komt op minstens één event voor, de mapping verwijst nergens naar een instrument dat niet bestaat, en de armkolom klopt met de instrumentenlijst. Daarbovenop zijn de veldeigenschappen zelf vier keer nagelopen: matrixregels, keuzecodes, rekenformules, branching per veld-waardepaar, minima en maxima, en de dekking van elk papieren item. Alle vier de controles geven nul fouten. 1411 velden, 40 formulieren, 30 events, 205 rijen in de mapping.</w:t>
       </w:r>
     </w:p>
     <w:sectPr>

</xml_diff>

<commit_message>
Opzetgids: veldaantal op 1413 na de twee e29-velden
Co-Authored-By: Claude Opus 5 <noreply@anthropic.com>
</commit_message>
<xml_diff>
--- a/REDCap/PARADISE_REDCap_opzet.docx
+++ b/REDCap/PARADISE_REDCap_opzet.docx
@@ -4030,7 +4030,7 @@
           <w:color w:val="1B2630"/>
           <w:sz w:val="19"/>
         </w:rPr>
-        <w:t>De veertig formulieren zijn volledig gebouwd, samen 1411 velden. De data dictionary die je bij stap 7 importeert bevat dus al de inhoud van elk eCRF; er blijft geen enkel formulier over waar je met de hand velden in moet zetten. Wat je hier nog doet is kijken of de formulieren eruitzien zoals je ze verwacht, en waar nodig de volgorde of een sectiekop bijschaven in de Online Designer.</w:t>
+        <w:t>De veertig formulieren zijn volledig gebouwd, samen 1413 velden. De data dictionary die je bij stap 7 importeert bevat dus al de inhoud van elk eCRF; er blijft geen enkel formulier over waar je met de hand velden in moet zetten. Wat je hier nog doet is kijken of de formulieren eruitzien zoals je ze verwacht, en waar nodig de volgorde of een sectiekop bijschaven in de Online Designer.</w:t>
       </w:r>
     </w:p>
     <w:p>
@@ -10576,7 +10576,7 @@
           <w:color w:val="5A6A78"/>
           <w:sz w:val="17"/>
         </w:rPr>
-        <w:t>De drie CSV-bestanden in deze map zijn onderling gecontroleerd: elk instrument komt op minstens één event voor, de mapping verwijst nergens naar een instrument dat niet bestaat, en de armkolom klopt met de instrumentenlijst. Daarbovenop zijn de veldeigenschappen zelf vier keer nagelopen: matrixregels, keuzecodes, rekenformules, branching per veld-waardepaar, minima en maxima, en de dekking van elk papieren item. Alle vier de controles geven nul fouten. 1411 velden, 40 formulieren, 30 events, 205 rijen in de mapping.</w:t>
+        <w:t>De drie CSV-bestanden in deze map zijn onderling gecontroleerd: elk instrument komt op minstens één event voor, de mapping verwijst nergens naar een instrument dat niet bestaat, en de armkolom klopt met de instrumentenlijst. Daarbovenop zijn de veldeigenschappen zelf vier keer nagelopen: matrixregels, keuzecodes, rekenformules, branching per veld-waardepaar, minima en maxima, en de dekking van elk papieren item. Alle vier de controles geven nul fouten. 1413 velden, 40 formulieren, 30 events, 205 rijen in de mapping.</w:t>
       </w:r>
     </w:p>
     <w:sectPr>

</xml_diff>

<commit_message>
MoveMonitor alleen nog bij de start (waaktijd als noemer); presentatie 12 oktober in PowerPoint
- Website, REDCap-mapping en -documenten, BRONNEN en CLAUDE.md: meetweek op maand 6 vervalt
- V4-kopieen van eCRF 19, 19b, 20 en 27 verwijderd
- PARADISE_BRONNEN.md naar Educatie/
- PARADISE_voetklinieken_12okt.pptx + omzetter (webdeck naar PowerPoint)

Co-Authored-By: Claude Opus 5.5 <noreply@anthropic.com>
</commit_message>
<xml_diff>
--- a/REDCap/PARADISE_REDCap_opzet.docx
+++ b/REDCap/PARADISE_REDCap_opzet.docx
@@ -2303,16 +2303,17 @@
             <w:pPr>
               <w:spacing w:before="30" w:after="30" w:line="252" w:lineRule="auto"/>
             </w:pPr>
-            <w:r/>
-            <w:r>
-              <w:rPr>
-                <w:rFonts w:ascii="Segoe UI" w:hAnsi="Segoe UI" w:eastAsia="Segoe UI"/>
-                <w:b w:val="0"/>
-                <w:i w:val="0"/>
-                <w:color w:val="1B2630"/>
-                <w:sz w:val="15"/>
-              </w:rPr>
-              <w:t>Maand 6, met drukmeting en de tweede MoveMonitorweek.</w:t>
+            <w:r>
+              <w:t>Maand 6, met drukmeting.</w:t>
+            </w:r>
+            <w:r>
+              <w:rPr>
+                <w:rFonts w:ascii="Segoe UI" w:hAnsi="Segoe UI" w:eastAsia="Segoe UI"/>
+                <w:b w:val="0"/>
+                <w:i w:val="0"/>
+                <w:color w:val="1B2630"/>
+                <w:sz w:val="15"/>
+              </w:rPr>
             </w:r>
           </w:p>
         </w:tc>
@@ -5191,7 +5192,7 @@
           <w:color w:val="1B2630"/>
           <w:sz w:val="19"/>
         </w:rPr>
-        <w:t>De tweede MoveMonitorweek op maand 6 staat in §3.2.2.2 en §5.4.5 van het protocol, maar niet in de opsomming van visites 3 tot 8 — dat is openstaand punt 4. Ik heb ze in de mapping gezet op visite 4, met eCRF 20 en 27. Klopt dat niet, haal die twee regels uit het mappingbestand.</w:t>
+        <w:t>Beslist op 30 september 2026: de MoveMonitor dient alleen nog bij de start, om de slaaptijd en dus de waaktijd te bepalen. De meetweek op maand 6 vervalt. eCRF 20 en 27 staan daarom niet meer op visite 4 in de mapping; de drie mappingbestanden zijn aangepast.</w:t>
       </w:r>
     </w:p>
     <w:p>

</xml_diff>